<commit_message>
docs: simplify delivery punctuation and remove code-location references
</commit_message>
<xml_diff>
--- a/docs/docx/Descripcion_del_Software_BikeEnergyLab_1.0.0.docx
+++ b/docs/docx/Descripcion_del_Software_BikeEnergyLab_1.0.0.docx
@@ -261,7 +261,7 @@
                 <w:sz w:val="19"/>
                 <w:szCs w:val="19"/>
               </w:rPr>
-              <w:t>6 de octubre de 2026</w:t>
+              <w:t>7 de octubre de 2026</w:t>
             </w:r>
           </w:p>
         </w:tc>
@@ -323,7 +323,7 @@
                 <w:sz w:val="19"/>
                 <w:szCs w:val="19"/>
               </w:rPr>
-              <w:t>Plantillas e interfaz ilustrada del 6 de octubre de 2026</w:t>
+              <w:t>Revisión editorial del 7 de octubre de 2026</w:t>
             </w:r>
           </w:p>
         </w:tc>
@@ -390,68 +390,6 @@
           </w:p>
         </w:tc>
       </w:tr>
-      <w:tr>
-        <w:trPr>
-          <w:cantSplit/>
-        </w:trPr>
-        <w:tc>
-          <w:tcPr>
-            <w:tcW w:w="2600" w:type="dxa"/>
-            <w:tcBorders>
-              <w:top w:val="single" w:sz="4" w:space="0" w:color="BFBFBF"/>
-              <w:left w:val="single" w:sz="4" w:space="0" w:color="BFBFBF"/>
-              <w:bottom w:val="single" w:sz="4" w:space="0" w:color="BFBFBF"/>
-              <w:right w:val="single" w:sz="4" w:space="0" w:color="BFBFBF"/>
-            </w:tcBorders>
-            <w:shd w:val="clear" w:color="auto" w:fill="EAF1F1"/>
-            <w:tcMar>
-              <w:top w:w="70" w:type="dxa"/>
-              <w:left w:w="100" w:type="dxa"/>
-              <w:bottom w:w="70" w:type="dxa"/>
-              <w:right w:w="100" w:type="dxa"/>
-            </w:tcMar>
-            <w:vAlign w:val="center"/>
-          </w:tcPr>
-          <w:p>
-            <w:r>
-              <w:rPr>
-                <w:b/>
-                <w:bCs/>
-                <w:sz w:val="19"/>
-                <w:szCs w:val="19"/>
-              </w:rPr>
-              <w:t>Repositorio</w:t>
-            </w:r>
-          </w:p>
-        </w:tc>
-        <w:tc>
-          <w:tcPr>
-            <w:tcW w:w="6900" w:type="dxa"/>
-            <w:tcBorders>
-              <w:top w:val="single" w:sz="4" w:space="0" w:color="BFBFBF"/>
-              <w:left w:val="single" w:sz="4" w:space="0" w:color="BFBFBF"/>
-              <w:bottom w:val="single" w:sz="4" w:space="0" w:color="BFBFBF"/>
-              <w:right w:val="single" w:sz="4" w:space="0" w:color="BFBFBF"/>
-            </w:tcBorders>
-            <w:tcMar>
-              <w:top w:w="70" w:type="dxa"/>
-              <w:left w:w="100" w:type="dxa"/>
-              <w:bottom w:w="70" w:type="dxa"/>
-              <w:right w:w="100" w:type="dxa"/>
-            </w:tcMar>
-            <w:vAlign w:val="center"/>
-          </w:tcPr>
-          <w:p>
-            <w:r>
-              <w:rPr>
-                <w:sz w:val="19"/>
-                <w:szCs w:val="19"/>
-              </w:rPr>
-              <w:t>https://github.com/fjburgosf/BikeEnergyLab</w:t>
-            </w:r>
-          </w:p>
-        </w:tc>
-      </w:tr>
     </w:tbl>
     <w:p/>
     <w:p>
@@ -494,7 +432,7 @@
       <w:r>
         <w:fldChar w:fldCharType="separate"/>
       </w:r>
-      <w:hyperlink w:anchor="_Toc242195255" w:history="1">
+      <w:hyperlink w:anchor="_Toc242290378" w:history="1">
         <w:r>
           <w:rPr>
             <w:rStyle w:val="Hyperlink"/>
@@ -521,7 +459,7 @@
             <w:noProof/>
             <w:webHidden/>
           </w:rPr>
-          <w:instrText xml:space="preserve"> PAGEREF _Toc242195255 \h </w:instrText>
+          <w:instrText xml:space="preserve"> PAGEREF _Toc242290378 \h </w:instrText>
         </w:r>
         <w:r>
           <w:rPr>
@@ -567,7 +505,7 @@
           <w14:ligatures w14:val="standardContextual"/>
         </w:rPr>
       </w:pPr>
-      <w:hyperlink w:anchor="_Toc242195256" w:history="1">
+      <w:hyperlink w:anchor="_Toc242290379" w:history="1">
         <w:r>
           <w:rPr>
             <w:rStyle w:val="Hyperlink"/>
@@ -594,7 +532,7 @@
             <w:noProof/>
             <w:webHidden/>
           </w:rPr>
-          <w:instrText xml:space="preserve"> PAGEREF _Toc242195256 \h </w:instrText>
+          <w:instrText xml:space="preserve"> PAGEREF _Toc242290379 \h </w:instrText>
         </w:r>
         <w:r>
           <w:rPr>
@@ -640,7 +578,7 @@
           <w14:ligatures w14:val="standardContextual"/>
         </w:rPr>
       </w:pPr>
-      <w:hyperlink w:anchor="_Toc242195257" w:history="1">
+      <w:hyperlink w:anchor="_Toc242290380" w:history="1">
         <w:r>
           <w:rPr>
             <w:rStyle w:val="Hyperlink"/>
@@ -667,7 +605,7 @@
             <w:noProof/>
             <w:webHidden/>
           </w:rPr>
-          <w:instrText xml:space="preserve"> PAGEREF _Toc242195257 \h </w:instrText>
+          <w:instrText xml:space="preserve"> PAGEREF _Toc242290380 \h </w:instrText>
         </w:r>
         <w:r>
           <w:rPr>
@@ -713,7 +651,7 @@
           <w14:ligatures w14:val="standardContextual"/>
         </w:rPr>
       </w:pPr>
-      <w:hyperlink w:anchor="_Toc242195258" w:history="1">
+      <w:hyperlink w:anchor="_Toc242290381" w:history="1">
         <w:r>
           <w:rPr>
             <w:rStyle w:val="Hyperlink"/>
@@ -740,7 +678,7 @@
             <w:noProof/>
             <w:webHidden/>
           </w:rPr>
-          <w:instrText xml:space="preserve"> PAGEREF _Toc242195258 \h </w:instrText>
+          <w:instrText xml:space="preserve"> PAGEREF _Toc242290381 \h </w:instrText>
         </w:r>
         <w:r>
           <w:rPr>
@@ -786,7 +724,7 @@
           <w14:ligatures w14:val="standardContextual"/>
         </w:rPr>
       </w:pPr>
-      <w:hyperlink w:anchor="_Toc242195259" w:history="1">
+      <w:hyperlink w:anchor="_Toc242290382" w:history="1">
         <w:r>
           <w:rPr>
             <w:rStyle w:val="Hyperlink"/>
@@ -813,7 +751,7 @@
             <w:noProof/>
             <w:webHidden/>
           </w:rPr>
-          <w:instrText xml:space="preserve"> PAGEREF _Toc242195259 \h </w:instrText>
+          <w:instrText xml:space="preserve"> PAGEREF _Toc242290382 \h </w:instrText>
         </w:r>
         <w:r>
           <w:rPr>
@@ -859,7 +797,7 @@
           <w14:ligatures w14:val="standardContextual"/>
         </w:rPr>
       </w:pPr>
-      <w:hyperlink w:anchor="_Toc242195260" w:history="1">
+      <w:hyperlink w:anchor="_Toc242290383" w:history="1">
         <w:r>
           <w:rPr>
             <w:rStyle w:val="Hyperlink"/>
@@ -886,7 +824,7 @@
             <w:noProof/>
             <w:webHidden/>
           </w:rPr>
-          <w:instrText xml:space="preserve"> PAGEREF _Toc242195260 \h </w:instrText>
+          <w:instrText xml:space="preserve"> PAGEREF _Toc242290383 \h </w:instrText>
         </w:r>
         <w:r>
           <w:rPr>
@@ -932,7 +870,7 @@
           <w14:ligatures w14:val="standardContextual"/>
         </w:rPr>
       </w:pPr>
-      <w:hyperlink w:anchor="_Toc242195261" w:history="1">
+      <w:hyperlink w:anchor="_Toc242290384" w:history="1">
         <w:r>
           <w:rPr>
             <w:rStyle w:val="Hyperlink"/>
@@ -959,7 +897,7 @@
             <w:noProof/>
             <w:webHidden/>
           </w:rPr>
-          <w:instrText xml:space="preserve"> PAGEREF _Toc242195261 \h </w:instrText>
+          <w:instrText xml:space="preserve"> PAGEREF _Toc242290384 \h </w:instrText>
         </w:r>
         <w:r>
           <w:rPr>
@@ -1005,7 +943,7 @@
           <w14:ligatures w14:val="standardContextual"/>
         </w:rPr>
       </w:pPr>
-      <w:hyperlink w:anchor="_Toc242195262" w:history="1">
+      <w:hyperlink w:anchor="_Toc242290385" w:history="1">
         <w:r>
           <w:rPr>
             <w:rStyle w:val="Hyperlink"/>
@@ -1032,7 +970,7 @@
             <w:noProof/>
             <w:webHidden/>
           </w:rPr>
-          <w:instrText xml:space="preserve"> PAGEREF _Toc242195262 \h </w:instrText>
+          <w:instrText xml:space="preserve"> PAGEREF _Toc242290385 \h </w:instrText>
         </w:r>
         <w:r>
           <w:rPr>
@@ -1078,7 +1016,7 @@
           <w14:ligatures w14:val="standardContextual"/>
         </w:rPr>
       </w:pPr>
-      <w:hyperlink w:anchor="_Toc242195263" w:history="1">
+      <w:hyperlink w:anchor="_Toc242290386" w:history="1">
         <w:r>
           <w:rPr>
             <w:rStyle w:val="Hyperlink"/>
@@ -1105,7 +1043,7 @@
             <w:noProof/>
             <w:webHidden/>
           </w:rPr>
-          <w:instrText xml:space="preserve"> PAGEREF _Toc242195263 \h </w:instrText>
+          <w:instrText xml:space="preserve"> PAGEREF _Toc242290386 \h </w:instrText>
         </w:r>
         <w:r>
           <w:rPr>
@@ -1151,7 +1089,7 @@
           <w14:ligatures w14:val="standardContextual"/>
         </w:rPr>
       </w:pPr>
-      <w:hyperlink w:anchor="_Toc242195264" w:history="1">
+      <w:hyperlink w:anchor="_Toc242290387" w:history="1">
         <w:r>
           <w:rPr>
             <w:rStyle w:val="Hyperlink"/>
@@ -1178,7 +1116,7 @@
             <w:noProof/>
             <w:webHidden/>
           </w:rPr>
-          <w:instrText xml:space="preserve"> PAGEREF _Toc242195264 \h </w:instrText>
+          <w:instrText xml:space="preserve"> PAGEREF _Toc242290387 \h </w:instrText>
         </w:r>
         <w:r>
           <w:rPr>
@@ -1224,7 +1162,7 @@
           <w14:ligatures w14:val="standardContextual"/>
         </w:rPr>
       </w:pPr>
-      <w:hyperlink w:anchor="_Toc242195265" w:history="1">
+      <w:hyperlink w:anchor="_Toc242290388" w:history="1">
         <w:r>
           <w:rPr>
             <w:rStyle w:val="Hyperlink"/>
@@ -1251,7 +1189,7 @@
             <w:noProof/>
             <w:webHidden/>
           </w:rPr>
-          <w:instrText xml:space="preserve"> PAGEREF _Toc242195265 \h </w:instrText>
+          <w:instrText xml:space="preserve"> PAGEREF _Toc242290388 \h </w:instrText>
         </w:r>
         <w:r>
           <w:rPr>
@@ -1297,7 +1235,7 @@
           <w14:ligatures w14:val="standardContextual"/>
         </w:rPr>
       </w:pPr>
-      <w:hyperlink w:anchor="_Toc242195266" w:history="1">
+      <w:hyperlink w:anchor="_Toc242290389" w:history="1">
         <w:r>
           <w:rPr>
             <w:rStyle w:val="Hyperlink"/>
@@ -1324,7 +1262,7 @@
             <w:noProof/>
             <w:webHidden/>
           </w:rPr>
-          <w:instrText xml:space="preserve"> PAGEREF _Toc242195266 \h </w:instrText>
+          <w:instrText xml:space="preserve"> PAGEREF _Toc242290389 \h </w:instrText>
         </w:r>
         <w:r>
           <w:rPr>
@@ -1370,7 +1308,7 @@
           <w14:ligatures w14:val="standardContextual"/>
         </w:rPr>
       </w:pPr>
-      <w:hyperlink w:anchor="_Toc242195267" w:history="1">
+      <w:hyperlink w:anchor="_Toc242290390" w:history="1">
         <w:r>
           <w:rPr>
             <w:rStyle w:val="Hyperlink"/>
@@ -1397,7 +1335,7 @@
             <w:noProof/>
             <w:webHidden/>
           </w:rPr>
-          <w:instrText xml:space="preserve"> PAGEREF _Toc242195267 \h </w:instrText>
+          <w:instrText xml:space="preserve"> PAGEREF _Toc242290390 \h </w:instrText>
         </w:r>
         <w:r>
           <w:rPr>
@@ -1443,7 +1381,7 @@
           <w14:ligatures w14:val="standardContextual"/>
         </w:rPr>
       </w:pPr>
-      <w:hyperlink w:anchor="_Toc242195268" w:history="1">
+      <w:hyperlink w:anchor="_Toc242290391" w:history="1">
         <w:r>
           <w:rPr>
             <w:rStyle w:val="Hyperlink"/>
@@ -1470,7 +1408,7 @@
             <w:noProof/>
             <w:webHidden/>
           </w:rPr>
-          <w:instrText xml:space="preserve"> PAGEREF _Toc242195268 \h </w:instrText>
+          <w:instrText xml:space="preserve"> PAGEREF _Toc242290391 \h </w:instrText>
         </w:r>
         <w:r>
           <w:rPr>
@@ -1516,7 +1454,7 @@
           <w14:ligatures w14:val="standardContextual"/>
         </w:rPr>
       </w:pPr>
-      <w:hyperlink w:anchor="_Toc242195269" w:history="1">
+      <w:hyperlink w:anchor="_Toc242290392" w:history="1">
         <w:r>
           <w:rPr>
             <w:rStyle w:val="Hyperlink"/>
@@ -1543,7 +1481,7 @@
             <w:noProof/>
             <w:webHidden/>
           </w:rPr>
-          <w:instrText xml:space="preserve"> PAGEREF _Toc242195269 \h </w:instrText>
+          <w:instrText xml:space="preserve"> PAGEREF _Toc242290392 \h </w:instrText>
         </w:r>
         <w:r>
           <w:rPr>
@@ -1589,7 +1527,7 @@
           <w14:ligatures w14:val="standardContextual"/>
         </w:rPr>
       </w:pPr>
-      <w:hyperlink w:anchor="_Toc242195270" w:history="1">
+      <w:hyperlink w:anchor="_Toc242290393" w:history="1">
         <w:r>
           <w:rPr>
             <w:rStyle w:val="Hyperlink"/>
@@ -1616,7 +1554,7 @@
             <w:noProof/>
             <w:webHidden/>
           </w:rPr>
-          <w:instrText xml:space="preserve"> PAGEREF _Toc242195270 \h </w:instrText>
+          <w:instrText xml:space="preserve"> PAGEREF _Toc242290393 \h </w:instrText>
         </w:r>
         <w:r>
           <w:rPr>
@@ -1662,7 +1600,7 @@
           <w14:ligatures w14:val="standardContextual"/>
         </w:rPr>
       </w:pPr>
-      <w:hyperlink w:anchor="_Toc242195271" w:history="1">
+      <w:hyperlink w:anchor="_Toc242290394" w:history="1">
         <w:r>
           <w:rPr>
             <w:rStyle w:val="Hyperlink"/>
@@ -1689,7 +1627,7 @@
             <w:noProof/>
             <w:webHidden/>
           </w:rPr>
-          <w:instrText xml:space="preserve"> PAGEREF _Toc242195271 \h </w:instrText>
+          <w:instrText xml:space="preserve"> PAGEREF _Toc242290394 \h </w:instrText>
         </w:r>
         <w:r>
           <w:rPr>
@@ -1735,7 +1673,7 @@
           <w14:ligatures w14:val="standardContextual"/>
         </w:rPr>
       </w:pPr>
-      <w:hyperlink w:anchor="_Toc242195272" w:history="1">
+      <w:hyperlink w:anchor="_Toc242290395" w:history="1">
         <w:r>
           <w:rPr>
             <w:rStyle w:val="Hyperlink"/>
@@ -1762,7 +1700,7 @@
             <w:noProof/>
             <w:webHidden/>
           </w:rPr>
-          <w:instrText xml:space="preserve"> PAGEREF _Toc242195272 \h </w:instrText>
+          <w:instrText xml:space="preserve"> PAGEREF _Toc242290395 \h </w:instrText>
         </w:r>
         <w:r>
           <w:rPr>
@@ -1808,7 +1746,7 @@
           <w14:ligatures w14:val="standardContextual"/>
         </w:rPr>
       </w:pPr>
-      <w:hyperlink w:anchor="_Toc242195273" w:history="1">
+      <w:hyperlink w:anchor="_Toc242290396" w:history="1">
         <w:r>
           <w:rPr>
             <w:rStyle w:val="Hyperlink"/>
@@ -1835,7 +1773,7 @@
             <w:noProof/>
             <w:webHidden/>
           </w:rPr>
-          <w:instrText xml:space="preserve"> PAGEREF _Toc242195273 \h </w:instrText>
+          <w:instrText xml:space="preserve"> PAGEREF _Toc242290396 \h </w:instrText>
         </w:r>
         <w:r>
           <w:rPr>
@@ -1881,7 +1819,7 @@
           <w14:ligatures w14:val="standardContextual"/>
         </w:rPr>
       </w:pPr>
-      <w:hyperlink w:anchor="_Toc242195274" w:history="1">
+      <w:hyperlink w:anchor="_Toc242290397" w:history="1">
         <w:r>
           <w:rPr>
             <w:rStyle w:val="Hyperlink"/>
@@ -1908,7 +1846,7 @@
             <w:noProof/>
             <w:webHidden/>
           </w:rPr>
-          <w:instrText xml:space="preserve"> PAGEREF _Toc242195274 \h </w:instrText>
+          <w:instrText xml:space="preserve"> PAGEREF _Toc242290397 \h </w:instrText>
         </w:r>
         <w:r>
           <w:rPr>
@@ -1954,7 +1892,7 @@
           <w14:ligatures w14:val="standardContextual"/>
         </w:rPr>
       </w:pPr>
-      <w:hyperlink w:anchor="_Toc242195275" w:history="1">
+      <w:hyperlink w:anchor="_Toc242290398" w:history="1">
         <w:r>
           <w:rPr>
             <w:rStyle w:val="Hyperlink"/>
@@ -1981,7 +1919,7 @@
             <w:noProof/>
             <w:webHidden/>
           </w:rPr>
-          <w:instrText xml:space="preserve"> PAGEREF _Toc242195275 \h </w:instrText>
+          <w:instrText xml:space="preserve"> PAGEREF _Toc242290398 \h </w:instrText>
         </w:r>
         <w:r>
           <w:rPr>
@@ -2027,7 +1965,7 @@
           <w14:ligatures w14:val="standardContextual"/>
         </w:rPr>
       </w:pPr>
-      <w:hyperlink w:anchor="_Toc242195276" w:history="1">
+      <w:hyperlink w:anchor="_Toc242290399" w:history="1">
         <w:r>
           <w:rPr>
             <w:rStyle w:val="Hyperlink"/>
@@ -2054,7 +1992,7 @@
             <w:noProof/>
             <w:webHidden/>
           </w:rPr>
-          <w:instrText xml:space="preserve"> PAGEREF _Toc242195276 \h </w:instrText>
+          <w:instrText xml:space="preserve"> PAGEREF _Toc242290399 \h </w:instrText>
         </w:r>
         <w:r>
           <w:rPr>
@@ -2100,7 +2038,7 @@
           <w14:ligatures w14:val="standardContextual"/>
         </w:rPr>
       </w:pPr>
-      <w:hyperlink w:anchor="_Toc242195277" w:history="1">
+      <w:hyperlink w:anchor="_Toc242290400" w:history="1">
         <w:r>
           <w:rPr>
             <w:rStyle w:val="Hyperlink"/>
@@ -2127,7 +2065,7 @@
             <w:noProof/>
             <w:webHidden/>
           </w:rPr>
-          <w:instrText xml:space="preserve"> PAGEREF _Toc242195277 \h </w:instrText>
+          <w:instrText xml:space="preserve"> PAGEREF _Toc242290400 \h </w:instrText>
         </w:r>
         <w:r>
           <w:rPr>
@@ -2173,7 +2111,7 @@
           <w14:ligatures w14:val="standardContextual"/>
         </w:rPr>
       </w:pPr>
-      <w:hyperlink w:anchor="_Toc242195278" w:history="1">
+      <w:hyperlink w:anchor="_Toc242290401" w:history="1">
         <w:r>
           <w:rPr>
             <w:rStyle w:val="Hyperlink"/>
@@ -2200,7 +2138,7 @@
             <w:noProof/>
             <w:webHidden/>
           </w:rPr>
-          <w:instrText xml:space="preserve"> PAGEREF _Toc242195278 \h </w:instrText>
+          <w:instrText xml:space="preserve"> PAGEREF _Toc242290401 \h </w:instrText>
         </w:r>
         <w:r>
           <w:rPr>
@@ -2246,7 +2184,7 @@
           <w14:ligatures w14:val="standardContextual"/>
         </w:rPr>
       </w:pPr>
-      <w:hyperlink w:anchor="_Toc242195279" w:history="1">
+      <w:hyperlink w:anchor="_Toc242290402" w:history="1">
         <w:r>
           <w:rPr>
             <w:rStyle w:val="Hyperlink"/>
@@ -2273,7 +2211,7 @@
             <w:noProof/>
             <w:webHidden/>
           </w:rPr>
-          <w:instrText xml:space="preserve"> PAGEREF _Toc242195279 \h </w:instrText>
+          <w:instrText xml:space="preserve"> PAGEREF _Toc242290402 \h </w:instrText>
         </w:r>
         <w:r>
           <w:rPr>
@@ -2319,7 +2257,7 @@
           <w14:ligatures w14:val="standardContextual"/>
         </w:rPr>
       </w:pPr>
-      <w:hyperlink w:anchor="_Toc242195280" w:history="1">
+      <w:hyperlink w:anchor="_Toc242290403" w:history="1">
         <w:r>
           <w:rPr>
             <w:rStyle w:val="Hyperlink"/>
@@ -2346,7 +2284,7 @@
             <w:noProof/>
             <w:webHidden/>
           </w:rPr>
-          <w:instrText xml:space="preserve"> PAGEREF _Toc242195280 \h </w:instrText>
+          <w:instrText xml:space="preserve"> PAGEREF _Toc242290403 \h </w:instrText>
         </w:r>
         <w:r>
           <w:rPr>
@@ -2392,7 +2330,7 @@
           <w14:ligatures w14:val="standardContextual"/>
         </w:rPr>
       </w:pPr>
-      <w:hyperlink w:anchor="_Toc242195281" w:history="1">
+      <w:hyperlink w:anchor="_Toc242290404" w:history="1">
         <w:r>
           <w:rPr>
             <w:rStyle w:val="Hyperlink"/>
@@ -2419,7 +2357,7 @@
             <w:noProof/>
             <w:webHidden/>
           </w:rPr>
-          <w:instrText xml:space="preserve"> PAGEREF _Toc242195281 \h </w:instrText>
+          <w:instrText xml:space="preserve"> PAGEREF _Toc242290404 \h </w:instrText>
         </w:r>
         <w:r>
           <w:rPr>
@@ -2465,7 +2403,7 @@
           <w14:ligatures w14:val="standardContextual"/>
         </w:rPr>
       </w:pPr>
-      <w:hyperlink w:anchor="_Toc242195282" w:history="1">
+      <w:hyperlink w:anchor="_Toc242290405" w:history="1">
         <w:r>
           <w:rPr>
             <w:rStyle w:val="Hyperlink"/>
@@ -2492,7 +2430,7 @@
             <w:noProof/>
             <w:webHidden/>
           </w:rPr>
-          <w:instrText xml:space="preserve"> PAGEREF _Toc242195282 \h </w:instrText>
+          <w:instrText xml:space="preserve"> PAGEREF _Toc242290405 \h </w:instrText>
         </w:r>
         <w:r>
           <w:rPr>
@@ -2538,7 +2476,7 @@
           <w14:ligatures w14:val="standardContextual"/>
         </w:rPr>
       </w:pPr>
-      <w:hyperlink w:anchor="_Toc242195283" w:history="1">
+      <w:hyperlink w:anchor="_Toc242290406" w:history="1">
         <w:r>
           <w:rPr>
             <w:rStyle w:val="Hyperlink"/>
@@ -2565,7 +2503,7 @@
             <w:noProof/>
             <w:webHidden/>
           </w:rPr>
-          <w:instrText xml:space="preserve"> PAGEREF _Toc242195283 \h </w:instrText>
+          <w:instrText xml:space="preserve"> PAGEREF _Toc242290406 \h </w:instrText>
         </w:r>
         <w:r>
           <w:rPr>
@@ -2611,7 +2549,7 @@
           <w14:ligatures w14:val="standardContextual"/>
         </w:rPr>
       </w:pPr>
-      <w:hyperlink w:anchor="_Toc242195284" w:history="1">
+      <w:hyperlink w:anchor="_Toc242290407" w:history="1">
         <w:r>
           <w:rPr>
             <w:rStyle w:val="Hyperlink"/>
@@ -2638,7 +2576,7 @@
             <w:noProof/>
             <w:webHidden/>
           </w:rPr>
-          <w:instrText xml:space="preserve"> PAGEREF _Toc242195284 \h </w:instrText>
+          <w:instrText xml:space="preserve"> PAGEREF _Toc242290407 \h </w:instrText>
         </w:r>
         <w:r>
           <w:rPr>
@@ -2684,7 +2622,7 @@
           <w14:ligatures w14:val="standardContextual"/>
         </w:rPr>
       </w:pPr>
-      <w:hyperlink w:anchor="_Toc242195285" w:history="1">
+      <w:hyperlink w:anchor="_Toc242290408" w:history="1">
         <w:r>
           <w:rPr>
             <w:rStyle w:val="Hyperlink"/>
@@ -2711,7 +2649,7 @@
             <w:noProof/>
             <w:webHidden/>
           </w:rPr>
-          <w:instrText xml:space="preserve"> PAGEREF _Toc242195285 \h </w:instrText>
+          <w:instrText xml:space="preserve"> PAGEREF _Toc242290408 \h </w:instrText>
         </w:r>
         <w:r>
           <w:rPr>
@@ -2757,7 +2695,7 @@
           <w14:ligatures w14:val="standardContextual"/>
         </w:rPr>
       </w:pPr>
-      <w:hyperlink w:anchor="_Toc242195286" w:history="1">
+      <w:hyperlink w:anchor="_Toc242290409" w:history="1">
         <w:r>
           <w:rPr>
             <w:rStyle w:val="Hyperlink"/>
@@ -2784,7 +2722,7 @@
             <w:noProof/>
             <w:webHidden/>
           </w:rPr>
-          <w:instrText xml:space="preserve"> PAGEREF _Toc242195286 \h </w:instrText>
+          <w:instrText xml:space="preserve"> PAGEREF _Toc242290409 \h </w:instrText>
         </w:r>
         <w:r>
           <w:rPr>
@@ -2829,7 +2767,7 @@
       <w:pPr>
         <w:pStyle w:val="Heading1"/>
       </w:pPr>
-      <w:bookmarkStart w:id="0" w:name="_Toc242195255"/>
+      <w:bookmarkStart w:id="0" w:name="_Toc242290378"/>
       <w:r>
         <w:lastRenderedPageBreak/>
         <w:t>1. Información general del producto</w:t>
@@ -3161,7 +3099,7 @@
                 <w:sz w:val="19"/>
                 <w:szCs w:val="19"/>
               </w:rPr>
-              <w:t>2026; plantillas e interfaz ilustrada del 6 de octubre</w:t>
+              <w:t>2026, revisión editorial del 7 de octubre</w:t>
             </w:r>
           </w:p>
         </w:tc>
@@ -3283,68 +3221,7 @@
                 <w:sz w:val="19"/>
                 <w:szCs w:val="19"/>
               </w:rPr>
-              <w:t>Python 3.11 o superior; aplicación portátil Windows x64</w:t>
-            </w:r>
-          </w:p>
-        </w:tc>
-      </w:tr>
-      <w:tr>
-        <w:trPr>
-          <w:cantSplit/>
-        </w:trPr>
-        <w:tc>
-          <w:tcPr>
-            <w:tcW w:w="3096" w:type="dxa"/>
-            <w:tcBorders>
-              <w:top w:val="single" w:sz="4" w:space="0" w:color="BFBFBF"/>
-              <w:left w:val="single" w:sz="4" w:space="0" w:color="BFBFBF"/>
-              <w:bottom w:val="single" w:sz="4" w:space="0" w:color="BFBFBF"/>
-              <w:right w:val="single" w:sz="4" w:space="0" w:color="BFBFBF"/>
-            </w:tcBorders>
-            <w:shd w:val="clear" w:color="auto" w:fill="EAF1F1"/>
-            <w:tcMar>
-              <w:top w:w="70" w:type="dxa"/>
-              <w:left w:w="100" w:type="dxa"/>
-              <w:bottom w:w="70" w:type="dxa"/>
-              <w:right w:w="100" w:type="dxa"/>
-            </w:tcMar>
-            <w:vAlign w:val="center"/>
-          </w:tcPr>
-          <w:p>
-            <w:r>
-              <w:rPr>
-                <w:bCs/>
-                <w:sz w:val="19"/>
-                <w:szCs w:val="19"/>
-              </w:rPr>
-              <w:t>Repositorio</w:t>
-            </w:r>
-          </w:p>
-        </w:tc>
-        <w:tc>
-          <w:tcPr>
-            <w:tcW w:w="6264" w:type="dxa"/>
-            <w:tcBorders>
-              <w:top w:val="single" w:sz="4" w:space="0" w:color="BFBFBF"/>
-              <w:left w:val="single" w:sz="4" w:space="0" w:color="BFBFBF"/>
-              <w:bottom w:val="single" w:sz="4" w:space="0" w:color="BFBFBF"/>
-              <w:right w:val="single" w:sz="4" w:space="0" w:color="BFBFBF"/>
-            </w:tcBorders>
-            <w:tcMar>
-              <w:top w:w="70" w:type="dxa"/>
-              <w:left w:w="100" w:type="dxa"/>
-              <w:bottom w:w="70" w:type="dxa"/>
-              <w:right w:w="100" w:type="dxa"/>
-            </w:tcMar>
-            <w:vAlign w:val="center"/>
-          </w:tcPr>
-          <w:p>
-            <w:r>
-              <w:rPr>
-                <w:sz w:val="19"/>
-                <w:szCs w:val="19"/>
-              </w:rPr>
-              <w:t>https://github.com/fjburgosf/BikeEnergyLab</w:t>
+              <w:t>Python 3.11 o superior. Aplicación portátil Windows x64</w:t>
             </w:r>
           </w:p>
         </w:tc>
@@ -3466,7 +3343,7 @@
                 <w:sz w:val="19"/>
                 <w:szCs w:val="19"/>
               </w:rPr>
-              <w:t>Los establecidos en LICENSE; no se presume una licencia abierta</w:t>
+              <w:t>Los establecidos en LICENSE. No se presume una licencia abierta</w:t>
             </w:r>
           </w:p>
         </w:tc>
@@ -3478,7 +3355,7 @@
         <w:pStyle w:val="Heading1"/>
         <w:pageBreakBefore/>
       </w:pPr>
-      <w:bookmarkStart w:id="1" w:name="_Toc242195256"/>
+      <w:bookmarkStart w:id="1" w:name="_Toc242290379"/>
       <w:r>
         <w:lastRenderedPageBreak/>
         <w:t>2. Descripción general del software</w:t>
@@ -3492,14 +3369,14 @@
     </w:p>
     <w:p>
       <w:r>
-        <w:t>La física explícita puede calibrarse con energías observadas de rutas completas. El modelo CGPRA añade una corrección residual ponderada por una compuerta de confianza. El análisis Monte Carlo estudia energía, autonomía y misión bajo distribuciones configuradas; la sensibilidad permite explorar la influencia de parámetros. La GUI, la CLI y la API comparten los mismos componentes numéricos.</w:t>
+        <w:t>La física explícita puede calibrarse con energías observadas de rutas completas. El modelo CGPRA añade una corrección residual ponderada por una compuerta de confianza. El análisis Monte Carlo estudia energía, autonomía y misión bajo distribuciones configuradas. La sensibilidad permite explorar la influencia de parámetros. La GUI, la CLI y la API comparten los mismos componentes numéricos.</w:t>
       </w:r>
     </w:p>
     <w:p>
       <w:pPr>
         <w:pStyle w:val="Heading2"/>
       </w:pPr>
-      <w:bookmarkStart w:id="2" w:name="_Toc242195257"/>
+      <w:bookmarkStart w:id="2" w:name="_Toc242290380"/>
       <w:r>
         <w:t>2.1 Requisitos de hardware y software</w:t>
       </w:r>
@@ -3514,7 +3391,7 @@
       <w:pPr>
         <w:pStyle w:val="Heading2"/>
       </w:pPr>
-      <w:bookmarkStart w:id="3" w:name="_Toc242195258"/>
+      <w:bookmarkStart w:id="3" w:name="_Toc242290381"/>
       <w:r>
         <w:t>2.2 Justificación de los requisitos</w:t>
       </w:r>
@@ -3522,7 +3399,7 @@
     </w:p>
     <w:p>
       <w:r>
-        <w:t>NumPy y SciPy proporcionan cálculo e identificación; pandas procesa datos; scikit-learn implementa regresión y aprendizaje residual; Matplotlib genera figuras; PyYAML conserva configuraciones. La distribución onedir incluye estas dependencias, sus licencias y los datos de SciPy necesarios para Sobol. El costo de cálculo crece con las rutas, segmentos, muestras y protocolos seleccionados; no se atribuye un tiempo universal de ejecución.</w:t>
+        <w:t>NumPy y SciPy proporcionan cálculo e identificación. Pandas procesa datos. Scikit-learn implementa regresión y aprendizaje residual. Matplotlib genera figuras. PyYAML conserva configuraciones. La distribución onedir incluye estas dependencias, sus licencias y los datos de SciPy necesarios para Sobol. El costo de cálculo crece con las rutas, segmentos, muestras y protocolos seleccionados. No se atribuye un tiempo universal de ejecución.</w:t>
       </w:r>
     </w:p>
     <w:p>
@@ -3530,7 +3407,7 @@
         <w:pStyle w:val="Heading1"/>
         <w:pageBreakBefore/>
       </w:pPr>
-      <w:bookmarkStart w:id="4" w:name="_Toc242195259"/>
+      <w:bookmarkStart w:id="4" w:name="_Toc242290382"/>
       <w:r>
         <w:lastRenderedPageBreak/>
         <w:t>3. Objetivos y área de aplicación</w:t>
@@ -3541,7 +3418,7 @@
       <w:pPr>
         <w:pStyle w:val="Heading2"/>
       </w:pPr>
-      <w:bookmarkStart w:id="5" w:name="_Toc242195260"/>
+      <w:bookmarkStart w:id="5" w:name="_Toc242290383"/>
       <w:r>
         <w:t>3.1 Objetivo general</w:t>
       </w:r>
@@ -3556,7 +3433,7 @@
       <w:pPr>
         <w:pStyle w:val="Heading2"/>
       </w:pPr>
-      <w:bookmarkStart w:id="6" w:name="_Toc242195261"/>
+      <w:bookmarkStart w:id="6" w:name="_Toc242290384"/>
       <w:r>
         <w:t>3.2 Área de aplicación</w:t>
       </w:r>
@@ -3572,7 +3449,7 @@
         <w:pStyle w:val="Heading1"/>
         <w:pageBreakBefore/>
       </w:pPr>
-      <w:bookmarkStart w:id="7" w:name="_Toc242195262"/>
+      <w:bookmarkStart w:id="7" w:name="_Toc242290385"/>
       <w:r>
         <w:lastRenderedPageBreak/>
         <w:t>4. Funcionalidades principales</w:t>
@@ -3594,7 +3471,7 @@
         <w:pStyle w:val="Heading1"/>
         <w:pageBreakBefore/>
       </w:pPr>
-      <w:bookmarkStart w:id="8" w:name="_Toc242195263"/>
+      <w:bookmarkStart w:id="8" w:name="_Toc242290386"/>
       <w:r>
         <w:lastRenderedPageBreak/>
         <w:t>5. Adaptabilidad extensibilidad y mantenibilidad</w:t>
@@ -3616,7 +3493,7 @@
         <w:pStyle w:val="Heading1"/>
         <w:pageBreakBefore/>
       </w:pPr>
-      <w:bookmarkStart w:id="9" w:name="_Toc242195264"/>
+      <w:bookmarkStart w:id="9" w:name="_Toc242290387"/>
       <w:r>
         <w:lastRenderedPageBreak/>
         <w:t>6. Robustez desempeño y consistencia</w:t>
@@ -3627,7 +3504,7 @@
       <w:pPr>
         <w:pStyle w:val="Heading2"/>
       </w:pPr>
-      <w:bookmarkStart w:id="10" w:name="_Toc242195265"/>
+      <w:bookmarkStart w:id="10" w:name="_Toc242290388"/>
       <w:r>
         <w:t>6.1 Robustez</w:t>
       </w:r>
@@ -3635,14 +3512,14 @@
     </w:p>
     <w:p>
       <w:r>
-        <w:t>La configuración rechaza secciones y campos desconocidos, verifica límites y conserva los errores de entrada. Las operaciones de entrenamiento y adaptación son transaccionales. La GUI realiza cálculos con un trabajador y actualiza los widgets desde el hilo principal; bloquea los controles mientras calcula. No produce resultados exitosos cuando una tarea falla.</w:t>
+        <w:t>La configuración rechaza secciones y campos desconocidos, verifica límites y conserva los errores de entrada. Las operaciones de entrenamiento y adaptación son transaccionales. La GUI realiza cálculos con un trabajador y actualiza los widgets desde el hilo principal. Bloquea los controles mientras calcula. No produce resultados exitosos cuando una tarea falla.</w:t>
       </w:r>
     </w:p>
     <w:p>
       <w:pPr>
         <w:pStyle w:val="Heading2"/>
       </w:pPr>
-      <w:bookmarkStart w:id="11" w:name="_Toc242195266"/>
+      <w:bookmarkStart w:id="11" w:name="_Toc242290389"/>
       <w:r>
         <w:t>6.2 Desempeño</w:t>
       </w:r>
@@ -3657,7 +3534,7 @@
       <w:pPr>
         <w:pStyle w:val="Heading2"/>
       </w:pPr>
-      <w:bookmarkStart w:id="12" w:name="_Toc242195267"/>
+      <w:bookmarkStart w:id="12" w:name="_Toc242290390"/>
       <w:r>
         <w:t>6.3 Consistencia y reproducibilidad</w:t>
       </w:r>
@@ -3673,7 +3550,7 @@
         <w:pStyle w:val="Heading1"/>
         <w:pageBreakBefore/>
       </w:pPr>
-      <w:bookmarkStart w:id="13" w:name="_Toc242195268"/>
+      <w:bookmarkStart w:id="13" w:name="_Toc242290391"/>
       <w:r>
         <w:lastRenderedPageBreak/>
         <w:t>7. Interfaz y usabilidad</w:t>
@@ -3690,7 +3567,7 @@
         <w:pStyle w:val="Heading1"/>
         <w:pageBreakBefore/>
       </w:pPr>
-      <w:bookmarkStart w:id="14" w:name="_Toc242195269"/>
+      <w:bookmarkStart w:id="14" w:name="_Toc242290392"/>
       <w:r>
         <w:lastRenderedPageBreak/>
         <w:t>8. Integridad y seguridad de la información</w:t>
@@ -3704,7 +3581,7 @@
     </w:p>
     <w:p>
       <w:r>
-        <w:t>El importador valida formatos y coherencia. Los mapas y rutas utilizados se copian en la exportación. El modelo se reconstruye desde datos declarados y verifica replay; no necesita ejecutar un archivo pickle arbitrario. El ejecutable de esta entrega no tiene firma digital.</w:t>
+        <w:t>El importador valida formatos y coherencia. Los mapas y rutas utilizados se copian en la exportación. El modelo se reconstruye desde datos declarados y verifica replay. No necesita ejecutar un archivo pickle arbitrario. El ejecutable de esta entrega no tiene firma digital.</w:t>
       </w:r>
     </w:p>
     <w:p>
@@ -3712,7 +3589,7 @@
         <w:pStyle w:val="Heading1"/>
         <w:pageBreakBefore/>
       </w:pPr>
-      <w:bookmarkStart w:id="15" w:name="_Toc242195270"/>
+      <w:bookmarkStart w:id="15" w:name="_Toc242290393"/>
       <w:r>
         <w:lastRenderedPageBreak/>
         <w:t>9. Portabilidad y compatibilidad</w:t>
@@ -3723,7 +3600,7 @@
       <w:pPr>
         <w:pStyle w:val="Heading2"/>
       </w:pPr>
-      <w:bookmarkStart w:id="16" w:name="_Toc242195271"/>
+      <w:bookmarkStart w:id="16" w:name="_Toc242290394"/>
       <w:r>
         <w:t>9.1 Plataformas compatibles</w:t>
       </w:r>
@@ -3738,7 +3615,7 @@
       <w:pPr>
         <w:pStyle w:val="Heading2"/>
       </w:pPr>
-      <w:bookmarkStart w:id="17" w:name="_Toc242195272"/>
+      <w:bookmarkStart w:id="17" w:name="_Toc242290395"/>
       <w:r>
         <w:t>9.2 Dependencias relevantes</w:t>
       </w:r>
@@ -3753,7 +3630,7 @@
       <w:pPr>
         <w:pStyle w:val="Heading2"/>
       </w:pPr>
-      <w:bookmarkStart w:id="18" w:name="_Toc242195273"/>
+      <w:bookmarkStart w:id="18" w:name="_Toc242290396"/>
       <w:r>
         <w:t>9.3 Portabilidad de resultados</w:t>
       </w:r>
@@ -3769,7 +3646,7 @@
         <w:pStyle w:val="Heading1"/>
         <w:pageBreakBefore/>
       </w:pPr>
-      <w:bookmarkStart w:id="19" w:name="_Toc242195274"/>
+      <w:bookmarkStart w:id="19" w:name="_Toc242290397"/>
       <w:r>
         <w:lastRenderedPageBreak/>
         <w:t>10. Documentación y soporte técnico</w:t>
@@ -3778,7 +3655,7 @@
     </w:p>
     <w:p>
       <w:r>
-        <w:t>La entrega incluye manual de usuario ilustrado, manual técnico, metodología científica, descripción del software y título/funciones en Word. El código y la documentación están en https://github.com/fjburgosf/BikeEnergyLab. Entregables reúne estos cinco DOCX, las fuentes ZIP, el EXE con sus dependencias y el paquete portátil.</w:t>
+        <w:t>La entrega incluye manual de usuario ilustrado, manual técnico, metodología científica, descripción del software y título/funciones en Word. Entregables reúne estos cinco DOCX, las fuentes ZIP, el EXE con sus dependencias y el paquete portátil.</w:t>
       </w:r>
     </w:p>
     <w:p>
@@ -3791,7 +3668,7 @@
         <w:pStyle w:val="Heading1"/>
         <w:pageBreakBefore/>
       </w:pPr>
-      <w:bookmarkStart w:id="20" w:name="_Toc242195275"/>
+      <w:bookmarkStart w:id="20" w:name="_Toc242290398"/>
       <w:r>
         <w:lastRenderedPageBreak/>
         <w:t>11. Pruebas validación y desempeño</w:t>
@@ -3800,12 +3677,12 @@
     </w:p>
     <w:p>
       <w:r>
-        <w:t>La evidencia de software comprueba los botones mediante widgets reales de Tk y respuestas controladas de diálogos; cubre archivos, ejemplos, modelos, tutorial, sensibilidad, benchmark, EXP 01 a 15 y exportaciones. No certifica el aspecto de todos los diálogos nativos ni todos los estados posibles. Los hashes de los documentos finales y los paquetes se registran en results.</w:t>
-      </w:r>
-    </w:p>
-    <w:p>
-      <w:r>
-        <w:t>La evidencia científica histórica conserva su identidad y resultados: M3 tuvo menor CRPS que M4 en el protocolo ID y M4 perdió cobertura en escenarios térmicos/combinados OOD. En deriva sintética, M1 adaptativo obtuvo el menor MAE. Estos hallazgos se explican en la metodología; no se sustituyen por resultados favorables ni por las pruebas de GUI.</w:t>
+        <w:t>La evidencia de software comprueba los botones mediante widgets reales de Tk y respuestas controladas de diálogos. Cubre archivos, ejemplos, modelos, tutorial, sensibilidad, benchmark, EXP 01 a 15 y exportaciones. No certifica el aspecto de todos los diálogos nativos ni todos los estados posibles. Los hashes de los documentos finales y los paquetes se registran en results.</w:t>
+      </w:r>
+    </w:p>
+    <w:p>
+      <w:r>
+        <w:t>La evidencia científica histórica conserva su identidad y resultados: M3 tuvo menor CRPS que M4 en el protocolo ID y M4 perdió cobertura en escenarios térmicos/combinados OOD. En deriva sintética, M1 adaptativo obtuvo el menor MAE. Estos hallazgos se explican en la metodología. No se sustituyen por resultados favorables ni por las pruebas de GUI.</w:t>
       </w:r>
     </w:p>
     <w:p>
@@ -3813,7 +3690,7 @@
         <w:pStyle w:val="Heading1"/>
         <w:pageBreakBefore/>
       </w:pPr>
-      <w:bookmarkStart w:id="21" w:name="_Toc242195276"/>
+      <w:bookmarkStart w:id="21" w:name="_Toc242290399"/>
       <w:r>
         <w:lastRenderedPageBreak/>
         <w:t>12. Impacto y utilización</w:t>
@@ -3824,7 +3701,7 @@
       <w:pPr>
         <w:pStyle w:val="Heading2"/>
       </w:pPr>
-      <w:bookmarkStart w:id="22" w:name="_Toc242195277"/>
+      <w:bookmarkStart w:id="22" w:name="_Toc242290400"/>
       <w:r>
         <w:t>12.1 Docencia</w:t>
       </w:r>
@@ -3839,7 +3716,7 @@
       <w:pPr>
         <w:pStyle w:val="Heading2"/>
       </w:pPr>
-      <w:bookmarkStart w:id="23" w:name="_Toc242195278"/>
+      <w:bookmarkStart w:id="23" w:name="_Toc242290401"/>
       <w:r>
         <w:t>12.2 Investigación</w:t>
       </w:r>
@@ -3854,7 +3731,7 @@
       <w:pPr>
         <w:pStyle w:val="Heading2"/>
       </w:pPr>
-      <w:bookmarkStart w:id="24" w:name="_Toc242195279"/>
+      <w:bookmarkStart w:id="24" w:name="_Toc242290402"/>
       <w:r>
         <w:t>12.3 Extensión y usuarios</w:t>
       </w:r>
@@ -3870,7 +3747,7 @@
         <w:pStyle w:val="Heading1"/>
         <w:pageBreakBefore/>
       </w:pPr>
-      <w:bookmarkStart w:id="25" w:name="_Toc242195280"/>
+      <w:bookmarkStart w:id="25" w:name="_Toc242290403"/>
       <w:r>
         <w:lastRenderedPageBreak/>
         <w:t>13. Contribución al estado del arte</w:t>
@@ -3881,7 +3758,7 @@
       <w:pPr>
         <w:pStyle w:val="Heading2"/>
       </w:pPr>
-      <w:bookmarkStart w:id="26" w:name="_Toc242195281"/>
+      <w:bookmarkStart w:id="26" w:name="_Toc242290404"/>
       <w:r>
         <w:t>13.1 Problema abordado</w:t>
       </w:r>
@@ -3896,7 +3773,7 @@
       <w:pPr>
         <w:pStyle w:val="Heading2"/>
       </w:pPr>
-      <w:bookmarkStart w:id="27" w:name="_Toc242195282"/>
+      <w:bookmarkStart w:id="27" w:name="_Toc242290405"/>
       <w:r>
         <w:t>13.2 Antecedentes y alcance</w:t>
       </w:r>
@@ -3911,7 +3788,7 @@
       <w:pPr>
         <w:pStyle w:val="Heading2"/>
       </w:pPr>
-      <w:bookmarkStart w:id="28" w:name="_Toc242195283"/>
+      <w:bookmarkStart w:id="28" w:name="_Toc242290406"/>
       <w:r>
         <w:t>13.3 Límites y contribución propuesta</w:t>
       </w:r>
@@ -3919,7 +3796,7 @@
     </w:p>
     <w:p>
       <w:r>
-        <w:t>CGPRA es una formulación provisional evaluable. La integración de física, corrección ponderada, adaptación y protocolos permite estudiar sus límites; no demuestra por sí misma originalidad académica ni superioridad universal. Faltan datos reales independientes y una revisión sistemática de trabajos previos.</w:t>
+        <w:t>CGPRA es una formulación provisional evaluable. La integración de física, corrección ponderada, adaptación y protocolos permite estudiar sus límites. No demuestra por sí misma originalidad académica ni superioridad universal. Faltan datos reales independientes y una revisión sistemática de trabajos previos.</w:t>
       </w:r>
     </w:p>
     <w:p>
@@ -3927,7 +3804,7 @@
         <w:pStyle w:val="Heading1"/>
         <w:pageBreakBefore/>
       </w:pPr>
-      <w:bookmarkStart w:id="29" w:name="_Toc242195284"/>
+      <w:bookmarkStart w:id="29" w:name="_Toc242290407"/>
       <w:r>
         <w:lastRenderedPageBreak/>
         <w:t>14. Aportes y autoría</w:t>
@@ -3944,7 +3821,7 @@
         <w:pStyle w:val="Heading1"/>
         <w:pageBreakBefore/>
       </w:pPr>
-      <w:bookmarkStart w:id="30" w:name="_Toc242195285"/>
+      <w:bookmarkStart w:id="30" w:name="_Toc242290408"/>
       <w:r>
         <w:lastRenderedPageBreak/>
         <w:t>Referencias</w:t>
@@ -3953,7 +3830,7 @@
     </w:p>
     <w:p>
       <w:r>
-        <w:t>Las referencias bibliográficas verificadas del proyecto se mantienen en docs/references.md y se desarrollan en Metodología científica de BikeEnergyLab. Las fuentes de evidencia conservan los protocolos del 4 de octubre de 2026 y su identidad histórica. La revisión documental del 6 de octubre no constituye una nueva validación física.</w:t>
+        <w:t>Las referencias bibliográficas verificadas del proyecto se mantienen en docs/references.md y se desarrollan en Metodología científica de BikeEnergyLab. Las fuentes de evidencia conservan los protocolos del 4 de octubre de 2026 y su identidad histórica. La revisión editorial del 7 de octubre no constituye una nueva validación física.</w:t>
       </w:r>
     </w:p>
     <w:p>
@@ -3977,7 +3854,7 @@
       <w:pPr>
         <w:pStyle w:val="Heading2"/>
       </w:pPr>
-      <w:bookmarkStart w:id="31" w:name="_Toc242195286"/>
+      <w:bookmarkStart w:id="31" w:name="_Toc242290409"/>
       <w:r>
         <w:t>Autoría y condiciones de uso</w:t>
       </w:r>
@@ -3985,7 +3862,7 @@
     </w:p>
     <w:p>
       <w:r>
-        <w:t>Autores: Francisco Javier Burgos Flórez y Juan Guillermo Popayán Hernández. Contacto: fjburgosf@gmail.com. Conserve CITATION.cff para citar el software. Los derechos y condiciones de uso son los indicados en LICENSE; no se presume una licencia abierta.</w:t>
+        <w:t>Autores: Francisco Javier Burgos Flórez y Juan Guillermo Popayán Hernández. Contacto: fjburgosf@gmail.com. Conserve CITATION.cff para citar el software. Los derechos y condiciones de uso son los indicados en LICENSE. No se presume una licencia abierta.</w:t>
       </w:r>
     </w:p>
     <w:sectPr>
@@ -4870,7 +4747,7 @@
     <w:link w:val="HeaderChar"/>
     <w:uiPriority w:val="99"/>
     <w:unhideWhenUsed/>
-    <w:rsid w:val="004352E4"/>
+    <w:rsid w:val="001D0602"/>
     <w:pPr>
       <w:tabs>
         <w:tab w:val="center" w:pos="4680"/>
@@ -4883,7 +4760,7 @@
     <w:basedOn w:val="DefaultParagraphFont"/>
     <w:link w:val="Header"/>
     <w:uiPriority w:val="99"/>
-    <w:rsid w:val="004352E4"/>
+    <w:rsid w:val="001D0602"/>
   </w:style>
   <w:style w:type="paragraph" w:styleId="Footer">
     <w:name w:val="footer"/>
@@ -4891,7 +4768,7 @@
     <w:link w:val="FooterChar"/>
     <w:uiPriority w:val="99"/>
     <w:unhideWhenUsed/>
-    <w:rsid w:val="004352E4"/>
+    <w:rsid w:val="001D0602"/>
     <w:pPr>
       <w:tabs>
         <w:tab w:val="center" w:pos="4680"/>
@@ -4904,7 +4781,7 @@
     <w:basedOn w:val="DefaultParagraphFont"/>
     <w:link w:val="Footer"/>
     <w:uiPriority w:val="99"/>
-    <w:rsid w:val="004352E4"/>
+    <w:rsid w:val="001D0602"/>
   </w:style>
 </w:styles>
 </file>

</xml_diff>

<commit_message>
Keep final delivery limited to five manuals and two archives
</commit_message>
<xml_diff>
--- a/docs/docx/Descripcion_del_Software_BikeEnergyLab_1.0.0.docx
+++ b/docs/docx/Descripcion_del_Software_BikeEnergyLab_1.0.0.docx
@@ -323,7 +323,7 @@
                 <w:sz w:val="19"/>
                 <w:szCs w:val="19"/>
               </w:rPr>
-              <w:t>Revisión editorial del 7 de octubre de 2026</w:t>
+              <w:t>Revisión de entrega del 8 de octubre de 2026</w:t>
             </w:r>
           </w:p>
         </w:tc>
@@ -432,7 +432,7 @@
       <w:r>
         <w:fldChar w:fldCharType="separate"/>
       </w:r>
-      <w:hyperlink w:anchor="_Toc242290378" w:history="1">
+      <w:hyperlink w:anchor="_Toc242339605" w:history="1">
         <w:r>
           <w:rPr>
             <w:rStyle w:val="Hyperlink"/>
@@ -459,7 +459,7 @@
             <w:noProof/>
             <w:webHidden/>
           </w:rPr>
-          <w:instrText xml:space="preserve"> PAGEREF _Toc242290378 \h </w:instrText>
+          <w:instrText xml:space="preserve"> PAGEREF _Toc242339605 \h </w:instrText>
         </w:r>
         <w:r>
           <w:rPr>
@@ -505,7 +505,7 @@
           <w14:ligatures w14:val="standardContextual"/>
         </w:rPr>
       </w:pPr>
-      <w:hyperlink w:anchor="_Toc242290379" w:history="1">
+      <w:hyperlink w:anchor="_Toc242339606" w:history="1">
         <w:r>
           <w:rPr>
             <w:rStyle w:val="Hyperlink"/>
@@ -532,7 +532,7 @@
             <w:noProof/>
             <w:webHidden/>
           </w:rPr>
-          <w:instrText xml:space="preserve"> PAGEREF _Toc242290379 \h </w:instrText>
+          <w:instrText xml:space="preserve"> PAGEREF _Toc242339606 \h </w:instrText>
         </w:r>
         <w:r>
           <w:rPr>
@@ -578,7 +578,7 @@
           <w14:ligatures w14:val="standardContextual"/>
         </w:rPr>
       </w:pPr>
-      <w:hyperlink w:anchor="_Toc242290380" w:history="1">
+      <w:hyperlink w:anchor="_Toc242339607" w:history="1">
         <w:r>
           <w:rPr>
             <w:rStyle w:val="Hyperlink"/>
@@ -605,7 +605,7 @@
             <w:noProof/>
             <w:webHidden/>
           </w:rPr>
-          <w:instrText xml:space="preserve"> PAGEREF _Toc242290380 \h </w:instrText>
+          <w:instrText xml:space="preserve"> PAGEREF _Toc242339607 \h </w:instrText>
         </w:r>
         <w:r>
           <w:rPr>
@@ -651,7 +651,7 @@
           <w14:ligatures w14:val="standardContextual"/>
         </w:rPr>
       </w:pPr>
-      <w:hyperlink w:anchor="_Toc242290381" w:history="1">
+      <w:hyperlink w:anchor="_Toc242339608" w:history="1">
         <w:r>
           <w:rPr>
             <w:rStyle w:val="Hyperlink"/>
@@ -678,7 +678,7 @@
             <w:noProof/>
             <w:webHidden/>
           </w:rPr>
-          <w:instrText xml:space="preserve"> PAGEREF _Toc242290381 \h </w:instrText>
+          <w:instrText xml:space="preserve"> PAGEREF _Toc242339608 \h </w:instrText>
         </w:r>
         <w:r>
           <w:rPr>
@@ -724,7 +724,7 @@
           <w14:ligatures w14:val="standardContextual"/>
         </w:rPr>
       </w:pPr>
-      <w:hyperlink w:anchor="_Toc242290382" w:history="1">
+      <w:hyperlink w:anchor="_Toc242339609" w:history="1">
         <w:r>
           <w:rPr>
             <w:rStyle w:val="Hyperlink"/>
@@ -751,7 +751,7 @@
             <w:noProof/>
             <w:webHidden/>
           </w:rPr>
-          <w:instrText xml:space="preserve"> PAGEREF _Toc242290382 \h </w:instrText>
+          <w:instrText xml:space="preserve"> PAGEREF _Toc242339609 \h </w:instrText>
         </w:r>
         <w:r>
           <w:rPr>
@@ -797,7 +797,7 @@
           <w14:ligatures w14:val="standardContextual"/>
         </w:rPr>
       </w:pPr>
-      <w:hyperlink w:anchor="_Toc242290383" w:history="1">
+      <w:hyperlink w:anchor="_Toc242339610" w:history="1">
         <w:r>
           <w:rPr>
             <w:rStyle w:val="Hyperlink"/>
@@ -824,7 +824,7 @@
             <w:noProof/>
             <w:webHidden/>
           </w:rPr>
-          <w:instrText xml:space="preserve"> PAGEREF _Toc242290383 \h </w:instrText>
+          <w:instrText xml:space="preserve"> PAGEREF _Toc242339610 \h </w:instrText>
         </w:r>
         <w:r>
           <w:rPr>
@@ -870,7 +870,7 @@
           <w14:ligatures w14:val="standardContextual"/>
         </w:rPr>
       </w:pPr>
-      <w:hyperlink w:anchor="_Toc242290384" w:history="1">
+      <w:hyperlink w:anchor="_Toc242339611" w:history="1">
         <w:r>
           <w:rPr>
             <w:rStyle w:val="Hyperlink"/>
@@ -897,7 +897,7 @@
             <w:noProof/>
             <w:webHidden/>
           </w:rPr>
-          <w:instrText xml:space="preserve"> PAGEREF _Toc242290384 \h </w:instrText>
+          <w:instrText xml:space="preserve"> PAGEREF _Toc242339611 \h </w:instrText>
         </w:r>
         <w:r>
           <w:rPr>
@@ -943,7 +943,7 @@
           <w14:ligatures w14:val="standardContextual"/>
         </w:rPr>
       </w:pPr>
-      <w:hyperlink w:anchor="_Toc242290385" w:history="1">
+      <w:hyperlink w:anchor="_Toc242339612" w:history="1">
         <w:r>
           <w:rPr>
             <w:rStyle w:val="Hyperlink"/>
@@ -970,7 +970,7 @@
             <w:noProof/>
             <w:webHidden/>
           </w:rPr>
-          <w:instrText xml:space="preserve"> PAGEREF _Toc242290385 \h </w:instrText>
+          <w:instrText xml:space="preserve"> PAGEREF _Toc242339612 \h </w:instrText>
         </w:r>
         <w:r>
           <w:rPr>
@@ -1016,7 +1016,7 @@
           <w14:ligatures w14:val="standardContextual"/>
         </w:rPr>
       </w:pPr>
-      <w:hyperlink w:anchor="_Toc242290386" w:history="1">
+      <w:hyperlink w:anchor="_Toc242339613" w:history="1">
         <w:r>
           <w:rPr>
             <w:rStyle w:val="Hyperlink"/>
@@ -1043,7 +1043,7 @@
             <w:noProof/>
             <w:webHidden/>
           </w:rPr>
-          <w:instrText xml:space="preserve"> PAGEREF _Toc242290386 \h </w:instrText>
+          <w:instrText xml:space="preserve"> PAGEREF _Toc242339613 \h </w:instrText>
         </w:r>
         <w:r>
           <w:rPr>
@@ -1089,7 +1089,7 @@
           <w14:ligatures w14:val="standardContextual"/>
         </w:rPr>
       </w:pPr>
-      <w:hyperlink w:anchor="_Toc242290387" w:history="1">
+      <w:hyperlink w:anchor="_Toc242339614" w:history="1">
         <w:r>
           <w:rPr>
             <w:rStyle w:val="Hyperlink"/>
@@ -1116,7 +1116,7 @@
             <w:noProof/>
             <w:webHidden/>
           </w:rPr>
-          <w:instrText xml:space="preserve"> PAGEREF _Toc242290387 \h </w:instrText>
+          <w:instrText xml:space="preserve"> PAGEREF _Toc242339614 \h </w:instrText>
         </w:r>
         <w:r>
           <w:rPr>
@@ -1162,7 +1162,7 @@
           <w14:ligatures w14:val="standardContextual"/>
         </w:rPr>
       </w:pPr>
-      <w:hyperlink w:anchor="_Toc242290388" w:history="1">
+      <w:hyperlink w:anchor="_Toc242339615" w:history="1">
         <w:r>
           <w:rPr>
             <w:rStyle w:val="Hyperlink"/>
@@ -1189,7 +1189,7 @@
             <w:noProof/>
             <w:webHidden/>
           </w:rPr>
-          <w:instrText xml:space="preserve"> PAGEREF _Toc242290388 \h </w:instrText>
+          <w:instrText xml:space="preserve"> PAGEREF _Toc242339615 \h </w:instrText>
         </w:r>
         <w:r>
           <w:rPr>
@@ -1235,7 +1235,7 @@
           <w14:ligatures w14:val="standardContextual"/>
         </w:rPr>
       </w:pPr>
-      <w:hyperlink w:anchor="_Toc242290389" w:history="1">
+      <w:hyperlink w:anchor="_Toc242339616" w:history="1">
         <w:r>
           <w:rPr>
             <w:rStyle w:val="Hyperlink"/>
@@ -1262,7 +1262,7 @@
             <w:noProof/>
             <w:webHidden/>
           </w:rPr>
-          <w:instrText xml:space="preserve"> PAGEREF _Toc242290389 \h </w:instrText>
+          <w:instrText xml:space="preserve"> PAGEREF _Toc242339616 \h </w:instrText>
         </w:r>
         <w:r>
           <w:rPr>
@@ -1308,7 +1308,7 @@
           <w14:ligatures w14:val="standardContextual"/>
         </w:rPr>
       </w:pPr>
-      <w:hyperlink w:anchor="_Toc242290390" w:history="1">
+      <w:hyperlink w:anchor="_Toc242339617" w:history="1">
         <w:r>
           <w:rPr>
             <w:rStyle w:val="Hyperlink"/>
@@ -1335,7 +1335,7 @@
             <w:noProof/>
             <w:webHidden/>
           </w:rPr>
-          <w:instrText xml:space="preserve"> PAGEREF _Toc242290390 \h </w:instrText>
+          <w:instrText xml:space="preserve"> PAGEREF _Toc242339617 \h </w:instrText>
         </w:r>
         <w:r>
           <w:rPr>
@@ -1381,7 +1381,7 @@
           <w14:ligatures w14:val="standardContextual"/>
         </w:rPr>
       </w:pPr>
-      <w:hyperlink w:anchor="_Toc242290391" w:history="1">
+      <w:hyperlink w:anchor="_Toc242339618" w:history="1">
         <w:r>
           <w:rPr>
             <w:rStyle w:val="Hyperlink"/>
@@ -1408,7 +1408,7 @@
             <w:noProof/>
             <w:webHidden/>
           </w:rPr>
-          <w:instrText xml:space="preserve"> PAGEREF _Toc242290391 \h </w:instrText>
+          <w:instrText xml:space="preserve"> PAGEREF _Toc242339618 \h </w:instrText>
         </w:r>
         <w:r>
           <w:rPr>
@@ -1454,7 +1454,7 @@
           <w14:ligatures w14:val="standardContextual"/>
         </w:rPr>
       </w:pPr>
-      <w:hyperlink w:anchor="_Toc242290392" w:history="1">
+      <w:hyperlink w:anchor="_Toc242339619" w:history="1">
         <w:r>
           <w:rPr>
             <w:rStyle w:val="Hyperlink"/>
@@ -1481,7 +1481,7 @@
             <w:noProof/>
             <w:webHidden/>
           </w:rPr>
-          <w:instrText xml:space="preserve"> PAGEREF _Toc242290392 \h </w:instrText>
+          <w:instrText xml:space="preserve"> PAGEREF _Toc242339619 \h </w:instrText>
         </w:r>
         <w:r>
           <w:rPr>
@@ -1527,7 +1527,7 @@
           <w14:ligatures w14:val="standardContextual"/>
         </w:rPr>
       </w:pPr>
-      <w:hyperlink w:anchor="_Toc242290393" w:history="1">
+      <w:hyperlink w:anchor="_Toc242339620" w:history="1">
         <w:r>
           <w:rPr>
             <w:rStyle w:val="Hyperlink"/>
@@ -1554,7 +1554,7 @@
             <w:noProof/>
             <w:webHidden/>
           </w:rPr>
-          <w:instrText xml:space="preserve"> PAGEREF _Toc242290393 \h </w:instrText>
+          <w:instrText xml:space="preserve"> PAGEREF _Toc242339620 \h </w:instrText>
         </w:r>
         <w:r>
           <w:rPr>
@@ -1600,7 +1600,7 @@
           <w14:ligatures w14:val="standardContextual"/>
         </w:rPr>
       </w:pPr>
-      <w:hyperlink w:anchor="_Toc242290394" w:history="1">
+      <w:hyperlink w:anchor="_Toc242339621" w:history="1">
         <w:r>
           <w:rPr>
             <w:rStyle w:val="Hyperlink"/>
@@ -1627,7 +1627,7 @@
             <w:noProof/>
             <w:webHidden/>
           </w:rPr>
-          <w:instrText xml:space="preserve"> PAGEREF _Toc242290394 \h </w:instrText>
+          <w:instrText xml:space="preserve"> PAGEREF _Toc242339621 \h </w:instrText>
         </w:r>
         <w:r>
           <w:rPr>
@@ -1673,7 +1673,7 @@
           <w14:ligatures w14:val="standardContextual"/>
         </w:rPr>
       </w:pPr>
-      <w:hyperlink w:anchor="_Toc242290395" w:history="1">
+      <w:hyperlink w:anchor="_Toc242339622" w:history="1">
         <w:r>
           <w:rPr>
             <w:rStyle w:val="Hyperlink"/>
@@ -1700,7 +1700,7 @@
             <w:noProof/>
             <w:webHidden/>
           </w:rPr>
-          <w:instrText xml:space="preserve"> PAGEREF _Toc242290395 \h </w:instrText>
+          <w:instrText xml:space="preserve"> PAGEREF _Toc242339622 \h </w:instrText>
         </w:r>
         <w:r>
           <w:rPr>
@@ -1746,7 +1746,7 @@
           <w14:ligatures w14:val="standardContextual"/>
         </w:rPr>
       </w:pPr>
-      <w:hyperlink w:anchor="_Toc242290396" w:history="1">
+      <w:hyperlink w:anchor="_Toc242339623" w:history="1">
         <w:r>
           <w:rPr>
             <w:rStyle w:val="Hyperlink"/>
@@ -1773,7 +1773,7 @@
             <w:noProof/>
             <w:webHidden/>
           </w:rPr>
-          <w:instrText xml:space="preserve"> PAGEREF _Toc242290396 \h </w:instrText>
+          <w:instrText xml:space="preserve"> PAGEREF _Toc242339623 \h </w:instrText>
         </w:r>
         <w:r>
           <w:rPr>
@@ -1819,7 +1819,7 @@
           <w14:ligatures w14:val="standardContextual"/>
         </w:rPr>
       </w:pPr>
-      <w:hyperlink w:anchor="_Toc242290397" w:history="1">
+      <w:hyperlink w:anchor="_Toc242339624" w:history="1">
         <w:r>
           <w:rPr>
             <w:rStyle w:val="Hyperlink"/>
@@ -1846,7 +1846,7 @@
             <w:noProof/>
             <w:webHidden/>
           </w:rPr>
-          <w:instrText xml:space="preserve"> PAGEREF _Toc242290397 \h </w:instrText>
+          <w:instrText xml:space="preserve"> PAGEREF _Toc242339624 \h </w:instrText>
         </w:r>
         <w:r>
           <w:rPr>
@@ -1892,7 +1892,7 @@
           <w14:ligatures w14:val="standardContextual"/>
         </w:rPr>
       </w:pPr>
-      <w:hyperlink w:anchor="_Toc242290398" w:history="1">
+      <w:hyperlink w:anchor="_Toc242339625" w:history="1">
         <w:r>
           <w:rPr>
             <w:rStyle w:val="Hyperlink"/>
@@ -1919,7 +1919,7 @@
             <w:noProof/>
             <w:webHidden/>
           </w:rPr>
-          <w:instrText xml:space="preserve"> PAGEREF _Toc242290398 \h </w:instrText>
+          <w:instrText xml:space="preserve"> PAGEREF _Toc242339625 \h </w:instrText>
         </w:r>
         <w:r>
           <w:rPr>
@@ -1965,7 +1965,7 @@
           <w14:ligatures w14:val="standardContextual"/>
         </w:rPr>
       </w:pPr>
-      <w:hyperlink w:anchor="_Toc242290399" w:history="1">
+      <w:hyperlink w:anchor="_Toc242339626" w:history="1">
         <w:r>
           <w:rPr>
             <w:rStyle w:val="Hyperlink"/>
@@ -1992,7 +1992,7 @@
             <w:noProof/>
             <w:webHidden/>
           </w:rPr>
-          <w:instrText xml:space="preserve"> PAGEREF _Toc242290399 \h </w:instrText>
+          <w:instrText xml:space="preserve"> PAGEREF _Toc242339626 \h </w:instrText>
         </w:r>
         <w:r>
           <w:rPr>
@@ -2038,7 +2038,7 @@
           <w14:ligatures w14:val="standardContextual"/>
         </w:rPr>
       </w:pPr>
-      <w:hyperlink w:anchor="_Toc242290400" w:history="1">
+      <w:hyperlink w:anchor="_Toc242339627" w:history="1">
         <w:r>
           <w:rPr>
             <w:rStyle w:val="Hyperlink"/>
@@ -2065,7 +2065,7 @@
             <w:noProof/>
             <w:webHidden/>
           </w:rPr>
-          <w:instrText xml:space="preserve"> PAGEREF _Toc242290400 \h </w:instrText>
+          <w:instrText xml:space="preserve"> PAGEREF _Toc242339627 \h </w:instrText>
         </w:r>
         <w:r>
           <w:rPr>
@@ -2111,7 +2111,7 @@
           <w14:ligatures w14:val="standardContextual"/>
         </w:rPr>
       </w:pPr>
-      <w:hyperlink w:anchor="_Toc242290401" w:history="1">
+      <w:hyperlink w:anchor="_Toc242339628" w:history="1">
         <w:r>
           <w:rPr>
             <w:rStyle w:val="Hyperlink"/>
@@ -2138,7 +2138,7 @@
             <w:noProof/>
             <w:webHidden/>
           </w:rPr>
-          <w:instrText xml:space="preserve"> PAGEREF _Toc242290401 \h </w:instrText>
+          <w:instrText xml:space="preserve"> PAGEREF _Toc242339628 \h </w:instrText>
         </w:r>
         <w:r>
           <w:rPr>
@@ -2184,7 +2184,7 @@
           <w14:ligatures w14:val="standardContextual"/>
         </w:rPr>
       </w:pPr>
-      <w:hyperlink w:anchor="_Toc242290402" w:history="1">
+      <w:hyperlink w:anchor="_Toc242339629" w:history="1">
         <w:r>
           <w:rPr>
             <w:rStyle w:val="Hyperlink"/>
@@ -2211,7 +2211,7 @@
             <w:noProof/>
             <w:webHidden/>
           </w:rPr>
-          <w:instrText xml:space="preserve"> PAGEREF _Toc242290402 \h </w:instrText>
+          <w:instrText xml:space="preserve"> PAGEREF _Toc242339629 \h </w:instrText>
         </w:r>
         <w:r>
           <w:rPr>
@@ -2257,7 +2257,7 @@
           <w14:ligatures w14:val="standardContextual"/>
         </w:rPr>
       </w:pPr>
-      <w:hyperlink w:anchor="_Toc242290403" w:history="1">
+      <w:hyperlink w:anchor="_Toc242339630" w:history="1">
         <w:r>
           <w:rPr>
             <w:rStyle w:val="Hyperlink"/>
@@ -2284,7 +2284,7 @@
             <w:noProof/>
             <w:webHidden/>
           </w:rPr>
-          <w:instrText xml:space="preserve"> PAGEREF _Toc242290403 \h </w:instrText>
+          <w:instrText xml:space="preserve"> PAGEREF _Toc242339630 \h </w:instrText>
         </w:r>
         <w:r>
           <w:rPr>
@@ -2330,7 +2330,7 @@
           <w14:ligatures w14:val="standardContextual"/>
         </w:rPr>
       </w:pPr>
-      <w:hyperlink w:anchor="_Toc242290404" w:history="1">
+      <w:hyperlink w:anchor="_Toc242339631" w:history="1">
         <w:r>
           <w:rPr>
             <w:rStyle w:val="Hyperlink"/>
@@ -2357,7 +2357,7 @@
             <w:noProof/>
             <w:webHidden/>
           </w:rPr>
-          <w:instrText xml:space="preserve"> PAGEREF _Toc242290404 \h </w:instrText>
+          <w:instrText xml:space="preserve"> PAGEREF _Toc242339631 \h </w:instrText>
         </w:r>
         <w:r>
           <w:rPr>
@@ -2403,7 +2403,7 @@
           <w14:ligatures w14:val="standardContextual"/>
         </w:rPr>
       </w:pPr>
-      <w:hyperlink w:anchor="_Toc242290405" w:history="1">
+      <w:hyperlink w:anchor="_Toc242339632" w:history="1">
         <w:r>
           <w:rPr>
             <w:rStyle w:val="Hyperlink"/>
@@ -2430,7 +2430,7 @@
             <w:noProof/>
             <w:webHidden/>
           </w:rPr>
-          <w:instrText xml:space="preserve"> PAGEREF _Toc242290405 \h </w:instrText>
+          <w:instrText xml:space="preserve"> PAGEREF _Toc242339632 \h </w:instrText>
         </w:r>
         <w:r>
           <w:rPr>
@@ -2476,7 +2476,7 @@
           <w14:ligatures w14:val="standardContextual"/>
         </w:rPr>
       </w:pPr>
-      <w:hyperlink w:anchor="_Toc242290406" w:history="1">
+      <w:hyperlink w:anchor="_Toc242339633" w:history="1">
         <w:r>
           <w:rPr>
             <w:rStyle w:val="Hyperlink"/>
@@ -2503,7 +2503,7 @@
             <w:noProof/>
             <w:webHidden/>
           </w:rPr>
-          <w:instrText xml:space="preserve"> PAGEREF _Toc242290406 \h </w:instrText>
+          <w:instrText xml:space="preserve"> PAGEREF _Toc242339633 \h </w:instrText>
         </w:r>
         <w:r>
           <w:rPr>
@@ -2549,7 +2549,7 @@
           <w14:ligatures w14:val="standardContextual"/>
         </w:rPr>
       </w:pPr>
-      <w:hyperlink w:anchor="_Toc242290407" w:history="1">
+      <w:hyperlink w:anchor="_Toc242339634" w:history="1">
         <w:r>
           <w:rPr>
             <w:rStyle w:val="Hyperlink"/>
@@ -2576,7 +2576,7 @@
             <w:noProof/>
             <w:webHidden/>
           </w:rPr>
-          <w:instrText xml:space="preserve"> PAGEREF _Toc242290407 \h </w:instrText>
+          <w:instrText xml:space="preserve"> PAGEREF _Toc242339634 \h </w:instrText>
         </w:r>
         <w:r>
           <w:rPr>
@@ -2622,7 +2622,7 @@
           <w14:ligatures w14:val="standardContextual"/>
         </w:rPr>
       </w:pPr>
-      <w:hyperlink w:anchor="_Toc242290408" w:history="1">
+      <w:hyperlink w:anchor="_Toc242339635" w:history="1">
         <w:r>
           <w:rPr>
             <w:rStyle w:val="Hyperlink"/>
@@ -2649,7 +2649,7 @@
             <w:noProof/>
             <w:webHidden/>
           </w:rPr>
-          <w:instrText xml:space="preserve"> PAGEREF _Toc242290408 \h </w:instrText>
+          <w:instrText xml:space="preserve"> PAGEREF _Toc242339635 \h </w:instrText>
         </w:r>
         <w:r>
           <w:rPr>
@@ -2695,7 +2695,7 @@
           <w14:ligatures w14:val="standardContextual"/>
         </w:rPr>
       </w:pPr>
-      <w:hyperlink w:anchor="_Toc242290409" w:history="1">
+      <w:hyperlink w:anchor="_Toc242339636" w:history="1">
         <w:r>
           <w:rPr>
             <w:rStyle w:val="Hyperlink"/>
@@ -2722,7 +2722,7 @@
             <w:noProof/>
             <w:webHidden/>
           </w:rPr>
-          <w:instrText xml:space="preserve"> PAGEREF _Toc242290409 \h </w:instrText>
+          <w:instrText xml:space="preserve"> PAGEREF _Toc242339636 \h </w:instrText>
         </w:r>
         <w:r>
           <w:rPr>
@@ -2767,7 +2767,7 @@
       <w:pPr>
         <w:pStyle w:val="Heading1"/>
       </w:pPr>
-      <w:bookmarkStart w:id="0" w:name="_Toc242290378"/>
+      <w:bookmarkStart w:id="0" w:name="_Toc242339605"/>
       <w:r>
         <w:lastRenderedPageBreak/>
         <w:t>1. Información general del producto</w:t>
@@ -3355,7 +3355,7 @@
         <w:pStyle w:val="Heading1"/>
         <w:pageBreakBefore/>
       </w:pPr>
-      <w:bookmarkStart w:id="1" w:name="_Toc242290379"/>
+      <w:bookmarkStart w:id="1" w:name="_Toc242339606"/>
       <w:r>
         <w:lastRenderedPageBreak/>
         <w:t>2. Descripción general del software</w:t>
@@ -3376,7 +3376,7 @@
       <w:pPr>
         <w:pStyle w:val="Heading2"/>
       </w:pPr>
-      <w:bookmarkStart w:id="2" w:name="_Toc242290380"/>
+      <w:bookmarkStart w:id="2" w:name="_Toc242339607"/>
       <w:r>
         <w:t>2.1 Requisitos de hardware y software</w:t>
       </w:r>
@@ -3391,7 +3391,7 @@
       <w:pPr>
         <w:pStyle w:val="Heading2"/>
       </w:pPr>
-      <w:bookmarkStart w:id="3" w:name="_Toc242290381"/>
+      <w:bookmarkStart w:id="3" w:name="_Toc242339608"/>
       <w:r>
         <w:t>2.2 Justificación de los requisitos</w:t>
       </w:r>
@@ -3407,7 +3407,7 @@
         <w:pStyle w:val="Heading1"/>
         <w:pageBreakBefore/>
       </w:pPr>
-      <w:bookmarkStart w:id="4" w:name="_Toc242290382"/>
+      <w:bookmarkStart w:id="4" w:name="_Toc242339609"/>
       <w:r>
         <w:lastRenderedPageBreak/>
         <w:t>3. Objetivos y área de aplicación</w:t>
@@ -3418,7 +3418,7 @@
       <w:pPr>
         <w:pStyle w:val="Heading2"/>
       </w:pPr>
-      <w:bookmarkStart w:id="5" w:name="_Toc242290383"/>
+      <w:bookmarkStart w:id="5" w:name="_Toc242339610"/>
       <w:r>
         <w:t>3.1 Objetivo general</w:t>
       </w:r>
@@ -3433,7 +3433,7 @@
       <w:pPr>
         <w:pStyle w:val="Heading2"/>
       </w:pPr>
-      <w:bookmarkStart w:id="6" w:name="_Toc242290384"/>
+      <w:bookmarkStart w:id="6" w:name="_Toc242339611"/>
       <w:r>
         <w:t>3.2 Área de aplicación</w:t>
       </w:r>
@@ -3449,7 +3449,7 @@
         <w:pStyle w:val="Heading1"/>
         <w:pageBreakBefore/>
       </w:pPr>
-      <w:bookmarkStart w:id="7" w:name="_Toc242290385"/>
+      <w:bookmarkStart w:id="7" w:name="_Toc242339612"/>
       <w:r>
         <w:lastRenderedPageBreak/>
         <w:t>4. Funcionalidades principales</w:t>
@@ -3471,7 +3471,7 @@
         <w:pStyle w:val="Heading1"/>
         <w:pageBreakBefore/>
       </w:pPr>
-      <w:bookmarkStart w:id="8" w:name="_Toc242290386"/>
+      <w:bookmarkStart w:id="8" w:name="_Toc242339613"/>
       <w:r>
         <w:lastRenderedPageBreak/>
         <w:t>5. Adaptabilidad extensibilidad y mantenibilidad</w:t>
@@ -3493,7 +3493,7 @@
         <w:pStyle w:val="Heading1"/>
         <w:pageBreakBefore/>
       </w:pPr>
-      <w:bookmarkStart w:id="9" w:name="_Toc242290387"/>
+      <w:bookmarkStart w:id="9" w:name="_Toc242339614"/>
       <w:r>
         <w:lastRenderedPageBreak/>
         <w:t>6. Robustez desempeño y consistencia</w:t>
@@ -3504,7 +3504,7 @@
       <w:pPr>
         <w:pStyle w:val="Heading2"/>
       </w:pPr>
-      <w:bookmarkStart w:id="10" w:name="_Toc242290388"/>
+      <w:bookmarkStart w:id="10" w:name="_Toc242339615"/>
       <w:r>
         <w:t>6.1 Robustez</w:t>
       </w:r>
@@ -3519,7 +3519,7 @@
       <w:pPr>
         <w:pStyle w:val="Heading2"/>
       </w:pPr>
-      <w:bookmarkStart w:id="11" w:name="_Toc242290389"/>
+      <w:bookmarkStart w:id="11" w:name="_Toc242339616"/>
       <w:r>
         <w:t>6.2 Desempeño</w:t>
       </w:r>
@@ -3534,7 +3534,7 @@
       <w:pPr>
         <w:pStyle w:val="Heading2"/>
       </w:pPr>
-      <w:bookmarkStart w:id="12" w:name="_Toc242290390"/>
+      <w:bookmarkStart w:id="12" w:name="_Toc242339617"/>
       <w:r>
         <w:t>6.3 Consistencia y reproducibilidad</w:t>
       </w:r>
@@ -3550,7 +3550,7 @@
         <w:pStyle w:val="Heading1"/>
         <w:pageBreakBefore/>
       </w:pPr>
-      <w:bookmarkStart w:id="13" w:name="_Toc242290391"/>
+      <w:bookmarkStart w:id="13" w:name="_Toc242339618"/>
       <w:r>
         <w:lastRenderedPageBreak/>
         <w:t>7. Interfaz y usabilidad</w:t>
@@ -3567,7 +3567,7 @@
         <w:pStyle w:val="Heading1"/>
         <w:pageBreakBefore/>
       </w:pPr>
-      <w:bookmarkStart w:id="14" w:name="_Toc242290392"/>
+      <w:bookmarkStart w:id="14" w:name="_Toc242339619"/>
       <w:r>
         <w:lastRenderedPageBreak/>
         <w:t>8. Integridad y seguridad de la información</w:t>
@@ -3589,7 +3589,7 @@
         <w:pStyle w:val="Heading1"/>
         <w:pageBreakBefore/>
       </w:pPr>
-      <w:bookmarkStart w:id="15" w:name="_Toc242290393"/>
+      <w:bookmarkStart w:id="15" w:name="_Toc242339620"/>
       <w:r>
         <w:lastRenderedPageBreak/>
         <w:t>9. Portabilidad y compatibilidad</w:t>
@@ -3600,7 +3600,7 @@
       <w:pPr>
         <w:pStyle w:val="Heading2"/>
       </w:pPr>
-      <w:bookmarkStart w:id="16" w:name="_Toc242290394"/>
+      <w:bookmarkStart w:id="16" w:name="_Toc242339621"/>
       <w:r>
         <w:t>9.1 Plataformas compatibles</w:t>
       </w:r>
@@ -3615,7 +3615,7 @@
       <w:pPr>
         <w:pStyle w:val="Heading2"/>
       </w:pPr>
-      <w:bookmarkStart w:id="17" w:name="_Toc242290395"/>
+      <w:bookmarkStart w:id="17" w:name="_Toc242339622"/>
       <w:r>
         <w:t>9.2 Dependencias relevantes</w:t>
       </w:r>
@@ -3630,7 +3630,7 @@
       <w:pPr>
         <w:pStyle w:val="Heading2"/>
       </w:pPr>
-      <w:bookmarkStart w:id="18" w:name="_Toc242290396"/>
+      <w:bookmarkStart w:id="18" w:name="_Toc242339623"/>
       <w:r>
         <w:t>9.3 Portabilidad de resultados</w:t>
       </w:r>
@@ -3646,7 +3646,7 @@
         <w:pStyle w:val="Heading1"/>
         <w:pageBreakBefore/>
       </w:pPr>
-      <w:bookmarkStart w:id="19" w:name="_Toc242290397"/>
+      <w:bookmarkStart w:id="19" w:name="_Toc242339624"/>
       <w:r>
         <w:lastRenderedPageBreak/>
         <w:t>10. Documentación y soporte técnico</w:t>
@@ -3655,7 +3655,7 @@
     </w:p>
     <w:p>
       <w:r>
-        <w:t>La entrega incluye manual de usuario ilustrado, manual técnico, metodología científica, descripción del software y título/funciones en Word. Entregables reúne estos cinco DOCX, las fuentes ZIP, el EXE con sus dependencias y el paquete portátil.</w:t>
+        <w:t>La entrega incluye manual de usuario ilustrado, manual técnico, metodología científica, descripción del software y título/funciones en Word. Entregables contiene únicamente estos cinco DOCX, el ZIP de fuentes y el ZIP portátil. El ZIP portátil incluye el EXE con sus dependencias. Se extrae fuera de Entregables para ejecutar el programa.</w:t>
       </w:r>
     </w:p>
     <w:p>
@@ -3668,7 +3668,7 @@
         <w:pStyle w:val="Heading1"/>
         <w:pageBreakBefore/>
       </w:pPr>
-      <w:bookmarkStart w:id="20" w:name="_Toc242290398"/>
+      <w:bookmarkStart w:id="20" w:name="_Toc242339625"/>
       <w:r>
         <w:lastRenderedPageBreak/>
         <w:t>11. Pruebas validación y desempeño</w:t>
@@ -3690,7 +3690,7 @@
         <w:pStyle w:val="Heading1"/>
         <w:pageBreakBefore/>
       </w:pPr>
-      <w:bookmarkStart w:id="21" w:name="_Toc242290399"/>
+      <w:bookmarkStart w:id="21" w:name="_Toc242339626"/>
       <w:r>
         <w:lastRenderedPageBreak/>
         <w:t>12. Impacto y utilización</w:t>
@@ -3701,7 +3701,7 @@
       <w:pPr>
         <w:pStyle w:val="Heading2"/>
       </w:pPr>
-      <w:bookmarkStart w:id="22" w:name="_Toc242290400"/>
+      <w:bookmarkStart w:id="22" w:name="_Toc242339627"/>
       <w:r>
         <w:t>12.1 Docencia</w:t>
       </w:r>
@@ -3716,7 +3716,7 @@
       <w:pPr>
         <w:pStyle w:val="Heading2"/>
       </w:pPr>
-      <w:bookmarkStart w:id="23" w:name="_Toc242290401"/>
+      <w:bookmarkStart w:id="23" w:name="_Toc242339628"/>
       <w:r>
         <w:t>12.2 Investigación</w:t>
       </w:r>
@@ -3731,7 +3731,7 @@
       <w:pPr>
         <w:pStyle w:val="Heading2"/>
       </w:pPr>
-      <w:bookmarkStart w:id="24" w:name="_Toc242290402"/>
+      <w:bookmarkStart w:id="24" w:name="_Toc242339629"/>
       <w:r>
         <w:t>12.3 Extensión y usuarios</w:t>
       </w:r>
@@ -3747,7 +3747,7 @@
         <w:pStyle w:val="Heading1"/>
         <w:pageBreakBefore/>
       </w:pPr>
-      <w:bookmarkStart w:id="25" w:name="_Toc242290403"/>
+      <w:bookmarkStart w:id="25" w:name="_Toc242339630"/>
       <w:r>
         <w:lastRenderedPageBreak/>
         <w:t>13. Contribución al estado del arte</w:t>
@@ -3758,7 +3758,7 @@
       <w:pPr>
         <w:pStyle w:val="Heading2"/>
       </w:pPr>
-      <w:bookmarkStart w:id="26" w:name="_Toc242290404"/>
+      <w:bookmarkStart w:id="26" w:name="_Toc242339631"/>
       <w:r>
         <w:t>13.1 Problema abordado</w:t>
       </w:r>
@@ -3773,7 +3773,7 @@
       <w:pPr>
         <w:pStyle w:val="Heading2"/>
       </w:pPr>
-      <w:bookmarkStart w:id="27" w:name="_Toc242290405"/>
+      <w:bookmarkStart w:id="27" w:name="_Toc242339632"/>
       <w:r>
         <w:t>13.2 Antecedentes y alcance</w:t>
       </w:r>
@@ -3788,7 +3788,7 @@
       <w:pPr>
         <w:pStyle w:val="Heading2"/>
       </w:pPr>
-      <w:bookmarkStart w:id="28" w:name="_Toc242290406"/>
+      <w:bookmarkStart w:id="28" w:name="_Toc242339633"/>
       <w:r>
         <w:t>13.3 Límites y contribución propuesta</w:t>
       </w:r>
@@ -3804,7 +3804,7 @@
         <w:pStyle w:val="Heading1"/>
         <w:pageBreakBefore/>
       </w:pPr>
-      <w:bookmarkStart w:id="29" w:name="_Toc242290407"/>
+      <w:bookmarkStart w:id="29" w:name="_Toc242339634"/>
       <w:r>
         <w:lastRenderedPageBreak/>
         <w:t>14. Aportes y autoría</w:t>
@@ -3821,7 +3821,7 @@
         <w:pStyle w:val="Heading1"/>
         <w:pageBreakBefore/>
       </w:pPr>
-      <w:bookmarkStart w:id="30" w:name="_Toc242290408"/>
+      <w:bookmarkStart w:id="30" w:name="_Toc242339635"/>
       <w:r>
         <w:lastRenderedPageBreak/>
         <w:t>Referencias</w:t>
@@ -3854,7 +3854,7 @@
       <w:pPr>
         <w:pStyle w:val="Heading2"/>
       </w:pPr>
-      <w:bookmarkStart w:id="31" w:name="_Toc242290409"/>
+      <w:bookmarkStart w:id="31" w:name="_Toc242339636"/>
       <w:r>
         <w:t>Autoría y condiciones de uso</w:t>
       </w:r>
@@ -4747,7 +4747,7 @@
     <w:link w:val="HeaderChar"/>
     <w:uiPriority w:val="99"/>
     <w:unhideWhenUsed/>
-    <w:rsid w:val="001D0602"/>
+    <w:rsid w:val="00DA23AD"/>
     <w:pPr>
       <w:tabs>
         <w:tab w:val="center" w:pos="4680"/>
@@ -4760,7 +4760,7 @@
     <w:basedOn w:val="DefaultParagraphFont"/>
     <w:link w:val="Header"/>
     <w:uiPriority w:val="99"/>
-    <w:rsid w:val="001D0602"/>
+    <w:rsid w:val="00DA23AD"/>
   </w:style>
   <w:style w:type="paragraph" w:styleId="Footer">
     <w:name w:val="footer"/>
@@ -4768,7 +4768,7 @@
     <w:link w:val="FooterChar"/>
     <w:uiPriority w:val="99"/>
     <w:unhideWhenUsed/>
-    <w:rsid w:val="001D0602"/>
+    <w:rsid w:val="00DA23AD"/>
     <w:pPr>
       <w:tabs>
         <w:tab w:val="center" w:pos="4680"/>
@@ -4781,7 +4781,7 @@
     <w:basedOn w:val="DefaultParagraphFont"/>
     <w:link w:val="Footer"/>
     <w:uiPriority w:val="99"/>
-    <w:rsid w:val="001D0602"/>
+    <w:rsid w:val="00DA23AD"/>
   </w:style>
 </w:styles>
 </file>

</xml_diff>

<commit_message>
Integrate scientific methodology into technical manual
</commit_message>
<xml_diff>
--- a/docs/docx/Descripcion_del_Software_BikeEnergyLab_1.0.0.docx
+++ b/docs/docx/Descripcion_del_Software_BikeEnergyLab_1.0.0.docx
@@ -261,7 +261,7 @@
                 <w:sz w:val="19"/>
                 <w:szCs w:val="19"/>
               </w:rPr>
-              <w:t>7 de octubre de 2026</w:t>
+              <w:t>8 de octubre de 2026</w:t>
             </w:r>
           </w:p>
         </w:tc>
@@ -323,7 +323,7 @@
                 <w:sz w:val="19"/>
                 <w:szCs w:val="19"/>
               </w:rPr>
-              <w:t>Revisión de entrega del 8 de octubre de 2026</w:t>
+              <w:t>Integración documental del 8 de octubre de 2026</w:t>
             </w:r>
           </w:p>
         </w:tc>
@@ -432,7 +432,7 @@
       <w:r>
         <w:fldChar w:fldCharType="separate"/>
       </w:r>
-      <w:hyperlink w:anchor="_Toc242339605" w:history="1">
+      <w:hyperlink w:anchor="_Toc242341080" w:history="1">
         <w:r>
           <w:rPr>
             <w:rStyle w:val="Hyperlink"/>
@@ -459,7 +459,7 @@
             <w:noProof/>
             <w:webHidden/>
           </w:rPr>
-          <w:instrText xml:space="preserve"> PAGEREF _Toc242339605 \h </w:instrText>
+          <w:instrText xml:space="preserve"> PAGEREF _Toc242341080 \h </w:instrText>
         </w:r>
         <w:r>
           <w:rPr>
@@ -505,7 +505,7 @@
           <w14:ligatures w14:val="standardContextual"/>
         </w:rPr>
       </w:pPr>
-      <w:hyperlink w:anchor="_Toc242339606" w:history="1">
+      <w:hyperlink w:anchor="_Toc242341081" w:history="1">
         <w:r>
           <w:rPr>
             <w:rStyle w:val="Hyperlink"/>
@@ -532,7 +532,7 @@
             <w:noProof/>
             <w:webHidden/>
           </w:rPr>
-          <w:instrText xml:space="preserve"> PAGEREF _Toc242339606 \h </w:instrText>
+          <w:instrText xml:space="preserve"> PAGEREF _Toc242341081 \h </w:instrText>
         </w:r>
         <w:r>
           <w:rPr>
@@ -578,7 +578,7 @@
           <w14:ligatures w14:val="standardContextual"/>
         </w:rPr>
       </w:pPr>
-      <w:hyperlink w:anchor="_Toc242339607" w:history="1">
+      <w:hyperlink w:anchor="_Toc242341082" w:history="1">
         <w:r>
           <w:rPr>
             <w:rStyle w:val="Hyperlink"/>
@@ -605,7 +605,7 @@
             <w:noProof/>
             <w:webHidden/>
           </w:rPr>
-          <w:instrText xml:space="preserve"> PAGEREF _Toc242339607 \h </w:instrText>
+          <w:instrText xml:space="preserve"> PAGEREF _Toc242341082 \h </w:instrText>
         </w:r>
         <w:r>
           <w:rPr>
@@ -651,7 +651,7 @@
           <w14:ligatures w14:val="standardContextual"/>
         </w:rPr>
       </w:pPr>
-      <w:hyperlink w:anchor="_Toc242339608" w:history="1">
+      <w:hyperlink w:anchor="_Toc242341083" w:history="1">
         <w:r>
           <w:rPr>
             <w:rStyle w:val="Hyperlink"/>
@@ -678,7 +678,7 @@
             <w:noProof/>
             <w:webHidden/>
           </w:rPr>
-          <w:instrText xml:space="preserve"> PAGEREF _Toc242339608 \h </w:instrText>
+          <w:instrText xml:space="preserve"> PAGEREF _Toc242341083 \h </w:instrText>
         </w:r>
         <w:r>
           <w:rPr>
@@ -724,7 +724,7 @@
           <w14:ligatures w14:val="standardContextual"/>
         </w:rPr>
       </w:pPr>
-      <w:hyperlink w:anchor="_Toc242339609" w:history="1">
+      <w:hyperlink w:anchor="_Toc242341084" w:history="1">
         <w:r>
           <w:rPr>
             <w:rStyle w:val="Hyperlink"/>
@@ -751,7 +751,7 @@
             <w:noProof/>
             <w:webHidden/>
           </w:rPr>
-          <w:instrText xml:space="preserve"> PAGEREF _Toc242339609 \h </w:instrText>
+          <w:instrText xml:space="preserve"> PAGEREF _Toc242341084 \h </w:instrText>
         </w:r>
         <w:r>
           <w:rPr>
@@ -797,7 +797,7 @@
           <w14:ligatures w14:val="standardContextual"/>
         </w:rPr>
       </w:pPr>
-      <w:hyperlink w:anchor="_Toc242339610" w:history="1">
+      <w:hyperlink w:anchor="_Toc242341085" w:history="1">
         <w:r>
           <w:rPr>
             <w:rStyle w:val="Hyperlink"/>
@@ -824,7 +824,7 @@
             <w:noProof/>
             <w:webHidden/>
           </w:rPr>
-          <w:instrText xml:space="preserve"> PAGEREF _Toc242339610 \h </w:instrText>
+          <w:instrText xml:space="preserve"> PAGEREF _Toc242341085 \h </w:instrText>
         </w:r>
         <w:r>
           <w:rPr>
@@ -870,7 +870,7 @@
           <w14:ligatures w14:val="standardContextual"/>
         </w:rPr>
       </w:pPr>
-      <w:hyperlink w:anchor="_Toc242339611" w:history="1">
+      <w:hyperlink w:anchor="_Toc242341086" w:history="1">
         <w:r>
           <w:rPr>
             <w:rStyle w:val="Hyperlink"/>
@@ -897,7 +897,7 @@
             <w:noProof/>
             <w:webHidden/>
           </w:rPr>
-          <w:instrText xml:space="preserve"> PAGEREF _Toc242339611 \h </w:instrText>
+          <w:instrText xml:space="preserve"> PAGEREF _Toc242341086 \h </w:instrText>
         </w:r>
         <w:r>
           <w:rPr>
@@ -943,7 +943,7 @@
           <w14:ligatures w14:val="standardContextual"/>
         </w:rPr>
       </w:pPr>
-      <w:hyperlink w:anchor="_Toc242339612" w:history="1">
+      <w:hyperlink w:anchor="_Toc242341087" w:history="1">
         <w:r>
           <w:rPr>
             <w:rStyle w:val="Hyperlink"/>
@@ -970,7 +970,80 @@
             <w:noProof/>
             <w:webHidden/>
           </w:rPr>
-          <w:instrText xml:space="preserve"> PAGEREF _Toc242339612 \h </w:instrText>
+          <w:instrText xml:space="preserve"> PAGEREF _Toc242341087 \h </w:instrText>
+        </w:r>
+        <w:r>
+          <w:rPr>
+            <w:noProof/>
+            <w:webHidden/>
+          </w:rPr>
+        </w:r>
+        <w:r>
+          <w:rPr>
+            <w:noProof/>
+            <w:webHidden/>
+          </w:rPr>
+          <w:fldChar w:fldCharType="separate"/>
+        </w:r>
+        <w:r>
+          <w:rPr>
+            <w:noProof/>
+            <w:webHidden/>
+          </w:rPr>
+          <w:t>6</w:t>
+        </w:r>
+        <w:r>
+          <w:rPr>
+            <w:noProof/>
+            <w:webHidden/>
+          </w:rPr>
+          <w:fldChar w:fldCharType="end"/>
+        </w:r>
+      </w:hyperlink>
+    </w:p>
+    <w:p>
+      <w:pPr>
+        <w:pStyle w:val="TOC2"/>
+        <w:tabs>
+          <w:tab w:val="right" w:leader="dot" w:pos="9630"/>
+        </w:tabs>
+        <w:rPr>
+          <w:rFonts w:asciiTheme="minorHAnsi" w:eastAsiaTheme="minorEastAsia" w:hAnsiTheme="minorHAnsi" w:cstheme="minorBidi"/>
+          <w:noProof/>
+          <w:kern w:val="2"/>
+          <w:sz w:val="24"/>
+          <w:szCs w:val="24"/>
+          <w14:ligatures w14:val="standardContextual"/>
+        </w:rPr>
+      </w:pPr>
+      <w:hyperlink w:anchor="_Toc242341088" w:history="1">
+        <w:r>
+          <w:rPr>
+            <w:rStyle w:val="Hyperlink"/>
+            <w:noProof/>
+          </w:rPr>
+          <w:t>4.1 Fundamento científico y alcance del método</w:t>
+        </w:r>
+        <w:r>
+          <w:rPr>
+            <w:noProof/>
+            <w:webHidden/>
+          </w:rPr>
+          <w:tab/>
+        </w:r>
+        <w:r>
+          <w:rPr>
+            <w:noProof/>
+            <w:webHidden/>
+          </w:rPr>
+          <w:fldChar w:fldCharType="begin"/>
+        </w:r>
+        <w:r>
+          <w:rPr>
+            <w:noProof/>
+            <w:webHidden/>
+          </w:rPr>
+          <w:instrText xml:space="preserve"> PAGEREF _Toc242341088 \h </w:instrText>
         </w:r>
         <w:r>
           <w:rPr>
@@ -1016,7 +1089,7 @@
           <w14:ligatures w14:val="standardContextual"/>
         </w:rPr>
       </w:pPr>
-      <w:hyperlink w:anchor="_Toc242339613" w:history="1">
+      <w:hyperlink w:anchor="_Toc242341089" w:history="1">
         <w:r>
           <w:rPr>
             <w:rStyle w:val="Hyperlink"/>
@@ -1043,7 +1116,7 @@
             <w:noProof/>
             <w:webHidden/>
           </w:rPr>
-          <w:instrText xml:space="preserve"> PAGEREF _Toc242339613 \h </w:instrText>
+          <w:instrText xml:space="preserve"> PAGEREF _Toc242341089 \h </w:instrText>
         </w:r>
         <w:r>
           <w:rPr>
@@ -1089,7 +1162,7 @@
           <w14:ligatures w14:val="standardContextual"/>
         </w:rPr>
       </w:pPr>
-      <w:hyperlink w:anchor="_Toc242339614" w:history="1">
+      <w:hyperlink w:anchor="_Toc242341090" w:history="1">
         <w:r>
           <w:rPr>
             <w:rStyle w:val="Hyperlink"/>
@@ -1116,7 +1189,7 @@
             <w:noProof/>
             <w:webHidden/>
           </w:rPr>
-          <w:instrText xml:space="preserve"> PAGEREF _Toc242339614 \h </w:instrText>
+          <w:instrText xml:space="preserve"> PAGEREF _Toc242341090 \h </w:instrText>
         </w:r>
         <w:r>
           <w:rPr>
@@ -1162,7 +1235,7 @@
           <w14:ligatures w14:val="standardContextual"/>
         </w:rPr>
       </w:pPr>
-      <w:hyperlink w:anchor="_Toc242339615" w:history="1">
+      <w:hyperlink w:anchor="_Toc242341091" w:history="1">
         <w:r>
           <w:rPr>
             <w:rStyle w:val="Hyperlink"/>
@@ -1189,7 +1262,7 @@
             <w:noProof/>
             <w:webHidden/>
           </w:rPr>
-          <w:instrText xml:space="preserve"> PAGEREF _Toc242339615 \h </w:instrText>
+          <w:instrText xml:space="preserve"> PAGEREF _Toc242341091 \h </w:instrText>
         </w:r>
         <w:r>
           <w:rPr>
@@ -1235,7 +1308,7 @@
           <w14:ligatures w14:val="standardContextual"/>
         </w:rPr>
       </w:pPr>
-      <w:hyperlink w:anchor="_Toc242339616" w:history="1">
+      <w:hyperlink w:anchor="_Toc242341092" w:history="1">
         <w:r>
           <w:rPr>
             <w:rStyle w:val="Hyperlink"/>
@@ -1262,7 +1335,7 @@
             <w:noProof/>
             <w:webHidden/>
           </w:rPr>
-          <w:instrText xml:space="preserve"> PAGEREF _Toc242339616 \h </w:instrText>
+          <w:instrText xml:space="preserve"> PAGEREF _Toc242341092 \h </w:instrText>
         </w:r>
         <w:r>
           <w:rPr>
@@ -1308,7 +1381,7 @@
           <w14:ligatures w14:val="standardContextual"/>
         </w:rPr>
       </w:pPr>
-      <w:hyperlink w:anchor="_Toc242339617" w:history="1">
+      <w:hyperlink w:anchor="_Toc242341093" w:history="1">
         <w:r>
           <w:rPr>
             <w:rStyle w:val="Hyperlink"/>
@@ -1335,7 +1408,7 @@
             <w:noProof/>
             <w:webHidden/>
           </w:rPr>
-          <w:instrText xml:space="preserve"> PAGEREF _Toc242339617 \h </w:instrText>
+          <w:instrText xml:space="preserve"> PAGEREF _Toc242341093 \h </w:instrText>
         </w:r>
         <w:r>
           <w:rPr>
@@ -1381,7 +1454,7 @@
           <w14:ligatures w14:val="standardContextual"/>
         </w:rPr>
       </w:pPr>
-      <w:hyperlink w:anchor="_Toc242339618" w:history="1">
+      <w:hyperlink w:anchor="_Toc242341094" w:history="1">
         <w:r>
           <w:rPr>
             <w:rStyle w:val="Hyperlink"/>
@@ -1408,7 +1481,7 @@
             <w:noProof/>
             <w:webHidden/>
           </w:rPr>
-          <w:instrText xml:space="preserve"> PAGEREF _Toc242339618 \h </w:instrText>
+          <w:instrText xml:space="preserve"> PAGEREF _Toc242341094 \h </w:instrText>
         </w:r>
         <w:r>
           <w:rPr>
@@ -1454,7 +1527,7 @@
           <w14:ligatures w14:val="standardContextual"/>
         </w:rPr>
       </w:pPr>
-      <w:hyperlink w:anchor="_Toc242339619" w:history="1">
+      <w:hyperlink w:anchor="_Toc242341095" w:history="1">
         <w:r>
           <w:rPr>
             <w:rStyle w:val="Hyperlink"/>
@@ -1481,7 +1554,7 @@
             <w:noProof/>
             <w:webHidden/>
           </w:rPr>
-          <w:instrText xml:space="preserve"> PAGEREF _Toc242339619 \h </w:instrText>
+          <w:instrText xml:space="preserve"> PAGEREF _Toc242341095 \h </w:instrText>
         </w:r>
         <w:r>
           <w:rPr>
@@ -1527,7 +1600,7 @@
           <w14:ligatures w14:val="standardContextual"/>
         </w:rPr>
       </w:pPr>
-      <w:hyperlink w:anchor="_Toc242339620" w:history="1">
+      <w:hyperlink w:anchor="_Toc242341096" w:history="1">
         <w:r>
           <w:rPr>
             <w:rStyle w:val="Hyperlink"/>
@@ -1554,7 +1627,7 @@
             <w:noProof/>
             <w:webHidden/>
           </w:rPr>
-          <w:instrText xml:space="preserve"> PAGEREF _Toc242339620 \h </w:instrText>
+          <w:instrText xml:space="preserve"> PAGEREF _Toc242341096 \h </w:instrText>
         </w:r>
         <w:r>
           <w:rPr>
@@ -1600,7 +1673,7 @@
           <w14:ligatures w14:val="standardContextual"/>
         </w:rPr>
       </w:pPr>
-      <w:hyperlink w:anchor="_Toc242339621" w:history="1">
+      <w:hyperlink w:anchor="_Toc242341097" w:history="1">
         <w:r>
           <w:rPr>
             <w:rStyle w:val="Hyperlink"/>
@@ -1627,7 +1700,7 @@
             <w:noProof/>
             <w:webHidden/>
           </w:rPr>
-          <w:instrText xml:space="preserve"> PAGEREF _Toc242339621 \h </w:instrText>
+          <w:instrText xml:space="preserve"> PAGEREF _Toc242341097 \h </w:instrText>
         </w:r>
         <w:r>
           <w:rPr>
@@ -1673,7 +1746,7 @@
           <w14:ligatures w14:val="standardContextual"/>
         </w:rPr>
       </w:pPr>
-      <w:hyperlink w:anchor="_Toc242339622" w:history="1">
+      <w:hyperlink w:anchor="_Toc242341098" w:history="1">
         <w:r>
           <w:rPr>
             <w:rStyle w:val="Hyperlink"/>
@@ -1700,7 +1773,7 @@
             <w:noProof/>
             <w:webHidden/>
           </w:rPr>
-          <w:instrText xml:space="preserve"> PAGEREF _Toc242339622 \h </w:instrText>
+          <w:instrText xml:space="preserve"> PAGEREF _Toc242341098 \h </w:instrText>
         </w:r>
         <w:r>
           <w:rPr>
@@ -1746,7 +1819,7 @@
           <w14:ligatures w14:val="standardContextual"/>
         </w:rPr>
       </w:pPr>
-      <w:hyperlink w:anchor="_Toc242339623" w:history="1">
+      <w:hyperlink w:anchor="_Toc242341099" w:history="1">
         <w:r>
           <w:rPr>
             <w:rStyle w:val="Hyperlink"/>
@@ -1773,7 +1846,7 @@
             <w:noProof/>
             <w:webHidden/>
           </w:rPr>
-          <w:instrText xml:space="preserve"> PAGEREF _Toc242339623 \h </w:instrText>
+          <w:instrText xml:space="preserve"> PAGEREF _Toc242341099 \h </w:instrText>
         </w:r>
         <w:r>
           <w:rPr>
@@ -1819,7 +1892,7 @@
           <w14:ligatures w14:val="standardContextual"/>
         </w:rPr>
       </w:pPr>
-      <w:hyperlink w:anchor="_Toc242339624" w:history="1">
+      <w:hyperlink w:anchor="_Toc242341100" w:history="1">
         <w:r>
           <w:rPr>
             <w:rStyle w:val="Hyperlink"/>
@@ -1846,7 +1919,7 @@
             <w:noProof/>
             <w:webHidden/>
           </w:rPr>
-          <w:instrText xml:space="preserve"> PAGEREF _Toc242339624 \h </w:instrText>
+          <w:instrText xml:space="preserve"> PAGEREF _Toc242341100 \h </w:instrText>
         </w:r>
         <w:r>
           <w:rPr>
@@ -1892,7 +1965,7 @@
           <w14:ligatures w14:val="standardContextual"/>
         </w:rPr>
       </w:pPr>
-      <w:hyperlink w:anchor="_Toc242339625" w:history="1">
+      <w:hyperlink w:anchor="_Toc242341101" w:history="1">
         <w:r>
           <w:rPr>
             <w:rStyle w:val="Hyperlink"/>
@@ -1919,7 +1992,7 @@
             <w:noProof/>
             <w:webHidden/>
           </w:rPr>
-          <w:instrText xml:space="preserve"> PAGEREF _Toc242339625 \h </w:instrText>
+          <w:instrText xml:space="preserve"> PAGEREF _Toc242341101 \h </w:instrText>
         </w:r>
         <w:r>
           <w:rPr>
@@ -1965,7 +2038,7 @@
           <w14:ligatures w14:val="standardContextual"/>
         </w:rPr>
       </w:pPr>
-      <w:hyperlink w:anchor="_Toc242339626" w:history="1">
+      <w:hyperlink w:anchor="_Toc242341102" w:history="1">
         <w:r>
           <w:rPr>
             <w:rStyle w:val="Hyperlink"/>
@@ -1992,7 +2065,7 @@
             <w:noProof/>
             <w:webHidden/>
           </w:rPr>
-          <w:instrText xml:space="preserve"> PAGEREF _Toc242339626 \h </w:instrText>
+          <w:instrText xml:space="preserve"> PAGEREF _Toc242341102 \h </w:instrText>
         </w:r>
         <w:r>
           <w:rPr>
@@ -2038,7 +2111,7 @@
           <w14:ligatures w14:val="standardContextual"/>
         </w:rPr>
       </w:pPr>
-      <w:hyperlink w:anchor="_Toc242339627" w:history="1">
+      <w:hyperlink w:anchor="_Toc242341103" w:history="1">
         <w:r>
           <w:rPr>
             <w:rStyle w:val="Hyperlink"/>
@@ -2065,7 +2138,7 @@
             <w:noProof/>
             <w:webHidden/>
           </w:rPr>
-          <w:instrText xml:space="preserve"> PAGEREF _Toc242339627 \h </w:instrText>
+          <w:instrText xml:space="preserve"> PAGEREF _Toc242341103 \h </w:instrText>
         </w:r>
         <w:r>
           <w:rPr>
@@ -2111,7 +2184,7 @@
           <w14:ligatures w14:val="standardContextual"/>
         </w:rPr>
       </w:pPr>
-      <w:hyperlink w:anchor="_Toc242339628" w:history="1">
+      <w:hyperlink w:anchor="_Toc242341104" w:history="1">
         <w:r>
           <w:rPr>
             <w:rStyle w:val="Hyperlink"/>
@@ -2138,7 +2211,7 @@
             <w:noProof/>
             <w:webHidden/>
           </w:rPr>
-          <w:instrText xml:space="preserve"> PAGEREF _Toc242339628 \h </w:instrText>
+          <w:instrText xml:space="preserve"> PAGEREF _Toc242341104 \h </w:instrText>
         </w:r>
         <w:r>
           <w:rPr>
@@ -2184,7 +2257,7 @@
           <w14:ligatures w14:val="standardContextual"/>
         </w:rPr>
       </w:pPr>
-      <w:hyperlink w:anchor="_Toc242339629" w:history="1">
+      <w:hyperlink w:anchor="_Toc242341105" w:history="1">
         <w:r>
           <w:rPr>
             <w:rStyle w:val="Hyperlink"/>
@@ -2211,7 +2284,7 @@
             <w:noProof/>
             <w:webHidden/>
           </w:rPr>
-          <w:instrText xml:space="preserve"> PAGEREF _Toc242339629 \h </w:instrText>
+          <w:instrText xml:space="preserve"> PAGEREF _Toc242341105 \h </w:instrText>
         </w:r>
         <w:r>
           <w:rPr>
@@ -2257,7 +2330,7 @@
           <w14:ligatures w14:val="standardContextual"/>
         </w:rPr>
       </w:pPr>
-      <w:hyperlink w:anchor="_Toc242339630" w:history="1">
+      <w:hyperlink w:anchor="_Toc242341106" w:history="1">
         <w:r>
           <w:rPr>
             <w:rStyle w:val="Hyperlink"/>
@@ -2284,7 +2357,7 @@
             <w:noProof/>
             <w:webHidden/>
           </w:rPr>
-          <w:instrText xml:space="preserve"> PAGEREF _Toc242339630 \h </w:instrText>
+          <w:instrText xml:space="preserve"> PAGEREF _Toc242341106 \h </w:instrText>
         </w:r>
         <w:r>
           <w:rPr>
@@ -2330,7 +2403,7 @@
           <w14:ligatures w14:val="standardContextual"/>
         </w:rPr>
       </w:pPr>
-      <w:hyperlink w:anchor="_Toc242339631" w:history="1">
+      <w:hyperlink w:anchor="_Toc242341107" w:history="1">
         <w:r>
           <w:rPr>
             <w:rStyle w:val="Hyperlink"/>
@@ -2357,7 +2430,7 @@
             <w:noProof/>
             <w:webHidden/>
           </w:rPr>
-          <w:instrText xml:space="preserve"> PAGEREF _Toc242339631 \h </w:instrText>
+          <w:instrText xml:space="preserve"> PAGEREF _Toc242341107 \h </w:instrText>
         </w:r>
         <w:r>
           <w:rPr>
@@ -2403,7 +2476,7 @@
           <w14:ligatures w14:val="standardContextual"/>
         </w:rPr>
       </w:pPr>
-      <w:hyperlink w:anchor="_Toc242339632" w:history="1">
+      <w:hyperlink w:anchor="_Toc242341108" w:history="1">
         <w:r>
           <w:rPr>
             <w:rStyle w:val="Hyperlink"/>
@@ -2430,7 +2503,7 @@
             <w:noProof/>
             <w:webHidden/>
           </w:rPr>
-          <w:instrText xml:space="preserve"> PAGEREF _Toc242339632 \h </w:instrText>
+          <w:instrText xml:space="preserve"> PAGEREF _Toc242341108 \h </w:instrText>
         </w:r>
         <w:r>
           <w:rPr>
@@ -2476,7 +2549,7 @@
           <w14:ligatures w14:val="standardContextual"/>
         </w:rPr>
       </w:pPr>
-      <w:hyperlink w:anchor="_Toc242339633" w:history="1">
+      <w:hyperlink w:anchor="_Toc242341109" w:history="1">
         <w:r>
           <w:rPr>
             <w:rStyle w:val="Hyperlink"/>
@@ -2503,7 +2576,7 @@
             <w:noProof/>
             <w:webHidden/>
           </w:rPr>
-          <w:instrText xml:space="preserve"> PAGEREF _Toc242339633 \h </w:instrText>
+          <w:instrText xml:space="preserve"> PAGEREF _Toc242341109 \h </w:instrText>
         </w:r>
         <w:r>
           <w:rPr>
@@ -2549,7 +2622,7 @@
           <w14:ligatures w14:val="standardContextual"/>
         </w:rPr>
       </w:pPr>
-      <w:hyperlink w:anchor="_Toc242339634" w:history="1">
+      <w:hyperlink w:anchor="_Toc242341110" w:history="1">
         <w:r>
           <w:rPr>
             <w:rStyle w:val="Hyperlink"/>
@@ -2576,7 +2649,7 @@
             <w:noProof/>
             <w:webHidden/>
           </w:rPr>
-          <w:instrText xml:space="preserve"> PAGEREF _Toc242339634 \h </w:instrText>
+          <w:instrText xml:space="preserve"> PAGEREF _Toc242341110 \h </w:instrText>
         </w:r>
         <w:r>
           <w:rPr>
@@ -2622,7 +2695,7 @@
           <w14:ligatures w14:val="standardContextual"/>
         </w:rPr>
       </w:pPr>
-      <w:hyperlink w:anchor="_Toc242339635" w:history="1">
+      <w:hyperlink w:anchor="_Toc242341111" w:history="1">
         <w:r>
           <w:rPr>
             <w:rStyle w:val="Hyperlink"/>
@@ -2649,7 +2722,7 @@
             <w:noProof/>
             <w:webHidden/>
           </w:rPr>
-          <w:instrText xml:space="preserve"> PAGEREF _Toc242339635 \h </w:instrText>
+          <w:instrText xml:space="preserve"> PAGEREF _Toc242341111 \h </w:instrText>
         </w:r>
         <w:r>
           <w:rPr>
@@ -2695,7 +2768,7 @@
           <w14:ligatures w14:val="standardContextual"/>
         </w:rPr>
       </w:pPr>
-      <w:hyperlink w:anchor="_Toc242339636" w:history="1">
+      <w:hyperlink w:anchor="_Toc242341112" w:history="1">
         <w:r>
           <w:rPr>
             <w:rStyle w:val="Hyperlink"/>
@@ -2722,7 +2795,7 @@
             <w:noProof/>
             <w:webHidden/>
           </w:rPr>
-          <w:instrText xml:space="preserve"> PAGEREF _Toc242339636 \h </w:instrText>
+          <w:instrText xml:space="preserve"> PAGEREF _Toc242341112 \h </w:instrText>
         </w:r>
         <w:r>
           <w:rPr>
@@ -2767,7 +2840,7 @@
       <w:pPr>
         <w:pStyle w:val="Heading1"/>
       </w:pPr>
-      <w:bookmarkStart w:id="0" w:name="_Toc242339605"/>
+      <w:bookmarkStart w:id="0" w:name="_Toc242341080"/>
       <w:r>
         <w:lastRenderedPageBreak/>
         <w:t>1. Información general del producto</w:t>
@@ -3099,7 +3172,7 @@
                 <w:sz w:val="19"/>
                 <w:szCs w:val="19"/>
               </w:rPr>
-              <w:t>2026, revisión editorial del 7 de octubre</w:t>
+              <w:t>2026, revisión de integración documental del 8 de octubre</w:t>
             </w:r>
           </w:p>
         </w:tc>
@@ -3355,7 +3428,7 @@
         <w:pStyle w:val="Heading1"/>
         <w:pageBreakBefore/>
       </w:pPr>
-      <w:bookmarkStart w:id="1" w:name="_Toc242339606"/>
+      <w:bookmarkStart w:id="1" w:name="_Toc242341081"/>
       <w:r>
         <w:lastRenderedPageBreak/>
         <w:t>2. Descripción general del software</w:t>
@@ -3376,7 +3449,7 @@
       <w:pPr>
         <w:pStyle w:val="Heading2"/>
       </w:pPr>
-      <w:bookmarkStart w:id="2" w:name="_Toc242339607"/>
+      <w:bookmarkStart w:id="2" w:name="_Toc242341082"/>
       <w:r>
         <w:t>2.1 Requisitos de hardware y software</w:t>
       </w:r>
@@ -3391,7 +3464,7 @@
       <w:pPr>
         <w:pStyle w:val="Heading2"/>
       </w:pPr>
-      <w:bookmarkStart w:id="3" w:name="_Toc242339608"/>
+      <w:bookmarkStart w:id="3" w:name="_Toc242341083"/>
       <w:r>
         <w:t>2.2 Justificación de los requisitos</w:t>
       </w:r>
@@ -3407,7 +3480,7 @@
         <w:pStyle w:val="Heading1"/>
         <w:pageBreakBefore/>
       </w:pPr>
-      <w:bookmarkStart w:id="4" w:name="_Toc242339609"/>
+      <w:bookmarkStart w:id="4" w:name="_Toc242341084"/>
       <w:r>
         <w:lastRenderedPageBreak/>
         <w:t>3. Objetivos y área de aplicación</w:t>
@@ -3418,7 +3491,7 @@
       <w:pPr>
         <w:pStyle w:val="Heading2"/>
       </w:pPr>
-      <w:bookmarkStart w:id="5" w:name="_Toc242339610"/>
+      <w:bookmarkStart w:id="5" w:name="_Toc242341085"/>
       <w:r>
         <w:t>3.1 Objetivo general</w:t>
       </w:r>
@@ -3433,7 +3506,7 @@
       <w:pPr>
         <w:pStyle w:val="Heading2"/>
       </w:pPr>
-      <w:bookmarkStart w:id="6" w:name="_Toc242339611"/>
+      <w:bookmarkStart w:id="6" w:name="_Toc242341086"/>
       <w:r>
         <w:t>3.2 Área de aplicación</w:t>
       </w:r>
@@ -3449,7 +3522,7 @@
         <w:pStyle w:val="Heading1"/>
         <w:pageBreakBefore/>
       </w:pPr>
-      <w:bookmarkStart w:id="7" w:name="_Toc242339612"/>
+      <w:bookmarkStart w:id="7" w:name="_Toc242341087"/>
       <w:r>
         <w:lastRenderedPageBreak/>
         <w:t>4. Funcionalidades principales</w:t>
@@ -3468,15 +3541,38 @@
     </w:p>
     <w:p>
       <w:pPr>
+        <w:pStyle w:val="Heading2"/>
+      </w:pPr>
+      <w:bookmarkStart w:id="8" w:name="_Toc242341088"/>
+      <w:r>
+        <w:t>4.1 Fundamento científico y alcance del método</w:t>
+      </w:r>
+      <w:bookmarkEnd w:id="8"/>
+    </w:p>
+    <w:p>
+      <w:r>
+        <w:t>El modelo utiliza dinámica inversa con velocidad longitudinal prescrita. Integra rodadura, gravedad, fuerza aerodinámica con signo y aceleración, transforma la potencia según aporte humano y eficiencias, y calcula energía terminal y estado de carga con límites de batería. La batería admite representación energética y circuito equivalente Thevenin de una rama RC. Los mapas de motor y las curvas térmicas requieren caracterización propia.</w:t>
+      </w:r>
+    </w:p>
+    <w:p>
+      <w:r>
+        <w:t>CGPRA combina física calibrada y regresión de residuos por ruta. Su compuerta pondera la corrección según soporte de datos y dispersión, sin representar una probabilidad de acierto. Los intervalos conformales usan rutas independientes para calibración. Monte Carlo propaga los supuestos configurados y la sensibilidad estudia su influencia. El capítulo 6 del manual técnico desarrolla las 26 ecuaciones editables, y el capítulo 7 conserva protocolos, resultados desfavorables y límites. Los datos sintéticos y la</w:t>
+      </w:r>
+      <w:r>
+        <w:t>s comprobaciones de implementación no demuestran precisión con bicicletas reales.</w:t>
+      </w:r>
+    </w:p>
+    <w:p>
+      <w:pPr>
         <w:pStyle w:val="Heading1"/>
         <w:pageBreakBefore/>
       </w:pPr>
-      <w:bookmarkStart w:id="8" w:name="_Toc242339613"/>
+      <w:bookmarkStart w:id="9" w:name="_Toc242341089"/>
       <w:r>
         <w:lastRenderedPageBreak/>
         <w:t>5. Adaptabilidad extensibilidad y mantenibilidad</w:t>
       </w:r>
-      <w:bookmarkEnd w:id="8"/>
+      <w:bookmarkEnd w:id="9"/>
     </w:p>
     <w:p>
       <w:r>
@@ -3493,22 +3589,22 @@
         <w:pStyle w:val="Heading1"/>
         <w:pageBreakBefore/>
       </w:pPr>
-      <w:bookmarkStart w:id="9" w:name="_Toc242339614"/>
+      <w:bookmarkStart w:id="10" w:name="_Toc242341090"/>
       <w:r>
         <w:lastRenderedPageBreak/>
         <w:t>6. Robustez desempeño y consistencia</w:t>
       </w:r>
-      <w:bookmarkEnd w:id="9"/>
+      <w:bookmarkEnd w:id="10"/>
     </w:p>
     <w:p>
       <w:pPr>
         <w:pStyle w:val="Heading2"/>
       </w:pPr>
-      <w:bookmarkStart w:id="10" w:name="_Toc242339615"/>
+      <w:bookmarkStart w:id="11" w:name="_Toc242341091"/>
       <w:r>
         <w:t>6.1 Robustez</w:t>
       </w:r>
-      <w:bookmarkEnd w:id="10"/>
+      <w:bookmarkEnd w:id="11"/>
     </w:p>
     <w:p>
       <w:r>
@@ -3519,11 +3615,11 @@
       <w:pPr>
         <w:pStyle w:val="Heading2"/>
       </w:pPr>
-      <w:bookmarkStart w:id="11" w:name="_Toc242339616"/>
+      <w:bookmarkStart w:id="12" w:name="_Toc242341092"/>
       <w:r>
         <w:t>6.2 Desempeño</w:t>
       </w:r>
-      <w:bookmarkEnd w:id="11"/>
+      <w:bookmarkEnd w:id="12"/>
     </w:p>
     <w:p>
       <w:r>
@@ -3534,11 +3630,11 @@
       <w:pPr>
         <w:pStyle w:val="Heading2"/>
       </w:pPr>
-      <w:bookmarkStart w:id="12" w:name="_Toc242339617"/>
+      <w:bookmarkStart w:id="13" w:name="_Toc242341093"/>
       <w:r>
         <w:t>6.3 Consistencia y reproducibilidad</w:t>
       </w:r>
-      <w:bookmarkEnd w:id="12"/>
+      <w:bookmarkEnd w:id="13"/>
     </w:p>
     <w:p>
       <w:r>
@@ -3550,12 +3646,12 @@
         <w:pStyle w:val="Heading1"/>
         <w:pageBreakBefore/>
       </w:pPr>
-      <w:bookmarkStart w:id="13" w:name="_Toc242339618"/>
+      <w:bookmarkStart w:id="14" w:name="_Toc242341094"/>
       <w:r>
         <w:lastRenderedPageBreak/>
         <w:t>7. Interfaz y usabilidad</w:t>
       </w:r>
-      <w:bookmarkEnd w:id="13"/>
+      <w:bookmarkEnd w:id="14"/>
     </w:p>
     <w:p>
       <w:r>
@@ -3567,12 +3663,12 @@
         <w:pStyle w:val="Heading1"/>
         <w:pageBreakBefore/>
       </w:pPr>
-      <w:bookmarkStart w:id="14" w:name="_Toc242339619"/>
+      <w:bookmarkStart w:id="15" w:name="_Toc242341095"/>
       <w:r>
         <w:lastRenderedPageBreak/>
         <w:t>8. Integridad y seguridad de la información</w:t>
       </w:r>
-      <w:bookmarkEnd w:id="14"/>
+      <w:bookmarkEnd w:id="15"/>
     </w:p>
     <w:p>
       <w:r>
@@ -3589,22 +3685,22 @@
         <w:pStyle w:val="Heading1"/>
         <w:pageBreakBefore/>
       </w:pPr>
-      <w:bookmarkStart w:id="15" w:name="_Toc242339620"/>
+      <w:bookmarkStart w:id="16" w:name="_Toc242341096"/>
       <w:r>
         <w:lastRenderedPageBreak/>
         <w:t>9. Portabilidad y compatibilidad</w:t>
       </w:r>
-      <w:bookmarkEnd w:id="15"/>
+      <w:bookmarkEnd w:id="16"/>
     </w:p>
     <w:p>
       <w:pPr>
         <w:pStyle w:val="Heading2"/>
       </w:pPr>
-      <w:bookmarkStart w:id="16" w:name="_Toc242339621"/>
+      <w:bookmarkStart w:id="17" w:name="_Toc242341097"/>
       <w:r>
         <w:t>9.1 Plataformas compatibles</w:t>
       </w:r>
-      <w:bookmarkEnd w:id="16"/>
+      <w:bookmarkEnd w:id="17"/>
     </w:p>
     <w:p>
       <w:r>
@@ -3615,11 +3711,11 @@
       <w:pPr>
         <w:pStyle w:val="Heading2"/>
       </w:pPr>
-      <w:bookmarkStart w:id="17" w:name="_Toc242339622"/>
+      <w:bookmarkStart w:id="18" w:name="_Toc242341098"/>
       <w:r>
         <w:t>9.2 Dependencias relevantes</w:t>
       </w:r>
-      <w:bookmarkEnd w:id="17"/>
+      <w:bookmarkEnd w:id="18"/>
     </w:p>
     <w:p>
       <w:r>
@@ -3630,11 +3726,11 @@
       <w:pPr>
         <w:pStyle w:val="Heading2"/>
       </w:pPr>
-      <w:bookmarkStart w:id="18" w:name="_Toc242339623"/>
+      <w:bookmarkStart w:id="19" w:name="_Toc242341099"/>
       <w:r>
         <w:t>9.3 Portabilidad de resultados</w:t>
       </w:r>
-      <w:bookmarkEnd w:id="18"/>
+      <w:bookmarkEnd w:id="19"/>
     </w:p>
     <w:p>
       <w:r>
@@ -3646,16 +3742,16 @@
         <w:pStyle w:val="Heading1"/>
         <w:pageBreakBefore/>
       </w:pPr>
-      <w:bookmarkStart w:id="19" w:name="_Toc242339624"/>
+      <w:bookmarkStart w:id="20" w:name="_Toc242341100"/>
       <w:r>
         <w:lastRenderedPageBreak/>
         <w:t>10. Documentación y soporte técnico</w:t>
       </w:r>
-      <w:bookmarkEnd w:id="19"/>
-    </w:p>
-    <w:p>
-      <w:r>
-        <w:t>La entrega incluye manual de usuario ilustrado, manual técnico, metodología científica, descripción del software y título/funciones en Word. Entregables contiene únicamente estos cinco DOCX, el ZIP de fuentes y el ZIP portátil. El ZIP portátil incluye el EXE con sus dependencias. Se extrae fuera de Entregables para ejecutar el programa.</w:t>
+      <w:bookmarkEnd w:id="20"/>
+    </w:p>
+    <w:p>
+      <w:r>
+        <w:t>La entrega incluye manual de usuario ilustrado, manual técnico con metodología científica, descripción del software y título/funciones en Word. Entregables contiene únicamente estos cuatro DOCX, el ZIP de fuentes y el ZIP portátil. El ZIP portátil incluye el EXE con sus dependencias. Se extrae fuera de Entregables para ejecutar el programa.</w:t>
       </w:r>
     </w:p>
     <w:p>
@@ -3668,12 +3764,12 @@
         <w:pStyle w:val="Heading1"/>
         <w:pageBreakBefore/>
       </w:pPr>
-      <w:bookmarkStart w:id="20" w:name="_Toc242339625"/>
+      <w:bookmarkStart w:id="21" w:name="_Toc242341101"/>
       <w:r>
         <w:lastRenderedPageBreak/>
         <w:t>11. Pruebas validación y desempeño</w:t>
       </w:r>
-      <w:bookmarkEnd w:id="20"/>
+      <w:bookmarkEnd w:id="21"/>
     </w:p>
     <w:p>
       <w:r>
@@ -3682,7 +3778,7 @@
     </w:p>
     <w:p>
       <w:r>
-        <w:t>La evidencia científica histórica conserva su identidad y resultados: M3 tuvo menor CRPS que M4 en el protocolo ID y M4 perdió cobertura en escenarios térmicos/combinados OOD. En deriva sintética, M1 adaptativo obtuvo el menor MAE. Estos hallazgos se explican en la metodología. No se sustituyen por resultados favorables ni por las pruebas de GUI.</w:t>
+        <w:t>La evidencia científica histórica conserva su identidad y resultados: M3 tuvo menor CRPS que M4 en el protocolo ID y M4 perdió cobertura en escenarios térmicos/combinados OOD. En deriva sintética, M1 adaptativo obtuvo el menor MAE. Estos hallazgos se explican en el manual técnico. No se sustituyen por resultados favorables ni por las pruebas de GUI.</w:t>
       </w:r>
     </w:p>
     <w:p>
@@ -3690,22 +3786,22 @@
         <w:pStyle w:val="Heading1"/>
         <w:pageBreakBefore/>
       </w:pPr>
-      <w:bookmarkStart w:id="21" w:name="_Toc242339626"/>
+      <w:bookmarkStart w:id="22" w:name="_Toc242341102"/>
       <w:r>
         <w:lastRenderedPageBreak/>
         <w:t>12. Impacto y utilización</w:t>
       </w:r>
-      <w:bookmarkEnd w:id="21"/>
+      <w:bookmarkEnd w:id="22"/>
     </w:p>
     <w:p>
       <w:pPr>
         <w:pStyle w:val="Heading2"/>
       </w:pPr>
-      <w:bookmarkStart w:id="22" w:name="_Toc242339627"/>
+      <w:bookmarkStart w:id="23" w:name="_Toc242341103"/>
       <w:r>
         <w:t>12.1 Docencia</w:t>
       </w:r>
-      <w:bookmarkEnd w:id="22"/>
+      <w:bookmarkEnd w:id="23"/>
     </w:p>
     <w:p>
       <w:r>
@@ -3716,11 +3812,11 @@
       <w:pPr>
         <w:pStyle w:val="Heading2"/>
       </w:pPr>
-      <w:bookmarkStart w:id="23" w:name="_Toc242339628"/>
+      <w:bookmarkStart w:id="24" w:name="_Toc242341104"/>
       <w:r>
         <w:t>12.2 Investigación</w:t>
       </w:r>
-      <w:bookmarkEnd w:id="23"/>
+      <w:bookmarkEnd w:id="24"/>
     </w:p>
     <w:p>
       <w:r>
@@ -3731,11 +3827,11 @@
       <w:pPr>
         <w:pStyle w:val="Heading2"/>
       </w:pPr>
-      <w:bookmarkStart w:id="24" w:name="_Toc242339629"/>
+      <w:bookmarkStart w:id="25" w:name="_Toc242341105"/>
       <w:r>
         <w:t>12.3 Extensión y usuarios</w:t>
       </w:r>
-      <w:bookmarkEnd w:id="24"/>
+      <w:bookmarkEnd w:id="25"/>
     </w:p>
     <w:p>
       <w:r>
@@ -3747,22 +3843,22 @@
         <w:pStyle w:val="Heading1"/>
         <w:pageBreakBefore/>
       </w:pPr>
-      <w:bookmarkStart w:id="25" w:name="_Toc242339630"/>
+      <w:bookmarkStart w:id="26" w:name="_Toc242341106"/>
       <w:r>
         <w:lastRenderedPageBreak/>
         <w:t>13. Contribución al estado del arte</w:t>
       </w:r>
-      <w:bookmarkEnd w:id="25"/>
+      <w:bookmarkEnd w:id="26"/>
     </w:p>
     <w:p>
       <w:pPr>
         <w:pStyle w:val="Heading2"/>
       </w:pPr>
-      <w:bookmarkStart w:id="26" w:name="_Toc242339631"/>
+      <w:bookmarkStart w:id="27" w:name="_Toc242341107"/>
       <w:r>
         <w:t>13.1 Problema abordado</w:t>
       </w:r>
-      <w:bookmarkEnd w:id="26"/>
+      <w:bookmarkEnd w:id="27"/>
     </w:p>
     <w:p>
       <w:r>
@@ -3773,11 +3869,11 @@
       <w:pPr>
         <w:pStyle w:val="Heading2"/>
       </w:pPr>
-      <w:bookmarkStart w:id="27" w:name="_Toc242339632"/>
+      <w:bookmarkStart w:id="28" w:name="_Toc242341108"/>
       <w:r>
         <w:t>13.2 Antecedentes y alcance</w:t>
       </w:r>
-      <w:bookmarkEnd w:id="27"/>
+      <w:bookmarkEnd w:id="28"/>
     </w:p>
     <w:p>
       <w:r>
@@ -3788,11 +3884,11 @@
       <w:pPr>
         <w:pStyle w:val="Heading2"/>
       </w:pPr>
-      <w:bookmarkStart w:id="28" w:name="_Toc242339633"/>
+      <w:bookmarkStart w:id="29" w:name="_Toc242341109"/>
       <w:r>
         <w:t>13.3 Límites y contribución propuesta</w:t>
       </w:r>
-      <w:bookmarkEnd w:id="28"/>
+      <w:bookmarkEnd w:id="29"/>
     </w:p>
     <w:p>
       <w:r>
@@ -3804,12 +3900,12 @@
         <w:pStyle w:val="Heading1"/>
         <w:pageBreakBefore/>
       </w:pPr>
-      <w:bookmarkStart w:id="29" w:name="_Toc242339634"/>
+      <w:bookmarkStart w:id="30" w:name="_Toc242341110"/>
       <w:r>
         <w:lastRenderedPageBreak/>
         <w:t>14. Aportes y autoría</w:t>
       </w:r>
-      <w:bookmarkEnd w:id="29"/>
+      <w:bookmarkEnd w:id="30"/>
     </w:p>
     <w:p>
       <w:r>
@@ -3821,16 +3917,16 @@
         <w:pStyle w:val="Heading1"/>
         <w:pageBreakBefore/>
       </w:pPr>
-      <w:bookmarkStart w:id="30" w:name="_Toc242339635"/>
+      <w:bookmarkStart w:id="31" w:name="_Toc242341111"/>
       <w:r>
         <w:lastRenderedPageBreak/>
         <w:t>Referencias</w:t>
       </w:r>
-      <w:bookmarkEnd w:id="30"/>
-    </w:p>
-    <w:p>
-      <w:r>
-        <w:t>Las referencias bibliográficas verificadas del proyecto se mantienen en docs/references.md y se desarrollan en Metodología científica de BikeEnergyLab. Las fuentes de evidencia conservan los protocolos del 4 de octubre de 2026 y su identidad histórica. La revisión editorial del 7 de octubre no constituye una nueva validación física.</w:t>
+      <w:bookmarkEnd w:id="31"/>
+    </w:p>
+    <w:p>
+      <w:r>
+        <w:t>Las referencias bibliográficas verificadas del proyecto se mantienen en docs/references.md y se desarrollan en el manual técnico de BikeEnergyLab. Las fuentes de evidencia conservan los protocolos del 4 de octubre de 2026 y su identidad histórica. La revisión editorial del 7 de octubre no constituye una nueva validación física.</w:t>
       </w:r>
     </w:p>
     <w:p>
@@ -3854,11 +3950,11 @@
       <w:pPr>
         <w:pStyle w:val="Heading2"/>
       </w:pPr>
-      <w:bookmarkStart w:id="31" w:name="_Toc242339636"/>
+      <w:bookmarkStart w:id="32" w:name="_Toc242341112"/>
       <w:r>
         <w:t>Autoría y condiciones de uso</w:t>
       </w:r>
-      <w:bookmarkEnd w:id="31"/>
+      <w:bookmarkEnd w:id="32"/>
     </w:p>
     <w:p>
       <w:r>
@@ -4747,7 +4843,7 @@
     <w:link w:val="HeaderChar"/>
     <w:uiPriority w:val="99"/>
     <w:unhideWhenUsed/>
-    <w:rsid w:val="00DA23AD"/>
+    <w:rsid w:val="003D5F2D"/>
     <w:pPr>
       <w:tabs>
         <w:tab w:val="center" w:pos="4680"/>
@@ -4760,7 +4856,7 @@
     <w:basedOn w:val="DefaultParagraphFont"/>
     <w:link w:val="Header"/>
     <w:uiPriority w:val="99"/>
-    <w:rsid w:val="00DA23AD"/>
+    <w:rsid w:val="003D5F2D"/>
   </w:style>
   <w:style w:type="paragraph" w:styleId="Footer">
     <w:name w:val="footer"/>
@@ -4768,7 +4864,7 @@
     <w:link w:val="FooterChar"/>
     <w:uiPriority w:val="99"/>
     <w:unhideWhenUsed/>
-    <w:rsid w:val="00DA23AD"/>
+    <w:rsid w:val="003D5F2D"/>
     <w:pPr>
       <w:tabs>
         <w:tab w:val="center" w:pos="4680"/>
@@ -4781,7 +4877,7 @@
     <w:basedOn w:val="DefaultParagraphFont"/>
     <w:link w:val="Footer"/>
     <w:uiPriority w:val="99"/>
-    <w:rsid w:val="00DA23AD"/>
+    <w:rsid w:val="003D5F2D"/>
   </w:style>
 </w:styles>
 </file>

</xml_diff>

<commit_message>
Corregir hallazgos de auditoría documental y entrega 1.0.0
</commit_message>
<xml_diff>
--- a/docs/docx/Descripcion_del_Software_BikeEnergyLab_1.0.0.docx
+++ b/docs/docx/Descripcion_del_Software_BikeEnergyLab_1.0.0.docx
@@ -323,7 +323,7 @@
                 <w:sz w:val="19"/>
                 <w:szCs w:val="19"/>
               </w:rPr>
-              <w:t>Integración documental del 8 de octubre de 2026</w:t>
+              <w:t>Corrección de auditoría del 8 de octubre de 2026</w:t>
             </w:r>
           </w:p>
         </w:tc>
@@ -432,7 +432,7 @@
       <w:r>
         <w:fldChar w:fldCharType="separate"/>
       </w:r>
-      <w:hyperlink w:anchor="_Toc242341080" w:history="1">
+      <w:hyperlink w:anchor="_Toc242346959" w:history="1">
         <w:r>
           <w:rPr>
             <w:rStyle w:val="Hyperlink"/>
@@ -459,7 +459,7 @@
             <w:noProof/>
             <w:webHidden/>
           </w:rPr>
-          <w:instrText xml:space="preserve"> PAGEREF _Toc242341080 \h </w:instrText>
+          <w:instrText xml:space="preserve"> PAGEREF _Toc242346959 \h </w:instrText>
         </w:r>
         <w:r>
           <w:rPr>
@@ -505,7 +505,7 @@
           <w14:ligatures w14:val="standardContextual"/>
         </w:rPr>
       </w:pPr>
-      <w:hyperlink w:anchor="_Toc242341081" w:history="1">
+      <w:hyperlink w:anchor="_Toc242346960" w:history="1">
         <w:r>
           <w:rPr>
             <w:rStyle w:val="Hyperlink"/>
@@ -532,7 +532,7 @@
             <w:noProof/>
             <w:webHidden/>
           </w:rPr>
-          <w:instrText xml:space="preserve"> PAGEREF _Toc242341081 \h </w:instrText>
+          <w:instrText xml:space="preserve"> PAGEREF _Toc242346960 \h </w:instrText>
         </w:r>
         <w:r>
           <w:rPr>
@@ -578,7 +578,7 @@
           <w14:ligatures w14:val="standardContextual"/>
         </w:rPr>
       </w:pPr>
-      <w:hyperlink w:anchor="_Toc242341082" w:history="1">
+      <w:hyperlink w:anchor="_Toc242346961" w:history="1">
         <w:r>
           <w:rPr>
             <w:rStyle w:val="Hyperlink"/>
@@ -605,7 +605,7 @@
             <w:noProof/>
             <w:webHidden/>
           </w:rPr>
-          <w:instrText xml:space="preserve"> PAGEREF _Toc242341082 \h </w:instrText>
+          <w:instrText xml:space="preserve"> PAGEREF _Toc242346961 \h </w:instrText>
         </w:r>
         <w:r>
           <w:rPr>
@@ -651,7 +651,7 @@
           <w14:ligatures w14:val="standardContextual"/>
         </w:rPr>
       </w:pPr>
-      <w:hyperlink w:anchor="_Toc242341083" w:history="1">
+      <w:hyperlink w:anchor="_Toc242346962" w:history="1">
         <w:r>
           <w:rPr>
             <w:rStyle w:val="Hyperlink"/>
@@ -678,7 +678,7 @@
             <w:noProof/>
             <w:webHidden/>
           </w:rPr>
-          <w:instrText xml:space="preserve"> PAGEREF _Toc242341083 \h </w:instrText>
+          <w:instrText xml:space="preserve"> PAGEREF _Toc242346962 \h </w:instrText>
         </w:r>
         <w:r>
           <w:rPr>
@@ -724,7 +724,7 @@
           <w14:ligatures w14:val="standardContextual"/>
         </w:rPr>
       </w:pPr>
-      <w:hyperlink w:anchor="_Toc242341084" w:history="1">
+      <w:hyperlink w:anchor="_Toc242346963" w:history="1">
         <w:r>
           <w:rPr>
             <w:rStyle w:val="Hyperlink"/>
@@ -751,7 +751,7 @@
             <w:noProof/>
             <w:webHidden/>
           </w:rPr>
-          <w:instrText xml:space="preserve"> PAGEREF _Toc242341084 \h </w:instrText>
+          <w:instrText xml:space="preserve"> PAGEREF _Toc242346963 \h </w:instrText>
         </w:r>
         <w:r>
           <w:rPr>
@@ -797,7 +797,7 @@
           <w14:ligatures w14:val="standardContextual"/>
         </w:rPr>
       </w:pPr>
-      <w:hyperlink w:anchor="_Toc242341085" w:history="1">
+      <w:hyperlink w:anchor="_Toc242346964" w:history="1">
         <w:r>
           <w:rPr>
             <w:rStyle w:val="Hyperlink"/>
@@ -824,7 +824,7 @@
             <w:noProof/>
             <w:webHidden/>
           </w:rPr>
-          <w:instrText xml:space="preserve"> PAGEREF _Toc242341085 \h </w:instrText>
+          <w:instrText xml:space="preserve"> PAGEREF _Toc242346964 \h </w:instrText>
         </w:r>
         <w:r>
           <w:rPr>
@@ -870,7 +870,7 @@
           <w14:ligatures w14:val="standardContextual"/>
         </w:rPr>
       </w:pPr>
-      <w:hyperlink w:anchor="_Toc242341086" w:history="1">
+      <w:hyperlink w:anchor="_Toc242346965" w:history="1">
         <w:r>
           <w:rPr>
             <w:rStyle w:val="Hyperlink"/>
@@ -897,7 +897,7 @@
             <w:noProof/>
             <w:webHidden/>
           </w:rPr>
-          <w:instrText xml:space="preserve"> PAGEREF _Toc242341086 \h </w:instrText>
+          <w:instrText xml:space="preserve"> PAGEREF _Toc242346965 \h </w:instrText>
         </w:r>
         <w:r>
           <w:rPr>
@@ -943,7 +943,7 @@
           <w14:ligatures w14:val="standardContextual"/>
         </w:rPr>
       </w:pPr>
-      <w:hyperlink w:anchor="_Toc242341087" w:history="1">
+      <w:hyperlink w:anchor="_Toc242346966" w:history="1">
         <w:r>
           <w:rPr>
             <w:rStyle w:val="Hyperlink"/>
@@ -970,7 +970,7 @@
             <w:noProof/>
             <w:webHidden/>
           </w:rPr>
-          <w:instrText xml:space="preserve"> PAGEREF _Toc242341087 \h </w:instrText>
+          <w:instrText xml:space="preserve"> PAGEREF _Toc242346966 \h </w:instrText>
         </w:r>
         <w:r>
           <w:rPr>
@@ -1016,7 +1016,7 @@
           <w14:ligatures w14:val="standardContextual"/>
         </w:rPr>
       </w:pPr>
-      <w:hyperlink w:anchor="_Toc242341088" w:history="1">
+      <w:hyperlink w:anchor="_Toc242346967" w:history="1">
         <w:r>
           <w:rPr>
             <w:rStyle w:val="Hyperlink"/>
@@ -1043,7 +1043,7 @@
             <w:noProof/>
             <w:webHidden/>
           </w:rPr>
-          <w:instrText xml:space="preserve"> PAGEREF _Toc242341088 \h </w:instrText>
+          <w:instrText xml:space="preserve"> PAGEREF _Toc242346967 \h </w:instrText>
         </w:r>
         <w:r>
           <w:rPr>
@@ -1089,7 +1089,7 @@
           <w14:ligatures w14:val="standardContextual"/>
         </w:rPr>
       </w:pPr>
-      <w:hyperlink w:anchor="_Toc242341089" w:history="1">
+      <w:hyperlink w:anchor="_Toc242346968" w:history="1">
         <w:r>
           <w:rPr>
             <w:rStyle w:val="Hyperlink"/>
@@ -1116,7 +1116,7 @@
             <w:noProof/>
             <w:webHidden/>
           </w:rPr>
-          <w:instrText xml:space="preserve"> PAGEREF _Toc242341089 \h </w:instrText>
+          <w:instrText xml:space="preserve"> PAGEREF _Toc242346968 \h </w:instrText>
         </w:r>
         <w:r>
           <w:rPr>
@@ -1162,7 +1162,7 @@
           <w14:ligatures w14:val="standardContextual"/>
         </w:rPr>
       </w:pPr>
-      <w:hyperlink w:anchor="_Toc242341090" w:history="1">
+      <w:hyperlink w:anchor="_Toc242346969" w:history="1">
         <w:r>
           <w:rPr>
             <w:rStyle w:val="Hyperlink"/>
@@ -1189,7 +1189,7 @@
             <w:noProof/>
             <w:webHidden/>
           </w:rPr>
-          <w:instrText xml:space="preserve"> PAGEREF _Toc242341090 \h </w:instrText>
+          <w:instrText xml:space="preserve"> PAGEREF _Toc242346969 \h </w:instrText>
         </w:r>
         <w:r>
           <w:rPr>
@@ -1235,7 +1235,7 @@
           <w14:ligatures w14:val="standardContextual"/>
         </w:rPr>
       </w:pPr>
-      <w:hyperlink w:anchor="_Toc242341091" w:history="1">
+      <w:hyperlink w:anchor="_Toc242346970" w:history="1">
         <w:r>
           <w:rPr>
             <w:rStyle w:val="Hyperlink"/>
@@ -1262,7 +1262,7 @@
             <w:noProof/>
             <w:webHidden/>
           </w:rPr>
-          <w:instrText xml:space="preserve"> PAGEREF _Toc242341091 \h </w:instrText>
+          <w:instrText xml:space="preserve"> PAGEREF _Toc242346970 \h </w:instrText>
         </w:r>
         <w:r>
           <w:rPr>
@@ -1308,7 +1308,7 @@
           <w14:ligatures w14:val="standardContextual"/>
         </w:rPr>
       </w:pPr>
-      <w:hyperlink w:anchor="_Toc242341092" w:history="1">
+      <w:hyperlink w:anchor="_Toc242346971" w:history="1">
         <w:r>
           <w:rPr>
             <w:rStyle w:val="Hyperlink"/>
@@ -1335,7 +1335,7 @@
             <w:noProof/>
             <w:webHidden/>
           </w:rPr>
-          <w:instrText xml:space="preserve"> PAGEREF _Toc242341092 \h </w:instrText>
+          <w:instrText xml:space="preserve"> PAGEREF _Toc242346971 \h </w:instrText>
         </w:r>
         <w:r>
           <w:rPr>
@@ -1381,7 +1381,7 @@
           <w14:ligatures w14:val="standardContextual"/>
         </w:rPr>
       </w:pPr>
-      <w:hyperlink w:anchor="_Toc242341093" w:history="1">
+      <w:hyperlink w:anchor="_Toc242346972" w:history="1">
         <w:r>
           <w:rPr>
             <w:rStyle w:val="Hyperlink"/>
@@ -1408,7 +1408,7 @@
             <w:noProof/>
             <w:webHidden/>
           </w:rPr>
-          <w:instrText xml:space="preserve"> PAGEREF _Toc242341093 \h </w:instrText>
+          <w:instrText xml:space="preserve"> PAGEREF _Toc242346972 \h </w:instrText>
         </w:r>
         <w:r>
           <w:rPr>
@@ -1454,7 +1454,7 @@
           <w14:ligatures w14:val="standardContextual"/>
         </w:rPr>
       </w:pPr>
-      <w:hyperlink w:anchor="_Toc242341094" w:history="1">
+      <w:hyperlink w:anchor="_Toc242346973" w:history="1">
         <w:r>
           <w:rPr>
             <w:rStyle w:val="Hyperlink"/>
@@ -1481,7 +1481,7 @@
             <w:noProof/>
             <w:webHidden/>
           </w:rPr>
-          <w:instrText xml:space="preserve"> PAGEREF _Toc242341094 \h </w:instrText>
+          <w:instrText xml:space="preserve"> PAGEREF _Toc242346973 \h </w:instrText>
         </w:r>
         <w:r>
           <w:rPr>
@@ -1527,7 +1527,7 @@
           <w14:ligatures w14:val="standardContextual"/>
         </w:rPr>
       </w:pPr>
-      <w:hyperlink w:anchor="_Toc242341095" w:history="1">
+      <w:hyperlink w:anchor="_Toc242346974" w:history="1">
         <w:r>
           <w:rPr>
             <w:rStyle w:val="Hyperlink"/>
@@ -1554,7 +1554,7 @@
             <w:noProof/>
             <w:webHidden/>
           </w:rPr>
-          <w:instrText xml:space="preserve"> PAGEREF _Toc242341095 \h </w:instrText>
+          <w:instrText xml:space="preserve"> PAGEREF _Toc242346974 \h </w:instrText>
         </w:r>
         <w:r>
           <w:rPr>
@@ -1600,7 +1600,7 @@
           <w14:ligatures w14:val="standardContextual"/>
         </w:rPr>
       </w:pPr>
-      <w:hyperlink w:anchor="_Toc242341096" w:history="1">
+      <w:hyperlink w:anchor="_Toc242346975" w:history="1">
         <w:r>
           <w:rPr>
             <w:rStyle w:val="Hyperlink"/>
@@ -1627,7 +1627,7 @@
             <w:noProof/>
             <w:webHidden/>
           </w:rPr>
-          <w:instrText xml:space="preserve"> PAGEREF _Toc242341096 \h </w:instrText>
+          <w:instrText xml:space="preserve"> PAGEREF _Toc242346975 \h </w:instrText>
         </w:r>
         <w:r>
           <w:rPr>
@@ -1673,7 +1673,7 @@
           <w14:ligatures w14:val="standardContextual"/>
         </w:rPr>
       </w:pPr>
-      <w:hyperlink w:anchor="_Toc242341097" w:history="1">
+      <w:hyperlink w:anchor="_Toc242346976" w:history="1">
         <w:r>
           <w:rPr>
             <w:rStyle w:val="Hyperlink"/>
@@ -1700,7 +1700,7 @@
             <w:noProof/>
             <w:webHidden/>
           </w:rPr>
-          <w:instrText xml:space="preserve"> PAGEREF _Toc242341097 \h </w:instrText>
+          <w:instrText xml:space="preserve"> PAGEREF _Toc242346976 \h </w:instrText>
         </w:r>
         <w:r>
           <w:rPr>
@@ -1746,7 +1746,7 @@
           <w14:ligatures w14:val="standardContextual"/>
         </w:rPr>
       </w:pPr>
-      <w:hyperlink w:anchor="_Toc242341098" w:history="1">
+      <w:hyperlink w:anchor="_Toc242346977" w:history="1">
         <w:r>
           <w:rPr>
             <w:rStyle w:val="Hyperlink"/>
@@ -1773,7 +1773,7 @@
             <w:noProof/>
             <w:webHidden/>
           </w:rPr>
-          <w:instrText xml:space="preserve"> PAGEREF _Toc242341098 \h </w:instrText>
+          <w:instrText xml:space="preserve"> PAGEREF _Toc242346977 \h </w:instrText>
         </w:r>
         <w:r>
           <w:rPr>
@@ -1819,7 +1819,7 @@
           <w14:ligatures w14:val="standardContextual"/>
         </w:rPr>
       </w:pPr>
-      <w:hyperlink w:anchor="_Toc242341099" w:history="1">
+      <w:hyperlink w:anchor="_Toc242346978" w:history="1">
         <w:r>
           <w:rPr>
             <w:rStyle w:val="Hyperlink"/>
@@ -1846,7 +1846,7 @@
             <w:noProof/>
             <w:webHidden/>
           </w:rPr>
-          <w:instrText xml:space="preserve"> PAGEREF _Toc242341099 \h </w:instrText>
+          <w:instrText xml:space="preserve"> PAGEREF _Toc242346978 \h </w:instrText>
         </w:r>
         <w:r>
           <w:rPr>
@@ -1892,7 +1892,7 @@
           <w14:ligatures w14:val="standardContextual"/>
         </w:rPr>
       </w:pPr>
-      <w:hyperlink w:anchor="_Toc242341100" w:history="1">
+      <w:hyperlink w:anchor="_Toc242346979" w:history="1">
         <w:r>
           <w:rPr>
             <w:rStyle w:val="Hyperlink"/>
@@ -1919,7 +1919,7 @@
             <w:noProof/>
             <w:webHidden/>
           </w:rPr>
-          <w:instrText xml:space="preserve"> PAGEREF _Toc242341100 \h </w:instrText>
+          <w:instrText xml:space="preserve"> PAGEREF _Toc242346979 \h </w:instrText>
         </w:r>
         <w:r>
           <w:rPr>
@@ -1965,7 +1965,7 @@
           <w14:ligatures w14:val="standardContextual"/>
         </w:rPr>
       </w:pPr>
-      <w:hyperlink w:anchor="_Toc242341101" w:history="1">
+      <w:hyperlink w:anchor="_Toc242346980" w:history="1">
         <w:r>
           <w:rPr>
             <w:rStyle w:val="Hyperlink"/>
@@ -1992,7 +1992,7 @@
             <w:noProof/>
             <w:webHidden/>
           </w:rPr>
-          <w:instrText xml:space="preserve"> PAGEREF _Toc242341101 \h </w:instrText>
+          <w:instrText xml:space="preserve"> PAGEREF _Toc242346980 \h </w:instrText>
         </w:r>
         <w:r>
           <w:rPr>
@@ -2038,7 +2038,7 @@
           <w14:ligatures w14:val="standardContextual"/>
         </w:rPr>
       </w:pPr>
-      <w:hyperlink w:anchor="_Toc242341102" w:history="1">
+      <w:hyperlink w:anchor="_Toc242346981" w:history="1">
         <w:r>
           <w:rPr>
             <w:rStyle w:val="Hyperlink"/>
@@ -2065,7 +2065,7 @@
             <w:noProof/>
             <w:webHidden/>
           </w:rPr>
-          <w:instrText xml:space="preserve"> PAGEREF _Toc242341102 \h </w:instrText>
+          <w:instrText xml:space="preserve"> PAGEREF _Toc242346981 \h </w:instrText>
         </w:r>
         <w:r>
           <w:rPr>
@@ -2111,7 +2111,7 @@
           <w14:ligatures w14:val="standardContextual"/>
         </w:rPr>
       </w:pPr>
-      <w:hyperlink w:anchor="_Toc242341103" w:history="1">
+      <w:hyperlink w:anchor="_Toc242346982" w:history="1">
         <w:r>
           <w:rPr>
             <w:rStyle w:val="Hyperlink"/>
@@ -2138,7 +2138,7 @@
             <w:noProof/>
             <w:webHidden/>
           </w:rPr>
-          <w:instrText xml:space="preserve"> PAGEREF _Toc242341103 \h </w:instrText>
+          <w:instrText xml:space="preserve"> PAGEREF _Toc242346982 \h </w:instrText>
         </w:r>
         <w:r>
           <w:rPr>
@@ -2184,7 +2184,7 @@
           <w14:ligatures w14:val="standardContextual"/>
         </w:rPr>
       </w:pPr>
-      <w:hyperlink w:anchor="_Toc242341104" w:history="1">
+      <w:hyperlink w:anchor="_Toc242346983" w:history="1">
         <w:r>
           <w:rPr>
             <w:rStyle w:val="Hyperlink"/>
@@ -2211,7 +2211,7 @@
             <w:noProof/>
             <w:webHidden/>
           </w:rPr>
-          <w:instrText xml:space="preserve"> PAGEREF _Toc242341104 \h </w:instrText>
+          <w:instrText xml:space="preserve"> PAGEREF _Toc242346983 \h </w:instrText>
         </w:r>
         <w:r>
           <w:rPr>
@@ -2257,7 +2257,7 @@
           <w14:ligatures w14:val="standardContextual"/>
         </w:rPr>
       </w:pPr>
-      <w:hyperlink w:anchor="_Toc242341105" w:history="1">
+      <w:hyperlink w:anchor="_Toc242346984" w:history="1">
         <w:r>
           <w:rPr>
             <w:rStyle w:val="Hyperlink"/>
@@ -2284,7 +2284,7 @@
             <w:noProof/>
             <w:webHidden/>
           </w:rPr>
-          <w:instrText xml:space="preserve"> PAGEREF _Toc242341105 \h </w:instrText>
+          <w:instrText xml:space="preserve"> PAGEREF _Toc242346984 \h </w:instrText>
         </w:r>
         <w:r>
           <w:rPr>
@@ -2330,7 +2330,7 @@
           <w14:ligatures w14:val="standardContextual"/>
         </w:rPr>
       </w:pPr>
-      <w:hyperlink w:anchor="_Toc242341106" w:history="1">
+      <w:hyperlink w:anchor="_Toc242346985" w:history="1">
         <w:r>
           <w:rPr>
             <w:rStyle w:val="Hyperlink"/>
@@ -2357,7 +2357,7 @@
             <w:noProof/>
             <w:webHidden/>
           </w:rPr>
-          <w:instrText xml:space="preserve"> PAGEREF _Toc242341106 \h </w:instrText>
+          <w:instrText xml:space="preserve"> PAGEREF _Toc242346985 \h </w:instrText>
         </w:r>
         <w:r>
           <w:rPr>
@@ -2403,7 +2403,7 @@
           <w14:ligatures w14:val="standardContextual"/>
         </w:rPr>
       </w:pPr>
-      <w:hyperlink w:anchor="_Toc242341107" w:history="1">
+      <w:hyperlink w:anchor="_Toc242346986" w:history="1">
         <w:r>
           <w:rPr>
             <w:rStyle w:val="Hyperlink"/>
@@ -2430,7 +2430,7 @@
             <w:noProof/>
             <w:webHidden/>
           </w:rPr>
-          <w:instrText xml:space="preserve"> PAGEREF _Toc242341107 \h </w:instrText>
+          <w:instrText xml:space="preserve"> PAGEREF _Toc242346986 \h </w:instrText>
         </w:r>
         <w:r>
           <w:rPr>
@@ -2476,7 +2476,7 @@
           <w14:ligatures w14:val="standardContextual"/>
         </w:rPr>
       </w:pPr>
-      <w:hyperlink w:anchor="_Toc242341108" w:history="1">
+      <w:hyperlink w:anchor="_Toc242346987" w:history="1">
         <w:r>
           <w:rPr>
             <w:rStyle w:val="Hyperlink"/>
@@ -2503,7 +2503,7 @@
             <w:noProof/>
             <w:webHidden/>
           </w:rPr>
-          <w:instrText xml:space="preserve"> PAGEREF _Toc242341108 \h </w:instrText>
+          <w:instrText xml:space="preserve"> PAGEREF _Toc242346987 \h </w:instrText>
         </w:r>
         <w:r>
           <w:rPr>
@@ -2549,7 +2549,7 @@
           <w14:ligatures w14:val="standardContextual"/>
         </w:rPr>
       </w:pPr>
-      <w:hyperlink w:anchor="_Toc242341109" w:history="1">
+      <w:hyperlink w:anchor="_Toc242346988" w:history="1">
         <w:r>
           <w:rPr>
             <w:rStyle w:val="Hyperlink"/>
@@ -2576,7 +2576,7 @@
             <w:noProof/>
             <w:webHidden/>
           </w:rPr>
-          <w:instrText xml:space="preserve"> PAGEREF _Toc242341109 \h </w:instrText>
+          <w:instrText xml:space="preserve"> PAGEREF _Toc242346988 \h </w:instrText>
         </w:r>
         <w:r>
           <w:rPr>
@@ -2622,7 +2622,7 @@
           <w14:ligatures w14:val="standardContextual"/>
         </w:rPr>
       </w:pPr>
-      <w:hyperlink w:anchor="_Toc242341110" w:history="1">
+      <w:hyperlink w:anchor="_Toc242346989" w:history="1">
         <w:r>
           <w:rPr>
             <w:rStyle w:val="Hyperlink"/>
@@ -2649,7 +2649,7 @@
             <w:noProof/>
             <w:webHidden/>
           </w:rPr>
-          <w:instrText xml:space="preserve"> PAGEREF _Toc242341110 \h </w:instrText>
+          <w:instrText xml:space="preserve"> PAGEREF _Toc242346989 \h </w:instrText>
         </w:r>
         <w:r>
           <w:rPr>
@@ -2695,7 +2695,7 @@
           <w14:ligatures w14:val="standardContextual"/>
         </w:rPr>
       </w:pPr>
-      <w:hyperlink w:anchor="_Toc242341111" w:history="1">
+      <w:hyperlink w:anchor="_Toc242346990" w:history="1">
         <w:r>
           <w:rPr>
             <w:rStyle w:val="Hyperlink"/>
@@ -2722,7 +2722,7 @@
             <w:noProof/>
             <w:webHidden/>
           </w:rPr>
-          <w:instrText xml:space="preserve"> PAGEREF _Toc242341111 \h </w:instrText>
+          <w:instrText xml:space="preserve"> PAGEREF _Toc242346990 \h </w:instrText>
         </w:r>
         <w:r>
           <w:rPr>
@@ -2768,7 +2768,7 @@
           <w14:ligatures w14:val="standardContextual"/>
         </w:rPr>
       </w:pPr>
-      <w:hyperlink w:anchor="_Toc242341112" w:history="1">
+      <w:hyperlink w:anchor="_Toc242346991" w:history="1">
         <w:r>
           <w:rPr>
             <w:rStyle w:val="Hyperlink"/>
@@ -2795,7 +2795,7 @@
             <w:noProof/>
             <w:webHidden/>
           </w:rPr>
-          <w:instrText xml:space="preserve"> PAGEREF _Toc242341112 \h </w:instrText>
+          <w:instrText xml:space="preserve"> PAGEREF _Toc242346991 \h </w:instrText>
         </w:r>
         <w:r>
           <w:rPr>
@@ -2840,7 +2840,7 @@
       <w:pPr>
         <w:pStyle w:val="Heading1"/>
       </w:pPr>
-      <w:bookmarkStart w:id="0" w:name="_Toc242341080"/>
+      <w:bookmarkStart w:id="0" w:name="_Toc242346959"/>
       <w:r>
         <w:lastRenderedPageBreak/>
         <w:t>1. Información general del producto</w:t>
@@ -3172,7 +3172,7 @@
                 <w:sz w:val="19"/>
                 <w:szCs w:val="19"/>
               </w:rPr>
-              <w:t>2026, revisión de integración documental del 8 de octubre</w:t>
+              <w:t>2026, corrección de auditoría del 8 de octubre</w:t>
             </w:r>
           </w:p>
         </w:tc>
@@ -3428,7 +3428,7 @@
         <w:pStyle w:val="Heading1"/>
         <w:pageBreakBefore/>
       </w:pPr>
-      <w:bookmarkStart w:id="1" w:name="_Toc242341081"/>
+      <w:bookmarkStart w:id="1" w:name="_Toc242346960"/>
       <w:r>
         <w:lastRenderedPageBreak/>
         <w:t>2. Descripción general del software</w:t>
@@ -3449,7 +3449,7 @@
       <w:pPr>
         <w:pStyle w:val="Heading2"/>
       </w:pPr>
-      <w:bookmarkStart w:id="2" w:name="_Toc242341082"/>
+      <w:bookmarkStart w:id="2" w:name="_Toc242346961"/>
       <w:r>
         <w:t>2.1 Requisitos de hardware y software</w:t>
       </w:r>
@@ -3464,7 +3464,7 @@
       <w:pPr>
         <w:pStyle w:val="Heading2"/>
       </w:pPr>
-      <w:bookmarkStart w:id="3" w:name="_Toc242341083"/>
+      <w:bookmarkStart w:id="3" w:name="_Toc242346962"/>
       <w:r>
         <w:t>2.2 Justificación de los requisitos</w:t>
       </w:r>
@@ -3480,7 +3480,7 @@
         <w:pStyle w:val="Heading1"/>
         <w:pageBreakBefore/>
       </w:pPr>
-      <w:bookmarkStart w:id="4" w:name="_Toc242341084"/>
+      <w:bookmarkStart w:id="4" w:name="_Toc242346963"/>
       <w:r>
         <w:lastRenderedPageBreak/>
         <w:t>3. Objetivos y área de aplicación</w:t>
@@ -3491,7 +3491,7 @@
       <w:pPr>
         <w:pStyle w:val="Heading2"/>
       </w:pPr>
-      <w:bookmarkStart w:id="5" w:name="_Toc242341085"/>
+      <w:bookmarkStart w:id="5" w:name="_Toc242346964"/>
       <w:r>
         <w:t>3.1 Objetivo general</w:t>
       </w:r>
@@ -3506,7 +3506,7 @@
       <w:pPr>
         <w:pStyle w:val="Heading2"/>
       </w:pPr>
-      <w:bookmarkStart w:id="6" w:name="_Toc242341086"/>
+      <w:bookmarkStart w:id="6" w:name="_Toc242346965"/>
       <w:r>
         <w:t>3.2 Área de aplicación</w:t>
       </w:r>
@@ -3522,7 +3522,7 @@
         <w:pStyle w:val="Heading1"/>
         <w:pageBreakBefore/>
       </w:pPr>
-      <w:bookmarkStart w:id="7" w:name="_Toc242341087"/>
+      <w:bookmarkStart w:id="7" w:name="_Toc242346966"/>
       <w:r>
         <w:lastRenderedPageBreak/>
         <w:t>4. Funcionalidades principales</w:t>
@@ -3543,7 +3543,7 @@
       <w:pPr>
         <w:pStyle w:val="Heading2"/>
       </w:pPr>
-      <w:bookmarkStart w:id="8" w:name="_Toc242341088"/>
+      <w:bookmarkStart w:id="8" w:name="_Toc242346967"/>
       <w:r>
         <w:t>4.1 Fundamento científico y alcance del método</w:t>
       </w:r>
@@ -3556,7 +3556,7 @@
     </w:p>
     <w:p>
       <w:r>
-        <w:t>CGPRA combina física calibrada y regresión de residuos por ruta. Su compuerta pondera la corrección según soporte de datos y dispersión, sin representar una probabilidad de acierto. Los intervalos conformales usan rutas independientes para calibración. Monte Carlo propaga los supuestos configurados y la sensibilidad estudia su influencia. El capítulo 6 del manual técnico desarrolla las 26 ecuaciones editables, y el capítulo 7 conserva protocolos, resultados desfavorables y límites. Los datos sintéticos y la</w:t>
+        <w:t>CGPRA combina física calibrada y regresión de residuos por ruta. Su compuerta pondera la corrección según soporte de datos y dispersión, sin representar una probabilidad de acierto. Los intervalos conformales usan rutas independientes para calibración. Monte Carlo propaga los supuestos configurados y la sensibilidad estudia su influencia. El capítulo 6 del manual técnico desarrolla las 32 ecuaciones editables, y el capítulo 7 conserva protocolos, resultados desfavorables y límites. Los datos sintéticos y la</w:t>
       </w:r>
       <w:r>
         <w:t>s comprobaciones de implementación no demuestran precisión con bicicletas reales.</w:t>
@@ -3567,7 +3567,7 @@
         <w:pStyle w:val="Heading1"/>
         <w:pageBreakBefore/>
       </w:pPr>
-      <w:bookmarkStart w:id="9" w:name="_Toc242341089"/>
+      <w:bookmarkStart w:id="9" w:name="_Toc242346968"/>
       <w:r>
         <w:lastRenderedPageBreak/>
         <w:t>5. Adaptabilidad extensibilidad y mantenibilidad</w:t>
@@ -3589,7 +3589,7 @@
         <w:pStyle w:val="Heading1"/>
         <w:pageBreakBefore/>
       </w:pPr>
-      <w:bookmarkStart w:id="10" w:name="_Toc242341090"/>
+      <w:bookmarkStart w:id="10" w:name="_Toc242346969"/>
       <w:r>
         <w:lastRenderedPageBreak/>
         <w:t>6. Robustez desempeño y consistencia</w:t>
@@ -3600,7 +3600,7 @@
       <w:pPr>
         <w:pStyle w:val="Heading2"/>
       </w:pPr>
-      <w:bookmarkStart w:id="11" w:name="_Toc242341091"/>
+      <w:bookmarkStart w:id="11" w:name="_Toc242346970"/>
       <w:r>
         <w:t>6.1 Robustez</w:t>
       </w:r>
@@ -3615,7 +3615,7 @@
       <w:pPr>
         <w:pStyle w:val="Heading2"/>
       </w:pPr>
-      <w:bookmarkStart w:id="12" w:name="_Toc242341092"/>
+      <w:bookmarkStart w:id="12" w:name="_Toc242346971"/>
       <w:r>
         <w:t>6.2 Desempeño</w:t>
       </w:r>
@@ -3623,14 +3623,14 @@
     </w:p>
     <w:p>
       <w:r>
-        <w:t>La versión pasó 80 pruebas de regresión y 114 comprobaciones ampliadas de interfaz tanto en fuentes como en el ejecutable. El wheel aislado y el EXE coincidieron en predicciones con tolerancia de 1e-8. Estas comprobaciones verifican implementación y empaquetado, y no establecen tiempos de respuesta ni exactitud física universal.</w:t>
+        <w:t>La revisión histórica registra 80 pruebas de regresión y 114 comprobaciones de interfaz en fuentes y 114 en el ejecutable. El 8 de octubre se volvió a completar la suite de 80 pruebas. Los logs, reportes y hashes pertinentes están dentro de ambos ZIP en results. El wheel aislado y el EXE coincidieron en predicciones con tolerancia de 1e-8. Estas comprobaciones verifican implementación y empaquetado, y no establecen tiempos de respuesta ni exactitud física universal.</w:t>
       </w:r>
     </w:p>
     <w:p>
       <w:pPr>
         <w:pStyle w:val="Heading2"/>
       </w:pPr>
-      <w:bookmarkStart w:id="13" w:name="_Toc242341093"/>
+      <w:bookmarkStart w:id="13" w:name="_Toc242346972"/>
       <w:r>
         <w:t>6.3 Consistencia y reproducibilidad</w:t>
       </w:r>
@@ -3646,7 +3646,7 @@
         <w:pStyle w:val="Heading1"/>
         <w:pageBreakBefore/>
       </w:pPr>
-      <w:bookmarkStart w:id="14" w:name="_Toc242341094"/>
+      <w:bookmarkStart w:id="14" w:name="_Toc242346973"/>
       <w:r>
         <w:lastRenderedPageBreak/>
         <w:t>7. Interfaz y usabilidad</w:t>
@@ -3663,7 +3663,7 @@
         <w:pStyle w:val="Heading1"/>
         <w:pageBreakBefore/>
       </w:pPr>
-      <w:bookmarkStart w:id="15" w:name="_Toc242341095"/>
+      <w:bookmarkStart w:id="15" w:name="_Toc242346974"/>
       <w:r>
         <w:lastRenderedPageBreak/>
         <w:t>8. Integridad y seguridad de la información</w:t>
@@ -3685,7 +3685,7 @@
         <w:pStyle w:val="Heading1"/>
         <w:pageBreakBefore/>
       </w:pPr>
-      <w:bookmarkStart w:id="16" w:name="_Toc242341096"/>
+      <w:bookmarkStart w:id="16" w:name="_Toc242346975"/>
       <w:r>
         <w:lastRenderedPageBreak/>
         <w:t>9. Portabilidad y compatibilidad</w:t>
@@ -3696,7 +3696,7 @@
       <w:pPr>
         <w:pStyle w:val="Heading2"/>
       </w:pPr>
-      <w:bookmarkStart w:id="17" w:name="_Toc242341097"/>
+      <w:bookmarkStart w:id="17" w:name="_Toc242346976"/>
       <w:r>
         <w:t>9.1 Plataformas compatibles</w:t>
       </w:r>
@@ -3711,7 +3711,7 @@
       <w:pPr>
         <w:pStyle w:val="Heading2"/>
       </w:pPr>
-      <w:bookmarkStart w:id="18" w:name="_Toc242341098"/>
+      <w:bookmarkStart w:id="18" w:name="_Toc242346977"/>
       <w:r>
         <w:t>9.2 Dependencias relevantes</w:t>
       </w:r>
@@ -3726,7 +3726,7 @@
       <w:pPr>
         <w:pStyle w:val="Heading2"/>
       </w:pPr>
-      <w:bookmarkStart w:id="19" w:name="_Toc242341099"/>
+      <w:bookmarkStart w:id="19" w:name="_Toc242346978"/>
       <w:r>
         <w:t>9.3 Portabilidad de resultados</w:t>
       </w:r>
@@ -3742,7 +3742,7 @@
         <w:pStyle w:val="Heading1"/>
         <w:pageBreakBefore/>
       </w:pPr>
-      <w:bookmarkStart w:id="20" w:name="_Toc242341100"/>
+      <w:bookmarkStart w:id="20" w:name="_Toc242346979"/>
       <w:r>
         <w:lastRenderedPageBreak/>
         <w:t>10. Documentación y soporte técnico</w:t>
@@ -3764,7 +3764,7 @@
         <w:pStyle w:val="Heading1"/>
         <w:pageBreakBefore/>
       </w:pPr>
-      <w:bookmarkStart w:id="21" w:name="_Toc242341101"/>
+      <w:bookmarkStart w:id="21" w:name="_Toc242346980"/>
       <w:r>
         <w:lastRenderedPageBreak/>
         <w:t>11. Pruebas validación y desempeño</w:t>
@@ -3786,7 +3786,7 @@
         <w:pStyle w:val="Heading1"/>
         <w:pageBreakBefore/>
       </w:pPr>
-      <w:bookmarkStart w:id="22" w:name="_Toc242341102"/>
+      <w:bookmarkStart w:id="22" w:name="_Toc242346981"/>
       <w:r>
         <w:lastRenderedPageBreak/>
         <w:t>12. Impacto y utilización</w:t>
@@ -3797,7 +3797,7 @@
       <w:pPr>
         <w:pStyle w:val="Heading2"/>
       </w:pPr>
-      <w:bookmarkStart w:id="23" w:name="_Toc242341103"/>
+      <w:bookmarkStart w:id="23" w:name="_Toc242346982"/>
       <w:r>
         <w:t>12.1 Docencia</w:t>
       </w:r>
@@ -3812,7 +3812,7 @@
       <w:pPr>
         <w:pStyle w:val="Heading2"/>
       </w:pPr>
-      <w:bookmarkStart w:id="24" w:name="_Toc242341104"/>
+      <w:bookmarkStart w:id="24" w:name="_Toc242346983"/>
       <w:r>
         <w:t>12.2 Investigación</w:t>
       </w:r>
@@ -3827,7 +3827,7 @@
       <w:pPr>
         <w:pStyle w:val="Heading2"/>
       </w:pPr>
-      <w:bookmarkStart w:id="25" w:name="_Toc242341105"/>
+      <w:bookmarkStart w:id="25" w:name="_Toc242346984"/>
       <w:r>
         <w:t>12.3 Extensión y usuarios</w:t>
       </w:r>
@@ -3843,7 +3843,7 @@
         <w:pStyle w:val="Heading1"/>
         <w:pageBreakBefore/>
       </w:pPr>
-      <w:bookmarkStart w:id="26" w:name="_Toc242341106"/>
+      <w:bookmarkStart w:id="26" w:name="_Toc242346985"/>
       <w:r>
         <w:lastRenderedPageBreak/>
         <w:t>13. Contribución al estado del arte</w:t>
@@ -3854,7 +3854,7 @@
       <w:pPr>
         <w:pStyle w:val="Heading2"/>
       </w:pPr>
-      <w:bookmarkStart w:id="27" w:name="_Toc242341107"/>
+      <w:bookmarkStart w:id="27" w:name="_Toc242346986"/>
       <w:r>
         <w:t>13.1 Problema abordado</w:t>
       </w:r>
@@ -3869,7 +3869,7 @@
       <w:pPr>
         <w:pStyle w:val="Heading2"/>
       </w:pPr>
-      <w:bookmarkStart w:id="28" w:name="_Toc242341108"/>
+      <w:bookmarkStart w:id="28" w:name="_Toc242346987"/>
       <w:r>
         <w:t>13.2 Antecedentes y alcance</w:t>
       </w:r>
@@ -3884,7 +3884,7 @@
       <w:pPr>
         <w:pStyle w:val="Heading2"/>
       </w:pPr>
-      <w:bookmarkStart w:id="29" w:name="_Toc242341109"/>
+      <w:bookmarkStart w:id="29" w:name="_Toc242346988"/>
       <w:r>
         <w:t>13.3 Límites y contribución propuesta</w:t>
       </w:r>
@@ -3900,7 +3900,7 @@
         <w:pStyle w:val="Heading1"/>
         <w:pageBreakBefore/>
       </w:pPr>
-      <w:bookmarkStart w:id="30" w:name="_Toc242341110"/>
+      <w:bookmarkStart w:id="30" w:name="_Toc242346989"/>
       <w:r>
         <w:lastRenderedPageBreak/>
         <w:t>14. Aportes y autoría</w:t>
@@ -3917,7 +3917,7 @@
         <w:pStyle w:val="Heading1"/>
         <w:pageBreakBefore/>
       </w:pPr>
-      <w:bookmarkStart w:id="31" w:name="_Toc242341111"/>
+      <w:bookmarkStart w:id="31" w:name="_Toc242346990"/>
       <w:r>
         <w:lastRenderedPageBreak/>
         <w:t>Referencias</w:t>
@@ -3950,7 +3950,7 @@
       <w:pPr>
         <w:pStyle w:val="Heading2"/>
       </w:pPr>
-      <w:bookmarkStart w:id="32" w:name="_Toc242341112"/>
+      <w:bookmarkStart w:id="32" w:name="_Toc242346991"/>
       <w:r>
         <w:t>Autoría y condiciones de uso</w:t>
       </w:r>
@@ -4843,7 +4843,7 @@
     <w:link w:val="HeaderChar"/>
     <w:uiPriority w:val="99"/>
     <w:unhideWhenUsed/>
-    <w:rsid w:val="003D5F2D"/>
+    <w:rsid w:val="004A33F8"/>
     <w:pPr>
       <w:tabs>
         <w:tab w:val="center" w:pos="4680"/>
@@ -4856,7 +4856,7 @@
     <w:basedOn w:val="DefaultParagraphFont"/>
     <w:link w:val="Header"/>
     <w:uiPriority w:val="99"/>
-    <w:rsid w:val="003D5F2D"/>
+    <w:rsid w:val="004A33F8"/>
   </w:style>
   <w:style w:type="paragraph" w:styleId="Footer">
     <w:name w:val="footer"/>
@@ -4864,7 +4864,7 @@
     <w:link w:val="FooterChar"/>
     <w:uiPriority w:val="99"/>
     <w:unhideWhenUsed/>
-    <w:rsid w:val="003D5F2D"/>
+    <w:rsid w:val="004A33F8"/>
     <w:pPr>
       <w:tabs>
         <w:tab w:val="center" w:pos="4680"/>
@@ -4877,7 +4877,7 @@
     <w:basedOn w:val="DefaultParagraphFont"/>
     <w:link w:val="Footer"/>
     <w:uiPriority w:val="99"/>
-    <w:rsid w:val="003D5F2D"/>
+    <w:rsid w:val="004A33F8"/>
   </w:style>
 </w:styles>
 </file>

</xml_diff>

<commit_message>
Sincronizar entregables 1.0.0 con referencia DNDA
</commit_message>
<xml_diff>
--- a/docs/docx/Descripcion_del_Software_BikeEnergyLab_1.0.0.docx
+++ b/docs/docx/Descripcion_del_Software_BikeEnergyLab_1.0.0.docx
@@ -323,7 +323,7 @@
                 <w:sz w:val="19"/>
                 <w:szCs w:val="19"/>
               </w:rPr>
-              <w:t>Corrección de auditoría del 8 de octubre de 2026</w:t>
+              <w:t>Edición 1.0.0 del 8 de octubre de 2026</w:t>
             </w:r>
           </w:p>
         </w:tc>
@@ -432,7 +432,7 @@
       <w:r>
         <w:fldChar w:fldCharType="separate"/>
       </w:r>
-      <w:hyperlink w:anchor="_Toc242346959" w:history="1">
+      <w:hyperlink w:anchor="_Toc242365777" w:history="1">
         <w:r>
           <w:rPr>
             <w:rStyle w:val="Hyperlink"/>
@@ -459,7 +459,7 @@
             <w:noProof/>
             <w:webHidden/>
           </w:rPr>
-          <w:instrText xml:space="preserve"> PAGEREF _Toc242346959 \h </w:instrText>
+          <w:instrText xml:space="preserve"> PAGEREF _Toc242365777 \h </w:instrText>
         </w:r>
         <w:r>
           <w:rPr>
@@ -505,7 +505,7 @@
           <w14:ligatures w14:val="standardContextual"/>
         </w:rPr>
       </w:pPr>
-      <w:hyperlink w:anchor="_Toc242346960" w:history="1">
+      <w:hyperlink w:anchor="_Toc242365778" w:history="1">
         <w:r>
           <w:rPr>
             <w:rStyle w:val="Hyperlink"/>
@@ -532,7 +532,7 @@
             <w:noProof/>
             <w:webHidden/>
           </w:rPr>
-          <w:instrText xml:space="preserve"> PAGEREF _Toc242346960 \h </w:instrText>
+          <w:instrText xml:space="preserve"> PAGEREF _Toc242365778 \h </w:instrText>
         </w:r>
         <w:r>
           <w:rPr>
@@ -578,7 +578,7 @@
           <w14:ligatures w14:val="standardContextual"/>
         </w:rPr>
       </w:pPr>
-      <w:hyperlink w:anchor="_Toc242346961" w:history="1">
+      <w:hyperlink w:anchor="_Toc242365779" w:history="1">
         <w:r>
           <w:rPr>
             <w:rStyle w:val="Hyperlink"/>
@@ -605,7 +605,7 @@
             <w:noProof/>
             <w:webHidden/>
           </w:rPr>
-          <w:instrText xml:space="preserve"> PAGEREF _Toc242346961 \h </w:instrText>
+          <w:instrText xml:space="preserve"> PAGEREF _Toc242365779 \h </w:instrText>
         </w:r>
         <w:r>
           <w:rPr>
@@ -651,7 +651,7 @@
           <w14:ligatures w14:val="standardContextual"/>
         </w:rPr>
       </w:pPr>
-      <w:hyperlink w:anchor="_Toc242346962" w:history="1">
+      <w:hyperlink w:anchor="_Toc242365780" w:history="1">
         <w:r>
           <w:rPr>
             <w:rStyle w:val="Hyperlink"/>
@@ -678,7 +678,7 @@
             <w:noProof/>
             <w:webHidden/>
           </w:rPr>
-          <w:instrText xml:space="preserve"> PAGEREF _Toc242346962 \h </w:instrText>
+          <w:instrText xml:space="preserve"> PAGEREF _Toc242365780 \h </w:instrText>
         </w:r>
         <w:r>
           <w:rPr>
@@ -724,7 +724,7 @@
           <w14:ligatures w14:val="standardContextual"/>
         </w:rPr>
       </w:pPr>
-      <w:hyperlink w:anchor="_Toc242346963" w:history="1">
+      <w:hyperlink w:anchor="_Toc242365781" w:history="1">
         <w:r>
           <w:rPr>
             <w:rStyle w:val="Hyperlink"/>
@@ -751,7 +751,7 @@
             <w:noProof/>
             <w:webHidden/>
           </w:rPr>
-          <w:instrText xml:space="preserve"> PAGEREF _Toc242346963 \h </w:instrText>
+          <w:instrText xml:space="preserve"> PAGEREF _Toc242365781 \h </w:instrText>
         </w:r>
         <w:r>
           <w:rPr>
@@ -797,7 +797,7 @@
           <w14:ligatures w14:val="standardContextual"/>
         </w:rPr>
       </w:pPr>
-      <w:hyperlink w:anchor="_Toc242346964" w:history="1">
+      <w:hyperlink w:anchor="_Toc242365782" w:history="1">
         <w:r>
           <w:rPr>
             <w:rStyle w:val="Hyperlink"/>
@@ -824,7 +824,7 @@
             <w:noProof/>
             <w:webHidden/>
           </w:rPr>
-          <w:instrText xml:space="preserve"> PAGEREF _Toc242346964 \h </w:instrText>
+          <w:instrText xml:space="preserve"> PAGEREF _Toc242365782 \h </w:instrText>
         </w:r>
         <w:r>
           <w:rPr>
@@ -870,7 +870,7 @@
           <w14:ligatures w14:val="standardContextual"/>
         </w:rPr>
       </w:pPr>
-      <w:hyperlink w:anchor="_Toc242346965" w:history="1">
+      <w:hyperlink w:anchor="_Toc242365783" w:history="1">
         <w:r>
           <w:rPr>
             <w:rStyle w:val="Hyperlink"/>
@@ -897,7 +897,7 @@
             <w:noProof/>
             <w:webHidden/>
           </w:rPr>
-          <w:instrText xml:space="preserve"> PAGEREF _Toc242346965 \h </w:instrText>
+          <w:instrText xml:space="preserve"> PAGEREF _Toc242365783 \h </w:instrText>
         </w:r>
         <w:r>
           <w:rPr>
@@ -943,7 +943,7 @@
           <w14:ligatures w14:val="standardContextual"/>
         </w:rPr>
       </w:pPr>
-      <w:hyperlink w:anchor="_Toc242346966" w:history="1">
+      <w:hyperlink w:anchor="_Toc242365784" w:history="1">
         <w:r>
           <w:rPr>
             <w:rStyle w:val="Hyperlink"/>
@@ -970,7 +970,7 @@
             <w:noProof/>
             <w:webHidden/>
           </w:rPr>
-          <w:instrText xml:space="preserve"> PAGEREF _Toc242346966 \h </w:instrText>
+          <w:instrText xml:space="preserve"> PAGEREF _Toc242365784 \h </w:instrText>
         </w:r>
         <w:r>
           <w:rPr>
@@ -1016,7 +1016,7 @@
           <w14:ligatures w14:val="standardContextual"/>
         </w:rPr>
       </w:pPr>
-      <w:hyperlink w:anchor="_Toc242346967" w:history="1">
+      <w:hyperlink w:anchor="_Toc242365785" w:history="1">
         <w:r>
           <w:rPr>
             <w:rStyle w:val="Hyperlink"/>
@@ -1043,7 +1043,7 @@
             <w:noProof/>
             <w:webHidden/>
           </w:rPr>
-          <w:instrText xml:space="preserve"> PAGEREF _Toc242346967 \h </w:instrText>
+          <w:instrText xml:space="preserve"> PAGEREF _Toc242365785 \h </w:instrText>
         </w:r>
         <w:r>
           <w:rPr>
@@ -1089,7 +1089,7 @@
           <w14:ligatures w14:val="standardContextual"/>
         </w:rPr>
       </w:pPr>
-      <w:hyperlink w:anchor="_Toc242346968" w:history="1">
+      <w:hyperlink w:anchor="_Toc242365786" w:history="1">
         <w:r>
           <w:rPr>
             <w:rStyle w:val="Hyperlink"/>
@@ -1116,7 +1116,7 @@
             <w:noProof/>
             <w:webHidden/>
           </w:rPr>
-          <w:instrText xml:space="preserve"> PAGEREF _Toc242346968 \h </w:instrText>
+          <w:instrText xml:space="preserve"> PAGEREF _Toc242365786 \h </w:instrText>
         </w:r>
         <w:r>
           <w:rPr>
@@ -1162,7 +1162,7 @@
           <w14:ligatures w14:val="standardContextual"/>
         </w:rPr>
       </w:pPr>
-      <w:hyperlink w:anchor="_Toc242346969" w:history="1">
+      <w:hyperlink w:anchor="_Toc242365787" w:history="1">
         <w:r>
           <w:rPr>
             <w:rStyle w:val="Hyperlink"/>
@@ -1189,7 +1189,7 @@
             <w:noProof/>
             <w:webHidden/>
           </w:rPr>
-          <w:instrText xml:space="preserve"> PAGEREF _Toc242346969 \h </w:instrText>
+          <w:instrText xml:space="preserve"> PAGEREF _Toc242365787 \h </w:instrText>
         </w:r>
         <w:r>
           <w:rPr>
@@ -1235,7 +1235,7 @@
           <w14:ligatures w14:val="standardContextual"/>
         </w:rPr>
       </w:pPr>
-      <w:hyperlink w:anchor="_Toc242346970" w:history="1">
+      <w:hyperlink w:anchor="_Toc242365788" w:history="1">
         <w:r>
           <w:rPr>
             <w:rStyle w:val="Hyperlink"/>
@@ -1262,7 +1262,7 @@
             <w:noProof/>
             <w:webHidden/>
           </w:rPr>
-          <w:instrText xml:space="preserve"> PAGEREF _Toc242346970 \h </w:instrText>
+          <w:instrText xml:space="preserve"> PAGEREF _Toc242365788 \h </w:instrText>
         </w:r>
         <w:r>
           <w:rPr>
@@ -1308,7 +1308,7 @@
           <w14:ligatures w14:val="standardContextual"/>
         </w:rPr>
       </w:pPr>
-      <w:hyperlink w:anchor="_Toc242346971" w:history="1">
+      <w:hyperlink w:anchor="_Toc242365789" w:history="1">
         <w:r>
           <w:rPr>
             <w:rStyle w:val="Hyperlink"/>
@@ -1335,7 +1335,7 @@
             <w:noProof/>
             <w:webHidden/>
           </w:rPr>
-          <w:instrText xml:space="preserve"> PAGEREF _Toc242346971 \h </w:instrText>
+          <w:instrText xml:space="preserve"> PAGEREF _Toc242365789 \h </w:instrText>
         </w:r>
         <w:r>
           <w:rPr>
@@ -1381,7 +1381,7 @@
           <w14:ligatures w14:val="standardContextual"/>
         </w:rPr>
       </w:pPr>
-      <w:hyperlink w:anchor="_Toc242346972" w:history="1">
+      <w:hyperlink w:anchor="_Toc242365790" w:history="1">
         <w:r>
           <w:rPr>
             <w:rStyle w:val="Hyperlink"/>
@@ -1408,7 +1408,7 @@
             <w:noProof/>
             <w:webHidden/>
           </w:rPr>
-          <w:instrText xml:space="preserve"> PAGEREF _Toc242346972 \h </w:instrText>
+          <w:instrText xml:space="preserve"> PAGEREF _Toc242365790 \h </w:instrText>
         </w:r>
         <w:r>
           <w:rPr>
@@ -1454,7 +1454,7 @@
           <w14:ligatures w14:val="standardContextual"/>
         </w:rPr>
       </w:pPr>
-      <w:hyperlink w:anchor="_Toc242346973" w:history="1">
+      <w:hyperlink w:anchor="_Toc242365791" w:history="1">
         <w:r>
           <w:rPr>
             <w:rStyle w:val="Hyperlink"/>
@@ -1481,7 +1481,7 @@
             <w:noProof/>
             <w:webHidden/>
           </w:rPr>
-          <w:instrText xml:space="preserve"> PAGEREF _Toc242346973 \h </w:instrText>
+          <w:instrText xml:space="preserve"> PAGEREF _Toc242365791 \h </w:instrText>
         </w:r>
         <w:r>
           <w:rPr>
@@ -1527,7 +1527,7 @@
           <w14:ligatures w14:val="standardContextual"/>
         </w:rPr>
       </w:pPr>
-      <w:hyperlink w:anchor="_Toc242346974" w:history="1">
+      <w:hyperlink w:anchor="_Toc242365792" w:history="1">
         <w:r>
           <w:rPr>
             <w:rStyle w:val="Hyperlink"/>
@@ -1554,7 +1554,7 @@
             <w:noProof/>
             <w:webHidden/>
           </w:rPr>
-          <w:instrText xml:space="preserve"> PAGEREF _Toc242346974 \h </w:instrText>
+          <w:instrText xml:space="preserve"> PAGEREF _Toc242365792 \h </w:instrText>
         </w:r>
         <w:r>
           <w:rPr>
@@ -1600,7 +1600,7 @@
           <w14:ligatures w14:val="standardContextual"/>
         </w:rPr>
       </w:pPr>
-      <w:hyperlink w:anchor="_Toc242346975" w:history="1">
+      <w:hyperlink w:anchor="_Toc242365793" w:history="1">
         <w:r>
           <w:rPr>
             <w:rStyle w:val="Hyperlink"/>
@@ -1627,7 +1627,7 @@
             <w:noProof/>
             <w:webHidden/>
           </w:rPr>
-          <w:instrText xml:space="preserve"> PAGEREF _Toc242346975 \h </w:instrText>
+          <w:instrText xml:space="preserve"> PAGEREF _Toc242365793 \h </w:instrText>
         </w:r>
         <w:r>
           <w:rPr>
@@ -1673,7 +1673,7 @@
           <w14:ligatures w14:val="standardContextual"/>
         </w:rPr>
       </w:pPr>
-      <w:hyperlink w:anchor="_Toc242346976" w:history="1">
+      <w:hyperlink w:anchor="_Toc242365794" w:history="1">
         <w:r>
           <w:rPr>
             <w:rStyle w:val="Hyperlink"/>
@@ -1700,7 +1700,7 @@
             <w:noProof/>
             <w:webHidden/>
           </w:rPr>
-          <w:instrText xml:space="preserve"> PAGEREF _Toc242346976 \h </w:instrText>
+          <w:instrText xml:space="preserve"> PAGEREF _Toc242365794 \h </w:instrText>
         </w:r>
         <w:r>
           <w:rPr>
@@ -1746,7 +1746,7 @@
           <w14:ligatures w14:val="standardContextual"/>
         </w:rPr>
       </w:pPr>
-      <w:hyperlink w:anchor="_Toc242346977" w:history="1">
+      <w:hyperlink w:anchor="_Toc242365795" w:history="1">
         <w:r>
           <w:rPr>
             <w:rStyle w:val="Hyperlink"/>
@@ -1773,7 +1773,7 @@
             <w:noProof/>
             <w:webHidden/>
           </w:rPr>
-          <w:instrText xml:space="preserve"> PAGEREF _Toc242346977 \h </w:instrText>
+          <w:instrText xml:space="preserve"> PAGEREF _Toc242365795 \h </w:instrText>
         </w:r>
         <w:r>
           <w:rPr>
@@ -1819,7 +1819,7 @@
           <w14:ligatures w14:val="standardContextual"/>
         </w:rPr>
       </w:pPr>
-      <w:hyperlink w:anchor="_Toc242346978" w:history="1">
+      <w:hyperlink w:anchor="_Toc242365796" w:history="1">
         <w:r>
           <w:rPr>
             <w:rStyle w:val="Hyperlink"/>
@@ -1846,7 +1846,7 @@
             <w:noProof/>
             <w:webHidden/>
           </w:rPr>
-          <w:instrText xml:space="preserve"> PAGEREF _Toc242346978 \h </w:instrText>
+          <w:instrText xml:space="preserve"> PAGEREF _Toc242365796 \h </w:instrText>
         </w:r>
         <w:r>
           <w:rPr>
@@ -1892,7 +1892,7 @@
           <w14:ligatures w14:val="standardContextual"/>
         </w:rPr>
       </w:pPr>
-      <w:hyperlink w:anchor="_Toc242346979" w:history="1">
+      <w:hyperlink w:anchor="_Toc242365797" w:history="1">
         <w:r>
           <w:rPr>
             <w:rStyle w:val="Hyperlink"/>
@@ -1919,7 +1919,7 @@
             <w:noProof/>
             <w:webHidden/>
           </w:rPr>
-          <w:instrText xml:space="preserve"> PAGEREF _Toc242346979 \h </w:instrText>
+          <w:instrText xml:space="preserve"> PAGEREF _Toc242365797 \h </w:instrText>
         </w:r>
         <w:r>
           <w:rPr>
@@ -1965,7 +1965,7 @@
           <w14:ligatures w14:val="standardContextual"/>
         </w:rPr>
       </w:pPr>
-      <w:hyperlink w:anchor="_Toc242346980" w:history="1">
+      <w:hyperlink w:anchor="_Toc242365798" w:history="1">
         <w:r>
           <w:rPr>
             <w:rStyle w:val="Hyperlink"/>
@@ -1992,7 +1992,7 @@
             <w:noProof/>
             <w:webHidden/>
           </w:rPr>
-          <w:instrText xml:space="preserve"> PAGEREF _Toc242346980 \h </w:instrText>
+          <w:instrText xml:space="preserve"> PAGEREF _Toc242365798 \h </w:instrText>
         </w:r>
         <w:r>
           <w:rPr>
@@ -2038,7 +2038,7 @@
           <w14:ligatures w14:val="standardContextual"/>
         </w:rPr>
       </w:pPr>
-      <w:hyperlink w:anchor="_Toc242346981" w:history="1">
+      <w:hyperlink w:anchor="_Toc242365799" w:history="1">
         <w:r>
           <w:rPr>
             <w:rStyle w:val="Hyperlink"/>
@@ -2065,7 +2065,7 @@
             <w:noProof/>
             <w:webHidden/>
           </w:rPr>
-          <w:instrText xml:space="preserve"> PAGEREF _Toc242346981 \h </w:instrText>
+          <w:instrText xml:space="preserve"> PAGEREF _Toc242365799 \h </w:instrText>
         </w:r>
         <w:r>
           <w:rPr>
@@ -2111,7 +2111,7 @@
           <w14:ligatures w14:val="standardContextual"/>
         </w:rPr>
       </w:pPr>
-      <w:hyperlink w:anchor="_Toc242346982" w:history="1">
+      <w:hyperlink w:anchor="_Toc242365800" w:history="1">
         <w:r>
           <w:rPr>
             <w:rStyle w:val="Hyperlink"/>
@@ -2138,7 +2138,7 @@
             <w:noProof/>
             <w:webHidden/>
           </w:rPr>
-          <w:instrText xml:space="preserve"> PAGEREF _Toc242346982 \h </w:instrText>
+          <w:instrText xml:space="preserve"> PAGEREF _Toc242365800 \h </w:instrText>
         </w:r>
         <w:r>
           <w:rPr>
@@ -2184,7 +2184,7 @@
           <w14:ligatures w14:val="standardContextual"/>
         </w:rPr>
       </w:pPr>
-      <w:hyperlink w:anchor="_Toc242346983" w:history="1">
+      <w:hyperlink w:anchor="_Toc242365801" w:history="1">
         <w:r>
           <w:rPr>
             <w:rStyle w:val="Hyperlink"/>
@@ -2211,7 +2211,7 @@
             <w:noProof/>
             <w:webHidden/>
           </w:rPr>
-          <w:instrText xml:space="preserve"> PAGEREF _Toc242346983 \h </w:instrText>
+          <w:instrText xml:space="preserve"> PAGEREF _Toc242365801 \h </w:instrText>
         </w:r>
         <w:r>
           <w:rPr>
@@ -2257,7 +2257,7 @@
           <w14:ligatures w14:val="standardContextual"/>
         </w:rPr>
       </w:pPr>
-      <w:hyperlink w:anchor="_Toc242346984" w:history="1">
+      <w:hyperlink w:anchor="_Toc242365802" w:history="1">
         <w:r>
           <w:rPr>
             <w:rStyle w:val="Hyperlink"/>
@@ -2284,7 +2284,7 @@
             <w:noProof/>
             <w:webHidden/>
           </w:rPr>
-          <w:instrText xml:space="preserve"> PAGEREF _Toc242346984 \h </w:instrText>
+          <w:instrText xml:space="preserve"> PAGEREF _Toc242365802 \h </w:instrText>
         </w:r>
         <w:r>
           <w:rPr>
@@ -2330,7 +2330,7 @@
           <w14:ligatures w14:val="standardContextual"/>
         </w:rPr>
       </w:pPr>
-      <w:hyperlink w:anchor="_Toc242346985" w:history="1">
+      <w:hyperlink w:anchor="_Toc242365803" w:history="1">
         <w:r>
           <w:rPr>
             <w:rStyle w:val="Hyperlink"/>
@@ -2357,7 +2357,7 @@
             <w:noProof/>
             <w:webHidden/>
           </w:rPr>
-          <w:instrText xml:space="preserve"> PAGEREF _Toc242346985 \h </w:instrText>
+          <w:instrText xml:space="preserve"> PAGEREF _Toc242365803 \h </w:instrText>
         </w:r>
         <w:r>
           <w:rPr>
@@ -2403,7 +2403,7 @@
           <w14:ligatures w14:val="standardContextual"/>
         </w:rPr>
       </w:pPr>
-      <w:hyperlink w:anchor="_Toc242346986" w:history="1">
+      <w:hyperlink w:anchor="_Toc242365804" w:history="1">
         <w:r>
           <w:rPr>
             <w:rStyle w:val="Hyperlink"/>
@@ -2430,7 +2430,7 @@
             <w:noProof/>
             <w:webHidden/>
           </w:rPr>
-          <w:instrText xml:space="preserve"> PAGEREF _Toc242346986 \h </w:instrText>
+          <w:instrText xml:space="preserve"> PAGEREF _Toc242365804 \h </w:instrText>
         </w:r>
         <w:r>
           <w:rPr>
@@ -2476,7 +2476,7 @@
           <w14:ligatures w14:val="standardContextual"/>
         </w:rPr>
       </w:pPr>
-      <w:hyperlink w:anchor="_Toc242346987" w:history="1">
+      <w:hyperlink w:anchor="_Toc242365805" w:history="1">
         <w:r>
           <w:rPr>
             <w:rStyle w:val="Hyperlink"/>
@@ -2503,7 +2503,7 @@
             <w:noProof/>
             <w:webHidden/>
           </w:rPr>
-          <w:instrText xml:space="preserve"> PAGEREF _Toc242346987 \h </w:instrText>
+          <w:instrText xml:space="preserve"> PAGEREF _Toc242365805 \h </w:instrText>
         </w:r>
         <w:r>
           <w:rPr>
@@ -2549,7 +2549,7 @@
           <w14:ligatures w14:val="standardContextual"/>
         </w:rPr>
       </w:pPr>
-      <w:hyperlink w:anchor="_Toc242346988" w:history="1">
+      <w:hyperlink w:anchor="_Toc242365806" w:history="1">
         <w:r>
           <w:rPr>
             <w:rStyle w:val="Hyperlink"/>
@@ -2576,7 +2576,7 @@
             <w:noProof/>
             <w:webHidden/>
           </w:rPr>
-          <w:instrText xml:space="preserve"> PAGEREF _Toc242346988 \h </w:instrText>
+          <w:instrText xml:space="preserve"> PAGEREF _Toc242365806 \h </w:instrText>
         </w:r>
         <w:r>
           <w:rPr>
@@ -2622,7 +2622,7 @@
           <w14:ligatures w14:val="standardContextual"/>
         </w:rPr>
       </w:pPr>
-      <w:hyperlink w:anchor="_Toc242346989" w:history="1">
+      <w:hyperlink w:anchor="_Toc242365807" w:history="1">
         <w:r>
           <w:rPr>
             <w:rStyle w:val="Hyperlink"/>
@@ -2649,7 +2649,7 @@
             <w:noProof/>
             <w:webHidden/>
           </w:rPr>
-          <w:instrText xml:space="preserve"> PAGEREF _Toc242346989 \h </w:instrText>
+          <w:instrText xml:space="preserve"> PAGEREF _Toc242365807 \h </w:instrText>
         </w:r>
         <w:r>
           <w:rPr>
@@ -2695,7 +2695,7 @@
           <w14:ligatures w14:val="standardContextual"/>
         </w:rPr>
       </w:pPr>
-      <w:hyperlink w:anchor="_Toc242346990" w:history="1">
+      <w:hyperlink w:anchor="_Toc242365808" w:history="1">
         <w:r>
           <w:rPr>
             <w:rStyle w:val="Hyperlink"/>
@@ -2722,7 +2722,7 @@
             <w:noProof/>
             <w:webHidden/>
           </w:rPr>
-          <w:instrText xml:space="preserve"> PAGEREF _Toc242346990 \h </w:instrText>
+          <w:instrText xml:space="preserve"> PAGEREF _Toc242365808 \h </w:instrText>
         </w:r>
         <w:r>
           <w:rPr>
@@ -2768,7 +2768,7 @@
           <w14:ligatures w14:val="standardContextual"/>
         </w:rPr>
       </w:pPr>
-      <w:hyperlink w:anchor="_Toc242346991" w:history="1">
+      <w:hyperlink w:anchor="_Toc242365809" w:history="1">
         <w:r>
           <w:rPr>
             <w:rStyle w:val="Hyperlink"/>
@@ -2795,7 +2795,7 @@
             <w:noProof/>
             <w:webHidden/>
           </w:rPr>
-          <w:instrText xml:space="preserve"> PAGEREF _Toc242346991 \h </w:instrText>
+          <w:instrText xml:space="preserve"> PAGEREF _Toc242365809 \h </w:instrText>
         </w:r>
         <w:r>
           <w:rPr>
@@ -2840,7 +2840,7 @@
       <w:pPr>
         <w:pStyle w:val="Heading1"/>
       </w:pPr>
-      <w:bookmarkStart w:id="0" w:name="_Toc242346959"/>
+      <w:bookmarkStart w:id="0" w:name="_Toc242365777"/>
       <w:r>
         <w:lastRenderedPageBreak/>
         <w:t>1. Información general del producto</w:t>
@@ -3145,7 +3145,7 @@
                 <w:sz w:val="19"/>
                 <w:szCs w:val="19"/>
               </w:rPr>
-              <w:t>Año y revisión</w:t>
+              <w:t>Año y versión</w:t>
             </w:r>
           </w:p>
         </w:tc>
@@ -3172,7 +3172,7 @@
                 <w:sz w:val="19"/>
                 <w:szCs w:val="19"/>
               </w:rPr>
-              <w:t>2026, corrección de auditoría del 8 de octubre</w:t>
+              <w:t>2026, versión 1.0.0</w:t>
             </w:r>
           </w:p>
         </w:tc>
@@ -3416,7 +3416,7 @@
                 <w:sz w:val="19"/>
                 <w:szCs w:val="19"/>
               </w:rPr>
-              <w:t>Los establecidos en LICENSE. No se presume una licencia abierta</w:t>
+              <w:t>Derechos reservados a los autores. No se presume una licencia abierta</w:t>
             </w:r>
           </w:p>
         </w:tc>
@@ -3428,7 +3428,7 @@
         <w:pStyle w:val="Heading1"/>
         <w:pageBreakBefore/>
       </w:pPr>
-      <w:bookmarkStart w:id="1" w:name="_Toc242346960"/>
+      <w:bookmarkStart w:id="1" w:name="_Toc242365778"/>
       <w:r>
         <w:lastRenderedPageBreak/>
         <w:t>2. Descripción general del software</w:t>
@@ -3449,7 +3449,7 @@
       <w:pPr>
         <w:pStyle w:val="Heading2"/>
       </w:pPr>
-      <w:bookmarkStart w:id="2" w:name="_Toc242346961"/>
+      <w:bookmarkStart w:id="2" w:name="_Toc242365779"/>
       <w:r>
         <w:t>2.1 Requisitos de hardware y software</w:t>
       </w:r>
@@ -3464,7 +3464,7 @@
       <w:pPr>
         <w:pStyle w:val="Heading2"/>
       </w:pPr>
-      <w:bookmarkStart w:id="3" w:name="_Toc242346962"/>
+      <w:bookmarkStart w:id="3" w:name="_Toc242365780"/>
       <w:r>
         <w:t>2.2 Justificación de los requisitos</w:t>
       </w:r>
@@ -3472,7 +3472,7 @@
     </w:p>
     <w:p>
       <w:r>
-        <w:t>NumPy y SciPy proporcionan cálculo e identificación. Pandas procesa datos. Scikit-learn implementa regresión y aprendizaje residual. Matplotlib genera figuras. PyYAML conserva configuraciones. La distribución onedir incluye estas dependencias, sus licencias y los datos de SciPy necesarios para Sobol. El costo de cálculo crece con las rutas, segmentos, muestras y protocolos seleccionados. No se atribuye un tiempo universal de ejecución.</w:t>
+        <w:t>NumPy y SciPy proporcionan cálculo e identificación. Pandas procesa datos. Scikit-learn implementa regresión y aprendizaje residual. Matplotlib genera figuras. PyYAML conserva configuraciones. La distribución onedir incluye estas dependencias y los datos de SciPy necesarios para Sobol. El costo de cálculo crece con las rutas, segmentos, muestras y protocolos seleccionados. No se atribuye un tiempo universal de ejecución.</w:t>
       </w:r>
     </w:p>
     <w:p>
@@ -3480,7 +3480,7 @@
         <w:pStyle w:val="Heading1"/>
         <w:pageBreakBefore/>
       </w:pPr>
-      <w:bookmarkStart w:id="4" w:name="_Toc242346963"/>
+      <w:bookmarkStart w:id="4" w:name="_Toc242365781"/>
       <w:r>
         <w:lastRenderedPageBreak/>
         <w:t>3. Objetivos y área de aplicación</w:t>
@@ -3491,7 +3491,7 @@
       <w:pPr>
         <w:pStyle w:val="Heading2"/>
       </w:pPr>
-      <w:bookmarkStart w:id="5" w:name="_Toc242346964"/>
+      <w:bookmarkStart w:id="5" w:name="_Toc242365782"/>
       <w:r>
         <w:t>3.1 Objetivo general</w:t>
       </w:r>
@@ -3506,7 +3506,7 @@
       <w:pPr>
         <w:pStyle w:val="Heading2"/>
       </w:pPr>
-      <w:bookmarkStart w:id="6" w:name="_Toc242346965"/>
+      <w:bookmarkStart w:id="6" w:name="_Toc242365783"/>
       <w:r>
         <w:t>3.2 Área de aplicación</w:t>
       </w:r>
@@ -3522,7 +3522,7 @@
         <w:pStyle w:val="Heading1"/>
         <w:pageBreakBefore/>
       </w:pPr>
-      <w:bookmarkStart w:id="7" w:name="_Toc242346966"/>
+      <w:bookmarkStart w:id="7" w:name="_Toc242365784"/>
       <w:r>
         <w:lastRenderedPageBreak/>
         <w:t>4. Funcionalidades principales</w:t>
@@ -3543,7 +3543,7 @@
       <w:pPr>
         <w:pStyle w:val="Heading2"/>
       </w:pPr>
-      <w:bookmarkStart w:id="8" w:name="_Toc242346967"/>
+      <w:bookmarkStart w:id="8" w:name="_Toc242365785"/>
       <w:r>
         <w:t>4.1 Fundamento científico y alcance del método</w:t>
       </w:r>
@@ -3567,7 +3567,7 @@
         <w:pStyle w:val="Heading1"/>
         <w:pageBreakBefore/>
       </w:pPr>
-      <w:bookmarkStart w:id="9" w:name="_Toc242346968"/>
+      <w:bookmarkStart w:id="9" w:name="_Toc242365786"/>
       <w:r>
         <w:lastRenderedPageBreak/>
         <w:t>5. Adaptabilidad extensibilidad y mantenibilidad</w:t>
@@ -3581,7 +3581,7 @@
     </w:p>
     <w:p>
       <w:r>
-        <w:t>Los scripts de distribución y generación documental forman parte de las fuentes. Las plantillas de estilo conservadas y las capturas permiten reproducir los documentos. La documentación, los paquetes y sus hashes deben actualizarse conjuntamente después de cada cambio.</w:t>
+        <w:t>El proyecto de desarrollo conserva los scripts de distribución y las fuentes documentales. Las plantillas de estilo y las capturas permiten reproducir los documentos. Los archivos entregados y sus hashes se actualizan conjuntamente cuando cambia la distribución.</w:t>
       </w:r>
     </w:p>
     <w:p>
@@ -3589,7 +3589,7 @@
         <w:pStyle w:val="Heading1"/>
         <w:pageBreakBefore/>
       </w:pPr>
-      <w:bookmarkStart w:id="10" w:name="_Toc242346969"/>
+      <w:bookmarkStart w:id="10" w:name="_Toc242365787"/>
       <w:r>
         <w:lastRenderedPageBreak/>
         <w:t>6. Robustez desempeño y consistencia</w:t>
@@ -3600,7 +3600,7 @@
       <w:pPr>
         <w:pStyle w:val="Heading2"/>
       </w:pPr>
-      <w:bookmarkStart w:id="11" w:name="_Toc242346970"/>
+      <w:bookmarkStart w:id="11" w:name="_Toc242365788"/>
       <w:r>
         <w:t>6.1 Robustez</w:t>
       </w:r>
@@ -3615,7 +3615,7 @@
       <w:pPr>
         <w:pStyle w:val="Heading2"/>
       </w:pPr>
-      <w:bookmarkStart w:id="12" w:name="_Toc242346971"/>
+      <w:bookmarkStart w:id="12" w:name="_Toc242365789"/>
       <w:r>
         <w:t>6.2 Desempeño</w:t>
       </w:r>
@@ -3623,14 +3623,14 @@
     </w:p>
     <w:p>
       <w:r>
-        <w:t>La revisión histórica registra 80 pruebas de regresión y 114 comprobaciones de interfaz en fuentes y 114 en el ejecutable. El 8 de octubre se volvió a completar la suite de 80 pruebas. Los logs, reportes y hashes pertinentes están dentro de ambos ZIP en results. El wheel aislado y el EXE coincidieron en predicciones con tolerancia de 1e-8. Estas comprobaciones verifican implementación y empaquetado, y no establecen tiempos de respuesta ni exactitud física universal.</w:t>
+        <w:t>Las pruebas de software registran 80 pruebas de regresión y 114 comprobaciones de interfaz en fuentes y 114 en el ejecutable. La suite completa de 80 pruebas se repitió el 8 de octubre de 2026. Los registros de prueba se conservan en el proyecto de desarrollo, fuera de los ZIP entregados. El wheel aislado y el EXE coincidieron en predicciones con tolerancia de 1e-8. Estas comprobaciones verifican implementación y empaquetado, no exactitud física universal.</w:t>
       </w:r>
     </w:p>
     <w:p>
       <w:pPr>
         <w:pStyle w:val="Heading2"/>
       </w:pPr>
-      <w:bookmarkStart w:id="13" w:name="_Toc242346972"/>
+      <w:bookmarkStart w:id="13" w:name="_Toc242365790"/>
       <w:r>
         <w:t>6.3 Consistencia y reproducibilidad</w:t>
       </w:r>
@@ -3646,7 +3646,7 @@
         <w:pStyle w:val="Heading1"/>
         <w:pageBreakBefore/>
       </w:pPr>
-      <w:bookmarkStart w:id="14" w:name="_Toc242346973"/>
+      <w:bookmarkStart w:id="14" w:name="_Toc242365791"/>
       <w:r>
         <w:lastRenderedPageBreak/>
         <w:t>7. Interfaz y usabilidad</w:t>
@@ -3663,7 +3663,7 @@
         <w:pStyle w:val="Heading1"/>
         <w:pageBreakBefore/>
       </w:pPr>
-      <w:bookmarkStart w:id="15" w:name="_Toc242346974"/>
+      <w:bookmarkStart w:id="15" w:name="_Toc242365792"/>
       <w:r>
         <w:lastRenderedPageBreak/>
         <w:t>8. Integridad y seguridad de la información</w:t>
@@ -3685,7 +3685,7 @@
         <w:pStyle w:val="Heading1"/>
         <w:pageBreakBefore/>
       </w:pPr>
-      <w:bookmarkStart w:id="16" w:name="_Toc242346975"/>
+      <w:bookmarkStart w:id="16" w:name="_Toc242365793"/>
       <w:r>
         <w:lastRenderedPageBreak/>
         <w:t>9. Portabilidad y compatibilidad</w:t>
@@ -3696,7 +3696,7 @@
       <w:pPr>
         <w:pStyle w:val="Heading2"/>
       </w:pPr>
-      <w:bookmarkStart w:id="17" w:name="_Toc242346976"/>
+      <w:bookmarkStart w:id="17" w:name="_Toc242365794"/>
       <w:r>
         <w:t>9.1 Plataformas compatibles</w:t>
       </w:r>
@@ -3711,7 +3711,7 @@
       <w:pPr>
         <w:pStyle w:val="Heading2"/>
       </w:pPr>
-      <w:bookmarkStart w:id="18" w:name="_Toc242346977"/>
+      <w:bookmarkStart w:id="18" w:name="_Toc242365795"/>
       <w:r>
         <w:t>9.2 Dependencias relevantes</w:t>
       </w:r>
@@ -3719,14 +3719,14 @@
     </w:p>
     <w:p>
       <w:r>
-        <w:t>Los requisitos mínimos están en pyproject.toml y las versiones usadas en requirements-lock.txt. El paquete portátil incluye intérprete, recursos Tk/Matplotlib, DLL, metadatos, datos de SciPy y avisos de terceros. _internal debe permanecer junto al EXE.</w:t>
+        <w:t>Los requisitos mínimos están en pyproject.toml y las versiones usadas en requirements-lock.txt. El paquete portátil incluye BikeEnergyLab.exe y la carpeta _internal con intérprete, recursos Tk/Matplotlib, DLL, metadatos y datos de SciPy. _internal debe permanecer junto al EXE. Los nueve ejemplos y el tutorial están integrados en la aplicación.</w:t>
       </w:r>
     </w:p>
     <w:p>
       <w:pPr>
         <w:pStyle w:val="Heading2"/>
       </w:pPr>
-      <w:bookmarkStart w:id="19" w:name="_Toc242346978"/>
+      <w:bookmarkStart w:id="19" w:name="_Toc242365796"/>
       <w:r>
         <w:t>9.3 Portabilidad de resultados</w:t>
       </w:r>
@@ -3734,7 +3734,7 @@
     </w:p>
     <w:p>
       <w:r>
-        <w:t>CSV, YAML, JSON y figuras permiten analizar resultados sin depender de la sesión abierta. La portabilidad requiere conservar mapas, rutas y metadatos copiados. El ZIP de fuentes incluye configuración, pruebas, scripts, documentos y componentes de estilo.</w:t>
+        <w:t>CSV, YAML, JSON y figuras permiten analizar resultados sin depender de la sesión abierta. La portabilidad requiere conservar mapas, rutas y metadatos copiados. El ZIP de fuentes contiene el código de la aplicación, configuraciones, datos sintéticos de ejemplo, un script de ejemplos y los metadatos mínimos de instalación.</w:t>
       </w:r>
     </w:p>
     <w:p>
@@ -3742,7 +3742,7 @@
         <w:pStyle w:val="Heading1"/>
         <w:pageBreakBefore/>
       </w:pPr>
-      <w:bookmarkStart w:id="20" w:name="_Toc242346979"/>
+      <w:bookmarkStart w:id="20" w:name="_Toc242365797"/>
       <w:r>
         <w:lastRenderedPageBreak/>
         <w:t>10. Documentación y soporte técnico</w:t>
@@ -3751,7 +3751,7 @@
     </w:p>
     <w:p>
       <w:r>
-        <w:t>La entrega incluye manual de usuario ilustrado, manual técnico con metodología científica, descripción del software y título/funciones en Word. Entregables contiene únicamente estos cuatro DOCX, el ZIP de fuentes y el ZIP portátil. El ZIP portátil incluye el EXE con sus dependencias. Se extrae fuera de Entregables para ejecutar el programa.</w:t>
+        <w:t>El manual de usuario, el manual técnico con metodología científica, la descripción del software y el documento de título y funciones se entregan por separado en Word. El ZIP de fuentes contiene solo el código necesario para instalar el proyecto y ejecutar sus ejemplos. El ZIP Windows contiene el EXE y sus dependencias, sin manuales ni archivos de generación documental. Se extrae antes de ejecutar el programa.</w:t>
       </w:r>
     </w:p>
     <w:p>
@@ -3764,7 +3764,7 @@
         <w:pStyle w:val="Heading1"/>
         <w:pageBreakBefore/>
       </w:pPr>
-      <w:bookmarkStart w:id="21" w:name="_Toc242346980"/>
+      <w:bookmarkStart w:id="21" w:name="_Toc242365798"/>
       <w:r>
         <w:lastRenderedPageBreak/>
         <w:t>11. Pruebas validación y desempeño</w:t>
@@ -3786,7 +3786,7 @@
         <w:pStyle w:val="Heading1"/>
         <w:pageBreakBefore/>
       </w:pPr>
-      <w:bookmarkStart w:id="22" w:name="_Toc242346981"/>
+      <w:bookmarkStart w:id="22" w:name="_Toc242365799"/>
       <w:r>
         <w:lastRenderedPageBreak/>
         <w:t>12. Impacto y utilización</w:t>
@@ -3797,7 +3797,7 @@
       <w:pPr>
         <w:pStyle w:val="Heading2"/>
       </w:pPr>
-      <w:bookmarkStart w:id="23" w:name="_Toc242346982"/>
+      <w:bookmarkStart w:id="23" w:name="_Toc242365800"/>
       <w:r>
         <w:t>12.1 Docencia</w:t>
       </w:r>
@@ -3812,7 +3812,7 @@
       <w:pPr>
         <w:pStyle w:val="Heading2"/>
       </w:pPr>
-      <w:bookmarkStart w:id="24" w:name="_Toc242346983"/>
+      <w:bookmarkStart w:id="24" w:name="_Toc242365801"/>
       <w:r>
         <w:t>12.2 Investigación</w:t>
       </w:r>
@@ -3827,7 +3827,7 @@
       <w:pPr>
         <w:pStyle w:val="Heading2"/>
       </w:pPr>
-      <w:bookmarkStart w:id="25" w:name="_Toc242346984"/>
+      <w:bookmarkStart w:id="25" w:name="_Toc242365802"/>
       <w:r>
         <w:t>12.3 Extensión y usuarios</w:t>
       </w:r>
@@ -3843,7 +3843,7 @@
         <w:pStyle w:val="Heading1"/>
         <w:pageBreakBefore/>
       </w:pPr>
-      <w:bookmarkStart w:id="26" w:name="_Toc242346985"/>
+      <w:bookmarkStart w:id="26" w:name="_Toc242365803"/>
       <w:r>
         <w:lastRenderedPageBreak/>
         <w:t>13. Contribución al estado del arte</w:t>
@@ -3854,7 +3854,7 @@
       <w:pPr>
         <w:pStyle w:val="Heading2"/>
       </w:pPr>
-      <w:bookmarkStart w:id="27" w:name="_Toc242346986"/>
+      <w:bookmarkStart w:id="27" w:name="_Toc242365804"/>
       <w:r>
         <w:t>13.1 Problema abordado</w:t>
       </w:r>
@@ -3869,7 +3869,7 @@
       <w:pPr>
         <w:pStyle w:val="Heading2"/>
       </w:pPr>
-      <w:bookmarkStart w:id="28" w:name="_Toc242346987"/>
+      <w:bookmarkStart w:id="28" w:name="_Toc242365805"/>
       <w:r>
         <w:t>13.2 Antecedentes y alcance</w:t>
       </w:r>
@@ -3884,7 +3884,7 @@
       <w:pPr>
         <w:pStyle w:val="Heading2"/>
       </w:pPr>
-      <w:bookmarkStart w:id="29" w:name="_Toc242346988"/>
+      <w:bookmarkStart w:id="29" w:name="_Toc242365806"/>
       <w:r>
         <w:t>13.3 Límites y contribución propuesta</w:t>
       </w:r>
@@ -3900,7 +3900,7 @@
         <w:pStyle w:val="Heading1"/>
         <w:pageBreakBefore/>
       </w:pPr>
-      <w:bookmarkStart w:id="30" w:name="_Toc242346989"/>
+      <w:bookmarkStart w:id="30" w:name="_Toc242365807"/>
       <w:r>
         <w:lastRenderedPageBreak/>
         <w:t>14. Aportes y autoría</w:t>
@@ -3909,7 +3909,7 @@
     </w:p>
     <w:p>
       <w:r>
-        <w:t>Los autores identificados del software son Francisco Javier Burgos Flórez y Juan Guillermo Popayán Hernández. Esta entrega comprende el núcleo científico, interfaz, ejemplos, tutorial, pruebas, distribución y documentación. No se asignan contribuciones individuales adicionales sin una declaración de los autores. Conservar CITATION.cff y las condiciones de LICENSE al citar o distribuir.</w:t>
+        <w:t>Los autores identificados del software son Francisco Javier Burgos Flórez y Juan Guillermo Popayán Hernández. Esta entrega comprende el núcleo científico, interfaz, ejemplos, tutorial, pruebas, distribución y documentación. No se asignan contribuciones individuales adicionales sin una declaración de los autores. Cualquier cita o distribución debe respetar los derechos de los autores.</w:t>
       </w:r>
     </w:p>
     <w:p>
@@ -3917,7 +3917,7 @@
         <w:pStyle w:val="Heading1"/>
         <w:pageBreakBefore/>
       </w:pPr>
-      <w:bookmarkStart w:id="31" w:name="_Toc242346990"/>
+      <w:bookmarkStart w:id="31" w:name="_Toc242365808"/>
       <w:r>
         <w:lastRenderedPageBreak/>
         <w:t>Referencias</w:t>
@@ -3926,7 +3926,7 @@
     </w:p>
     <w:p>
       <w:r>
-        <w:t>Las referencias bibliográficas verificadas del proyecto se mantienen en docs/references.md y se desarrollan en el manual técnico de BikeEnergyLab. Las fuentes de evidencia conservan los protocolos del 4 de octubre de 2026 y su identidad histórica. La revisión editorial del 7 de octubre no constituye una nueva validación física.</w:t>
+        <w:t>Las referencias bibliográficas del proyecto se desarrollan en el manual técnico de BikeEnergyLab. Los protocolos sintéticos del 4 de octubre de 2026 conservan su identidad histórica en el proyecto de desarrollo. No constituyen una validación física con bicicletas reales.</w:t>
       </w:r>
     </w:p>
     <w:p>
@@ -3950,7 +3950,7 @@
       <w:pPr>
         <w:pStyle w:val="Heading2"/>
       </w:pPr>
-      <w:bookmarkStart w:id="32" w:name="_Toc242346991"/>
+      <w:bookmarkStart w:id="32" w:name="_Toc242365809"/>
       <w:r>
         <w:t>Autoría y condiciones de uso</w:t>
       </w:r>
@@ -3958,7 +3958,7 @@
     </w:p>
     <w:p>
       <w:r>
-        <w:t>Autores: Francisco Javier Burgos Flórez y Juan Guillermo Popayán Hernández. Contacto: fjburgosf@gmail.com. Conserve CITATION.cff para citar el software. Los derechos y condiciones de uso son los indicados en LICENSE. No se presume una licencia abierta.</w:t>
+        <w:t>Autores: Francisco Javier Burgos Flórez y Juan Guillermo Popayán Hernández. Contacto: fjburgosf@gmail.com. Los derechos de uso y distribución pertenecen a los autores. No se presume una licencia abierta.</w:t>
       </w:r>
     </w:p>
     <w:sectPr>
@@ -4843,7 +4843,7 @@
     <w:link w:val="HeaderChar"/>
     <w:uiPriority w:val="99"/>
     <w:unhideWhenUsed/>
-    <w:rsid w:val="004A33F8"/>
+    <w:rsid w:val="00AC3148"/>
     <w:pPr>
       <w:tabs>
         <w:tab w:val="center" w:pos="4680"/>
@@ -4856,7 +4856,7 @@
     <w:basedOn w:val="DefaultParagraphFont"/>
     <w:link w:val="Header"/>
     <w:uiPriority w:val="99"/>
-    <w:rsid w:val="004A33F8"/>
+    <w:rsid w:val="00AC3148"/>
   </w:style>
   <w:style w:type="paragraph" w:styleId="Footer">
     <w:name w:val="footer"/>
@@ -4864,7 +4864,7 @@
     <w:link w:val="FooterChar"/>
     <w:uiPriority w:val="99"/>
     <w:unhideWhenUsed/>
-    <w:rsid w:val="004A33F8"/>
+    <w:rsid w:val="00AC3148"/>
     <w:pPr>
       <w:tabs>
         <w:tab w:val="center" w:pos="4680"/>
@@ -4877,7 +4877,7 @@
     <w:basedOn w:val="DefaultParagraphFont"/>
     <w:link w:val="Footer"/>
     <w:uiPriority w:val="99"/>
-    <w:rsid w:val="004A33F8"/>
+    <w:rsid w:val="00AC3148"/>
   </w:style>
 </w:styles>
 </file>

</xml_diff>